<commit_message>
Publish structured W30 weekly report
</commit_message>
<xml_diff>
--- a/public/investor-downloads/weekly/2026-W30/AI-Institute-Weekly-Report-2026-W30-zh.docx
+++ b/public/investor-downloads/weekly/2026-W30/AI-Institute-Weekly-Report-2026-W30-zh.docx
@@ -64,7 +64,7 @@
           <w:color w:val="5E6268"/>
           <w:sz w:val="28"/>
         </w:rPr>
-        <w:t>2026-W30 AI Institute 周度投资研究全景</w:t>
+        <w:t>2026-W30｜从名义 AI 资本开支转向可通电、可回收、可变现</w:t>
       </w:r>
     </w:p>
     <w:tbl>
@@ -218,7 +218,7 @@
                 <w:color w:val="111111"/>
                 <w:sz w:val="19"/>
               </w:rPr>
-              <w:t>rolling · REV 5</w:t>
+              <w:t>rolling · REV 6</w:t>
             </w:r>
           </w:p>
         </w:tc>
@@ -261,7 +261,7 @@
                 <w:color w:val="111111"/>
                 <w:sz w:val="19"/>
               </w:rPr>
-              <w:t>pass_with_warnings · 67</w:t>
+              <w:t>pass_with_warnings · 83</w:t>
             </w:r>
           </w:p>
         </w:tc>
@@ -328,7 +328,7 @@
                 <w:color w:val="111111"/>
                 <w:sz w:val="24"/>
               </w:rPr>
-              <w:t>本周的核心不是追逐研究热度，而是把 AI 电力/电网设备 与 A股半导体/两融负 Gamma 拆成可执行、可证伪的赛道和标的判断。</w:t>
+              <w:t>本周决策转向控制集中风险：TRIM AI 算力半导体与中国权益流动性，HOLD A股杠铃、AI再通胀资产和Mag7再分层；真正需要核对的已不是研究热度，而是并网、合同、产品结构和流动性确认。</w:t>
             </w:r>
           </w:p>
         </w:tc>
@@ -390,7 +390,7 @@
           <w:color w:val="111111"/>
           <w:sz w:val="22"/>
         </w:rPr>
-        <w:t>AI基础设施电力与信用瓶颈的宏观通胀与资本开支效应：对美国结构性通胀、... 与 硅电锁死与再通胀：AI算力电力通胀向核心PCE的传导路径与降息周期的利率定价博弈 构成本周最强的证据主轴，而 A股半导体ETF资金流、融资余额与半导体诱多风险吸收阈值 提供了必要的反向约束。公开研究合约显示，优先级正在从宽泛主题向可交付、可验证的产业链环节集中；组合层面应先读取 TRIM AI 算力半导体、TRIM 中国权益流动性、HOLD A股红利/硬科技杠铃，再用后续订单、交付、政策与市场数据确认。与 2026-W29 相比，本周有 1 项操作变化、1 项赛道立场变化。</w:t>
+        <w:t>相较 W29 的 standing theses，本周没有证据支持无条件扩大风险预算。AI需求叙事仍在，但盈利与配置价值正从单一加速器扩散至存储、定制芯片、云平台和电网设备；与此同时，并网滑期、先进封装良率、模型价格战和实际利率构成四重约束。因此，AI算力半导体执行 TRIM，Mag7再分层与AI再通胀资产维持 HOLD。中国资产方面，政策与人民币路径提供支持，但两融、ETF承接和硬科技微观结构尚未形成一致确认；中国权益流动性执行 TRIM，A股红利/硬科技杠铃维持 HOLD，且硬科技腿应弱于红利腿。本期没有可用市场报价数据，故不对最新价格、涨跌幅或实际资金流方向作判断。</w:t>
       </w:r>
     </w:p>
     <w:p>
@@ -404,7 +404,7 @@
           <w:color w:val="5E6268"/>
           <w:sz w:val="22"/>
         </w:rPr>
-        <w:t>周报的价值不在于给出更多观点，而在于留下可复查的决策、证据和证伪条件。下一周若触发器没有出现，应降低置信度，而不是用新的叙事延长旧判断。</w:t>
+        <w:t>本周最重要的变化不是AI叙事消失，而是决策单位从“资本开支金额”缩小到“已通电容量、合同保护、产品结构与现金流”。在这些变量同时改善前，TRIM与HOLD比方向性押注更符合证据；AI电力主线虽获结构性支持，但建设滑期可能先带来需求破坏，必须保留反向情景。本报告仅为研究综合，不构成投资建议，不承诺任何收益。</w:t>
       </w:r>
     </w:p>
     <w:p>
@@ -1184,7 +1184,7 @@
         <w:keepNext/>
       </w:pPr>
       <w:r>
-        <w:t>01 · TRIM AI 算力半导体：NAND盈利弹性由价格与产品结构主导，而非单纯出货增长</w:t>
+        <w:t>01 · TRIM｜AI 算力半导体</w:t>
       </w:r>
     </w:p>
     <w:p>
@@ -1198,7 +1198,7 @@
           <w:color w:val="111111"/>
           <w:sz w:val="22"/>
         </w:rPr>
-        <w:t>AI算力需求仍强，但收益正在从单一加速器向存储、定制芯片和云平台扩散；配置应侧重订单、产品结构和自由现金流，控制估值集中风险。 风险雷达：降权跟踪：适合作为风险雷达，不适合作为无条件加仓理由。 本周证据账本把该判断连接到 5 份公开报告；其有效性仍取决于“CPI/PCE 与油价是否重新推高实际利率”。</w:t>
+        <w:t>确定性 driver（原文）：AI算力需求仍强，但收益正在从单一加速器向存储、定制芯片和云平台扩散；配置应侧重订单、产品结构和自由现金流，控制估值集中风险。 风险雷达：降权跟踪：适合作为风险雷达，不适合作为无条件加仓理由。解释上，本周压力测试显示稀缺盈利尚未全面扩散，并网与先进封装约束可能使名义需求无法同步转化为交付和现金流。</w:t>
       </w:r>
     </w:p>
     <w:tbl>
@@ -1274,7 +1274,7 @@
                 <w:color w:val="111111"/>
                 <w:sz w:val="18"/>
               </w:rPr>
-              <w:t>在 AI 算力半导体 内优先保留证据与兑现路径清晰的标的，并按证伪条件控制暴露。</w:t>
+              <w:t>保留经订单、产品结构和现金流验证的核心暴露，削减仅依赖行业总需求或高利润率外推的集中仓位；NVDA、TSM、MU、000660.KS、AMD、AVGO等只作分层跟踪，不把证据密度视为价格确认。</w:t>
             </w:r>
           </w:p>
         </w:tc>
@@ -1409,7 +1409,7 @@
         <w:keepNext/>
       </w:pPr>
       <w:r>
-        <w:t>02 · TRIM 中国权益流动性：中国资产定价仍受政策、流动性与风险偏好共同驱动</w:t>
+        <w:t>02 · TRIM｜中国权益流动性</w:t>
       </w:r>
     </w:p>
     <w:p>
@@ -1423,7 +1423,7 @@
           <w:color w:val="111111"/>
           <w:sz w:val="22"/>
         </w:rPr>
-        <w:t>风险雷达：降权跟踪：适合作为风险雷达，不适合作为无条件加仓理由。 本周证据账本把该判断连接到 5 份公开报告；其有效性仍取决于“期权伽马和 ETF 资金是否放大尾盘流动性”。</w:t>
+        <w:t>确定性 driver（原文）：风险雷达：降权跟踪：适合作为风险雷达，不适合作为无条件加仓理由。解释上，人民币与政策路径仍提供支持，但A股微观结构、指数与中小盘流动性分化尚未被修复，支持证据不足以抵消风险信号。</w:t>
       </w:r>
     </w:p>
     <w:tbl>
@@ -1499,7 +1499,7 @@
                 <w:color w:val="111111"/>
                 <w:sz w:val="18"/>
               </w:rPr>
-              <w:t>在 中国权益流动性 内优先保留证据与兑现路径清晰的标的，并按证伪条件控制暴露。</w:t>
+              <w:t>降低依赖整体风险偏好扩张的中国权益 Beta，保留政策受益且基本面可验证的结构性暴露；在融资余额、ETF申赎和北向资金形成同向确认前，不恢复510300.SH、159915.SZ、2800.HK等宽基风险预算。</w:t>
             </w:r>
           </w:p>
         </w:tc>
@@ -1600,7 +1600,7 @@
       <w:r>
         <w:t xml:space="preserve"> · </w:t>
       </w:r>
-      <w:hyperlink r:id="rId19">
+      <w:hyperlink r:id="rId23">
         <w:r>
           <w:rPr>
             <w:color w:val="1D5FD1"/>
@@ -1615,7 +1615,7 @@
       <w:r>
         <w:t xml:space="preserve"> · </w:t>
       </w:r>
-      <w:hyperlink r:id="rId23">
+      <w:hyperlink r:id="rId24">
         <w:r>
           <w:rPr>
             <w:color w:val="1D5FD1"/>
@@ -1634,7 +1634,7 @@
         <w:keepNext/>
       </w:pPr>
       <w:r>
-        <w:t>03 · HOLD A股红利/硬科技杠铃：A 股红利与硬科技杠铃仍是政策、利率和风险偏好的组合表达</w:t>
+        <w:t>03 · HOLD｜A股红利/硬科技杠铃</w:t>
       </w:r>
     </w:p>
     <w:p>
@@ -1648,7 +1648,7 @@
           <w:color w:val="111111"/>
           <w:sz w:val="22"/>
         </w:rPr>
-        <w:t>观察等待：先放入观察池，只在证据密度和价格确认同时改善时进入组合。 本周证据账本把该判断连接到 5 份公开报告；其有效性仍取决于“融资余额、ETF 申赎和北向资金是否同向”。</w:t>
+        <w:t>确定性 driver（原文）：观察等待：先放入观察池，只在证据密度和价格确认同时改善时进入组合。解释上，红利腿仍获银行质量筛选与公用事业现金流逻辑支持，但硬科技腿已由 NEUTRAL 下调至 UNDERWEIGHT；杠铃仍可跟踪，却不能假设两腿具有对称的防御能力。</w:t>
       </w:r>
     </w:p>
     <w:tbl>
@@ -1724,7 +1724,7 @@
                 <w:color w:val="111111"/>
                 <w:sz w:val="18"/>
               </w:rPr>
-              <w:t>在 A股红利/硬科技杠铃 内优先保留证据与兑现路径清晰的标的，并按证伪条件控制暴露。</w:t>
+              <w:t>维持观察状态并向红利腿倾斜质量筛选；硬科技腿只保留具备真实订单、良率和现金流验证的标的。未获得价格与资金面确认前，不因政策叙事扩大整体杠铃仓位。</w:t>
             </w:r>
           </w:p>
         </w:tc>
@@ -1795,7 +1795,7 @@
       <w:r>
         <w:t>证据：</w:t>
       </w:r>
-      <w:hyperlink r:id="rId24">
+      <w:hyperlink r:id="rId25">
         <w:r>
           <w:rPr>
             <w:color w:val="1D5FD1"/>
@@ -1810,7 +1810,7 @@
       <w:r>
         <w:t xml:space="preserve"> · </w:t>
       </w:r>
-      <w:hyperlink r:id="rId25">
+      <w:hyperlink r:id="rId26">
         <w:r>
           <w:rPr>
             <w:color w:val="1D5FD1"/>
@@ -1825,7 +1825,7 @@
       <w:r>
         <w:t xml:space="preserve"> · </w:t>
       </w:r>
-      <w:hyperlink r:id="rId21">
+      <w:hyperlink r:id="rId27">
         <w:r>
           <w:rPr>
             <w:color w:val="1D5FD1"/>
@@ -1840,7 +1840,7 @@
       <w:r>
         <w:t xml:space="preserve"> · </w:t>
       </w:r>
-      <w:hyperlink r:id="rId26">
+      <w:hyperlink r:id="rId28">
         <w:r>
           <w:rPr>
             <w:color w:val="1D5FD1"/>
@@ -1859,7 +1859,7 @@
         <w:keepNext/>
       </w:pPr>
       <w:r>
-        <w:t>04 · HOLD AI 再通胀/利率敏感资产：AI 资本开支通过能源、设备和利率进入通胀定价</w:t>
+        <w:t>04 · HOLD｜AI 再通胀/利率敏感资产</w:t>
       </w:r>
     </w:p>
     <w:p>
@@ -1873,7 +1873,7 @@
           <w:color w:val="111111"/>
           <w:sz w:val="22"/>
         </w:rPr>
-        <w:t>观察等待：先放入观察池，只在证据密度和价格确认同时改善时进入组合。 本周证据账本把该判断连接到 5 份公开报告；其有效性仍取决于“CPI/PCE 与油价是否重新推高实际利率”。</w:t>
+        <w:t>确定性 driver（原文）：观察等待：先放入观察池，只在证据密度和价格确认同时改善时进入组合。解释上，电网扩容和费率传导可能抬升服务通胀，但并网与信用约束也可能先推迟物理建设、削弱固定投资和短期需求；当前不足以形成单向利率判断。</w:t>
       </w:r>
     </w:p>
     <w:tbl>
@@ -1949,7 +1949,7 @@
                 <w:color w:val="111111"/>
                 <w:sz w:val="18"/>
               </w:rPr>
-              <w:t>在 AI 再通胀/利率敏感资产 内优先保留证据与兑现路径清晰的标的，并按证伪条件控制暴露。</w:t>
+              <w:t>不押注单一利率方向。优先跟踪具备订单、费率保护或已通电容量的资产，同时控制TLT、XLE、XLU、GLD等宏观敏感敞口，等待CPI/PCE、油价与实际利率给出一致信号。</w:t>
             </w:r>
           </w:p>
         </w:tc>
@@ -2020,7 +2020,7 @@
       <w:r>
         <w:t>证据：</w:t>
       </w:r>
-      <w:hyperlink r:id="rId17">
+      <w:hyperlink r:id="rId29">
         <w:r>
           <w:rPr>
             <w:color w:val="1D5FD1"/>
@@ -2035,7 +2035,7 @@
       <w:r>
         <w:t xml:space="preserve"> · </w:t>
       </w:r>
-      <w:hyperlink r:id="rId21">
+      <w:hyperlink r:id="rId30">
         <w:r>
           <w:rPr>
             <w:color w:val="1D5FD1"/>
@@ -2050,7 +2050,7 @@
       <w:r>
         <w:t xml:space="preserve"> · </w:t>
       </w:r>
-      <w:hyperlink r:id="rId18">
+      <w:hyperlink r:id="rId31">
         <w:r>
           <w:rPr>
             <w:color w:val="1D5FD1"/>
@@ -2065,7 +2065,7 @@
       <w:r>
         <w:t xml:space="preserve"> · </w:t>
       </w:r>
-      <w:hyperlink r:id="rId27">
+      <w:hyperlink r:id="rId32">
         <w:r>
           <w:rPr>
             <w:color w:val="1D5FD1"/>
@@ -2084,7 +2084,7 @@
         <w:keepNext/>
       </w:pPr>
       <w:r>
-        <w:t>05 · HOLD Mag7 AI 平台再分层：Mag7 在 AI 时代从平台垄断转向基础设施再分层</w:t>
+        <w:t>05 · HOLD｜Mag7 AI 平台再分层</w:t>
       </w:r>
     </w:p>
     <w:p>
@@ -2098,7 +2098,7 @@
           <w:color w:val="111111"/>
           <w:sz w:val="22"/>
         </w:rPr>
-        <w:t>观察等待：先放入观察池，只在证据密度和价格确认同时改善时进入组合。 本周证据账本把该判断连接到 5 份公开报告；其有效性仍取决于“云厂商 capex 指引是否继续上修”。</w:t>
+        <w:t>确定性 driver（原文）：观察等待：先放入观察池，只在证据密度和价格确认同时改善时进入组合。解释上，平台再分层逻辑仍成立，但模型价格战、商业化分化和可通电容量约束意味着名义 capex 不能直接等同于收入质量或自由现金流改善。</w:t>
       </w:r>
     </w:p>
     <w:tbl>
@@ -2174,7 +2174,7 @@
                 <w:color w:val="111111"/>
                 <w:sz w:val="18"/>
               </w:rPr>
-              <w:t>在 Mag7 AI 平台再分层 内优先保留证据与兑现路径清晰的标的，并按证伪条件控制暴露。</w:t>
+              <w:t>MSFT、META、AMZN、GOOGL、NVDA等应按云增长、已锁定算力、电力合同和自由现金流逐一筛选，而非继续作为同质化篮子配置；在capex与变现同步确认前维持观察。</w:t>
             </w:r>
           </w:p>
         </w:tc>
@@ -2260,7 +2260,7 @@
       <w:r>
         <w:t xml:space="preserve"> · </w:t>
       </w:r>
-      <w:hyperlink r:id="rId21">
+      <w:hyperlink r:id="rId33">
         <w:r>
           <w:rPr>
             <w:color w:val="1D5FD1"/>
@@ -2275,7 +2275,7 @@
       <w:r>
         <w:t xml:space="preserve"> · </w:t>
       </w:r>
-      <w:hyperlink r:id="rId18">
+      <w:hyperlink r:id="rId34">
         <w:r>
           <w:rPr>
             <w:color w:val="1D5FD1"/>
@@ -2290,7 +2290,7 @@
       <w:r>
         <w:t xml:space="preserve"> · </w:t>
       </w:r>
-      <w:hyperlink r:id="rId28">
+      <w:hyperlink r:id="rId35">
         <w:r>
           <w:rPr>
             <w:color w:val="1D5FD1"/>
@@ -2331,7 +2331,7 @@
           <w:color w:val="111111"/>
           <w:sz w:val="22"/>
         </w:rPr>
-        <w:t>主线进一步集中到 A股红利/硬科技杠铃</w:t>
+        <w:t>AI再通胀主线由单向判断转为双向情景</w:t>
       </w:r>
     </w:p>
     <w:p>
@@ -2345,7 +2345,7 @@
           <w:color w:val="111111"/>
           <w:sz w:val="22"/>
         </w:rPr>
-        <w:t>赛道：A股红利/硬科技杠铃。候选观察标的：510880.SH, 601398.SH, 600900.SH, 601088.SH, 600941.SH, 588000.SH, 688981.SH。当前共有 40 条证据、2 位分析师和 8 条风险信号指向该判断；主导链条为 宏观通胀传导。该主题应作为可跟踪投资假设，而不是孤立结论。 本周新增 8 条主线事件，其中支持 4 条、风险 4 条；当前组合含义是 先放入观察池，只在证据密度和价格确认同时改善时进入组合。</w:t>
+        <w:t>W29 standing thesis 强调AI资本开支经能源、设备和利率进入通胀定价；W30新增证据表明，容量费和电价传导可能推升服务通胀，但并网及信用约束也可能先造成项目滑期、固定投资延后和短期需求降温。主线仍重要，却不再支持单向押注实际利率上行。</w:t>
       </w:r>
     </w:p>
     <w:p>
@@ -2355,7 +2355,7 @@
       <w:r>
         <w:t>关联标的：</w:t>
       </w:r>
-      <w:hyperlink r:id="rId29">
+      <w:hyperlink r:id="rId36">
         <w:r>
           <w:rPr>
             <w:color w:val="1D5FD1"/>
@@ -2364,13 +2364,13 @@
             <w:szCs w:val="17"/>
             <w:rFonts w:ascii="Calibri" w:hAnsi="Calibri" w:eastAsia="Hiragino Sans GB"/>
           </w:rPr>
-          <w:t>600900.SH</w:t>
+          <w:t>GEV</w:t>
         </w:r>
       </w:hyperlink>
       <w:r>
         <w:t xml:space="preserve"> · </w:t>
       </w:r>
-      <w:hyperlink r:id="rId30">
+      <w:hyperlink r:id="rId37">
         <w:r>
           <w:rPr>
             <w:color w:val="1D5FD1"/>
@@ -2379,13 +2379,13 @@
             <w:szCs w:val="17"/>
             <w:rFonts w:ascii="Calibri" w:hAnsi="Calibri" w:eastAsia="Hiragino Sans GB"/>
           </w:rPr>
-          <w:t>601398.SH</w:t>
+          <w:t>CEG</w:t>
         </w:r>
       </w:hyperlink>
       <w:r>
         <w:t xml:space="preserve"> · </w:t>
       </w:r>
-      <w:hyperlink r:id="rId31">
+      <w:hyperlink r:id="rId38">
         <w:r>
           <w:rPr>
             <w:color w:val="1D5FD1"/>
@@ -2394,13 +2394,13 @@
             <w:szCs w:val="17"/>
             <w:rFonts w:ascii="Calibri" w:hAnsi="Calibri" w:eastAsia="Hiragino Sans GB"/>
           </w:rPr>
-          <w:t>601088.SH</w:t>
+          <w:t>VST</w:t>
         </w:r>
       </w:hyperlink>
       <w:r>
         <w:t xml:space="preserve"> · </w:t>
       </w:r>
-      <w:hyperlink r:id="rId32">
+      <w:hyperlink r:id="rId39">
         <w:r>
           <w:rPr>
             <w:color w:val="1D5FD1"/>
@@ -2409,13 +2409,13 @@
             <w:szCs w:val="17"/>
             <w:rFonts w:ascii="Calibri" w:hAnsi="Calibri" w:eastAsia="Hiragino Sans GB"/>
           </w:rPr>
-          <w:t>600941.SH</w:t>
+          <w:t>XLU</w:t>
         </w:r>
       </w:hyperlink>
       <w:r>
         <w:t xml:space="preserve"> · </w:t>
       </w:r>
-      <w:hyperlink r:id="rId33">
+      <w:hyperlink r:id="rId40">
         <w:r>
           <w:rPr>
             <w:color w:val="1D5FD1"/>
@@ -2424,13 +2424,13 @@
             <w:szCs w:val="17"/>
             <w:rFonts w:ascii="Calibri" w:hAnsi="Calibri" w:eastAsia="Hiragino Sans GB"/>
           </w:rPr>
-          <w:t>588000.SH</w:t>
+          <w:t>TLT</w:t>
         </w:r>
       </w:hyperlink>
       <w:r>
         <w:t xml:space="preserve"> · </w:t>
       </w:r>
-      <w:hyperlink r:id="rId34">
+      <w:hyperlink r:id="rId41">
         <w:r>
           <w:rPr>
             <w:color w:val="1D5FD1"/>
@@ -2439,7 +2439,7 @@
             <w:szCs w:val="17"/>
             <w:rFonts w:ascii="Calibri" w:hAnsi="Calibri" w:eastAsia="Hiragino Sans GB"/>
           </w:rPr>
-          <w:t>688981.SH</w:t>
+          <w:t>IEF</w:t>
         </w:r>
       </w:hyperlink>
     </w:p>
@@ -2463,7 +2463,7 @@
           <w:color w:val="111111"/>
           <w:sz w:val="22"/>
         </w:rPr>
-        <w:t>AI 资本开支通过能源、设备和利率进入通胀定价 的本周证据更新</w:t>
+        <w:t>AI算力半导体从需求总量交易转向盈利质量筛选</w:t>
       </w:r>
     </w:p>
     <w:p>
@@ -2477,7 +2477,7 @@
           <w:color w:val="111111"/>
           <w:sz w:val="22"/>
         </w:rPr>
-        <w:t>赛道：AI 再通胀/利率敏感资产。候选观察标的：XLE, XLU, TLT, GLD, JPM, NEE。当前共有 40 条证据、3 位分析师和 8 条风险信号指向该判断；主导链条为 宏观通胀传导。该主题应作为可跟踪投资假设，而不是孤立结论。 本周新增 8 条主线事件，其中支持 3 条、风险 5 条；当前组合含义是 先放入观察池，只在证据密度和价格确认同时改善时进入组合。</w:t>
+        <w:t>W29 standing thesis 将NAND盈利弹性归因于单位价格与产品结构，而非单纯出货；W30压力测试进一步确认稀缺盈利存在，但尚未全面扩散，同时先进封装良率、并网时序和光电集成约束提高了交付不确定性。因此，主线由可扩散的需求逻辑弱化为少数公司的订单、结构和现金流验证。</w:t>
       </w:r>
     </w:p>
     <w:p>
@@ -2487,7 +2487,7 @@
       <w:r>
         <w:t>关联标的：</w:t>
       </w:r>
-      <w:hyperlink r:id="rId35">
+      <w:hyperlink r:id="rId42">
         <w:r>
           <w:rPr>
             <w:color w:val="1D5FD1"/>
@@ -2496,13 +2496,13 @@
             <w:szCs w:val="17"/>
             <w:rFonts w:ascii="Calibri" w:hAnsi="Calibri" w:eastAsia="Hiragino Sans GB"/>
           </w:rPr>
-          <w:t>META</w:t>
+          <w:t>NVDA</w:t>
         </w:r>
       </w:hyperlink>
       <w:r>
         <w:t xml:space="preserve"> · </w:t>
       </w:r>
-      <w:hyperlink r:id="rId36">
+      <w:hyperlink r:id="rId43">
         <w:r>
           <w:rPr>
             <w:color w:val="1D5FD1"/>
@@ -2511,13 +2511,145 @@
             <w:szCs w:val="17"/>
             <w:rFonts w:ascii="Calibri" w:hAnsi="Calibri" w:eastAsia="Hiragino Sans GB"/>
           </w:rPr>
-          <w:t>MSFT</w:t>
+          <w:t>TSM</w:t>
         </w:r>
       </w:hyperlink>
       <w:r>
         <w:t xml:space="preserve"> · </w:t>
       </w:r>
-      <w:hyperlink r:id="rId29">
+      <w:hyperlink r:id="rId44">
+        <w:r>
+          <w:rPr>
+            <w:color w:val="1D5FD1"/>
+            <w:u w:val="single"/>
+            <w:sz w:val="17"/>
+            <w:szCs w:val="17"/>
+            <w:rFonts w:ascii="Calibri" w:hAnsi="Calibri" w:eastAsia="Hiragino Sans GB"/>
+          </w:rPr>
+          <w:t>MU</w:t>
+        </w:r>
+      </w:hyperlink>
+      <w:r>
+        <w:t xml:space="preserve"> · </w:t>
+      </w:r>
+      <w:hyperlink r:id="rId45">
+        <w:r>
+          <w:rPr>
+            <w:color w:val="1D5FD1"/>
+            <w:u w:val="single"/>
+            <w:sz w:val="17"/>
+            <w:szCs w:val="17"/>
+            <w:rFonts w:ascii="Calibri" w:hAnsi="Calibri" w:eastAsia="Hiragino Sans GB"/>
+          </w:rPr>
+          <w:t>000660.KS</w:t>
+        </w:r>
+      </w:hyperlink>
+      <w:r>
+        <w:t xml:space="preserve"> · </w:t>
+      </w:r>
+      <w:hyperlink r:id="rId46">
+        <w:r>
+          <w:rPr>
+            <w:color w:val="1D5FD1"/>
+            <w:u w:val="single"/>
+            <w:sz w:val="17"/>
+            <w:szCs w:val="17"/>
+            <w:rFonts w:ascii="Calibri" w:hAnsi="Calibri" w:eastAsia="Hiragino Sans GB"/>
+          </w:rPr>
+          <w:t>AMD</w:t>
+        </w:r>
+      </w:hyperlink>
+      <w:r>
+        <w:t xml:space="preserve"> · </w:t>
+      </w:r>
+      <w:hyperlink r:id="rId47">
+        <w:r>
+          <w:rPr>
+            <w:color w:val="1D5FD1"/>
+            <w:u w:val="single"/>
+            <w:sz w:val="17"/>
+            <w:szCs w:val="17"/>
+            <w:rFonts w:ascii="Calibri" w:hAnsi="Calibri" w:eastAsia="Hiragino Sans GB"/>
+          </w:rPr>
+          <w:t>AVGO</w:t>
+        </w:r>
+      </w:hyperlink>
+    </w:p>
+    <w:p>
+      <w:pPr>
+        <w:keepNext/>
+      </w:pPr>
+      <w:r>
+        <w:rPr>
+          <w:rFonts w:ascii="Calibri" w:hAnsi="Calibri" w:eastAsia="Hiragino Sans GB"/>
+          <w:b/>
+          <w:color w:val="D85B16"/>
+          <w:sz w:val="18"/>
+        </w:rPr>
+        <w:t xml:space="preserve">03  SPLIT  </w:t>
+      </w:r>
+      <w:r>
+        <w:rPr>
+          <w:rFonts w:ascii="Calibri" w:hAnsi="Calibri" w:eastAsia="Hiragino Sans GB"/>
+          <w:b/>
+          <w:color w:val="111111"/>
+          <w:sz w:val="22"/>
+        </w:rPr>
+        <w:t>A股杠铃发生内部失衡，挑战“两腿互补”的主导观点</w:t>
+      </w:r>
+    </w:p>
+    <w:p>
+      <w:pPr>
+        <w:keepLines w:val="0"/>
+      </w:pPr>
+      <w:r>
+        <w:rPr>
+          <w:rFonts w:ascii="Calibri" w:hAnsi="Calibri" w:eastAsia="Hiragino Sans GB"/>
+          <w:b w:val="0"/>
+          <w:color w:val="111111"/>
+          <w:sz w:val="22"/>
+        </w:rPr>
+        <w:t>W29 standing thesis 把红利与硬科技视为政策、利率和风险偏好的组合表达；W30新增证据却显示，红利腿仍有银行质量与公用事业支撑，硬科技腿则受到两融、ETF拥挤、指数调样和良率验证压力，且A股硬科技/科创50已由NEUTRAL下调至UNDERWEIGHT。杠铃仍可观察，但不能继续把两腿当作对称配置。</w:t>
+      </w:r>
+    </w:p>
+    <w:p>
+      <w:pPr>
+        <w:pStyle w:val="TableCitation"/>
+      </w:pPr>
+      <w:r>
+        <w:t>关联标的：</w:t>
+      </w:r>
+      <w:hyperlink r:id="rId48">
+        <w:r>
+          <w:rPr>
+            <w:color w:val="1D5FD1"/>
+            <w:u w:val="single"/>
+            <w:sz w:val="17"/>
+            <w:szCs w:val="17"/>
+            <w:rFonts w:ascii="Calibri" w:hAnsi="Calibri" w:eastAsia="Hiragino Sans GB"/>
+          </w:rPr>
+          <w:t>510880.SH</w:t>
+        </w:r>
+      </w:hyperlink>
+      <w:r>
+        <w:t xml:space="preserve"> · </w:t>
+      </w:r>
+      <w:hyperlink r:id="rId49">
+        <w:r>
+          <w:rPr>
+            <w:color w:val="1D5FD1"/>
+            <w:u w:val="single"/>
+            <w:sz w:val="17"/>
+            <w:szCs w:val="17"/>
+            <w:rFonts w:ascii="Calibri" w:hAnsi="Calibri" w:eastAsia="Hiragino Sans GB"/>
+          </w:rPr>
+          <w:t>601398.SH</w:t>
+        </w:r>
+      </w:hyperlink>
+      <w:r>
+        <w:t xml:space="preserve"> · </w:t>
+      </w:r>
+      <w:hyperlink r:id="rId50">
         <w:r>
           <w:rPr>
             <w:color w:val="1D5FD1"/>
@@ -2532,7 +2664,7 @@
       <w:r>
         <w:t xml:space="preserve"> · </w:t>
       </w:r>
-      <w:hyperlink r:id="rId37">
+      <w:hyperlink r:id="rId51">
         <w:r>
           <w:rPr>
             <w:color w:val="1D5FD1"/>
@@ -2541,13 +2673,13 @@
             <w:szCs w:val="17"/>
             <w:rFonts w:ascii="Calibri" w:hAnsi="Calibri" w:eastAsia="Hiragino Sans GB"/>
           </w:rPr>
-          <w:t>XLU</w:t>
+          <w:t>588000.SH</w:t>
         </w:r>
       </w:hyperlink>
       <w:r>
         <w:t xml:space="preserve"> · </w:t>
       </w:r>
-      <w:hyperlink r:id="rId38">
+      <w:hyperlink r:id="rId52">
         <w:r>
           <w:rPr>
             <w:color w:val="1D5FD1"/>
@@ -2556,13 +2688,13 @@
             <w:szCs w:val="17"/>
             <w:rFonts w:ascii="Calibri" w:hAnsi="Calibri" w:eastAsia="Hiragino Sans GB"/>
           </w:rPr>
-          <w:t>AMZN</w:t>
+          <w:t>688981.SH</w:t>
         </w:r>
       </w:hyperlink>
       <w:r>
         <w:t xml:space="preserve"> · </w:t>
       </w:r>
-      <w:hyperlink r:id="rId39">
+      <w:hyperlink r:id="rId53">
         <w:r>
           <w:rPr>
             <w:color w:val="1D5FD1"/>
@@ -2571,139 +2703,7 @@
             <w:szCs w:val="17"/>
             <w:rFonts w:ascii="Calibri" w:hAnsi="Calibri" w:eastAsia="Hiragino Sans GB"/>
           </w:rPr>
-          <w:t>GOOGL</w:t>
-        </w:r>
-      </w:hyperlink>
-    </w:p>
-    <w:p>
-      <w:pPr>
-        <w:keepNext/>
-      </w:pPr>
-      <w:r>
-        <w:rPr>
-          <w:rFonts w:ascii="Calibri" w:hAnsi="Calibri" w:eastAsia="Hiragino Sans GB"/>
-          <w:b/>
-          <w:color w:val="D85B16"/>
-          <w:sz w:val="18"/>
-        </w:rPr>
-        <w:t xml:space="preserve">03  WEAKENED  </w:t>
-      </w:r>
-      <w:r>
-        <w:rPr>
-          <w:rFonts w:ascii="Calibri" w:hAnsi="Calibri" w:eastAsia="Hiragino Sans GB"/>
-          <w:b/>
-          <w:color w:val="111111"/>
-          <w:sz w:val="22"/>
-        </w:rPr>
-        <w:t>Mag7 在 AI 时代从平台垄断转向基础设施再分层 的本周证据更新</w:t>
-      </w:r>
-    </w:p>
-    <w:p>
-      <w:pPr>
-        <w:keepLines w:val="0"/>
-      </w:pPr>
-      <w:r>
-        <w:rPr>
-          <w:rFonts w:ascii="Calibri" w:hAnsi="Calibri" w:eastAsia="Hiragino Sans GB"/>
-          <w:b w:val="0"/>
-          <w:color w:val="111111"/>
-          <w:sz w:val="22"/>
-        </w:rPr>
-        <w:t>赛道：Mag7 AI 平台再分层。候选观察标的：MSFT, AAPL, TSLA, META, AMZN, GOOGL, NVDA。当前共有 40 条证据、4 位分析师和 8 条风险信号指向该判断；主导链条为 AI 基础设施。该主题应作为可跟踪投资假设，而不是孤立结论。 本周新增 8 条主线事件，其中支持 1 条、风险 7 条；当前组合含义是 先放入观察池，只在证据密度和价格确认同时改善时进入组合。</w:t>
-      </w:r>
-    </w:p>
-    <w:p>
-      <w:pPr>
-        <w:pStyle w:val="TableCitation"/>
-      </w:pPr>
-      <w:r>
-        <w:t>关联标的：</w:t>
-      </w:r>
-      <w:hyperlink r:id="rId35">
-        <w:r>
-          <w:rPr>
-            <w:color w:val="1D5FD1"/>
-            <w:u w:val="single"/>
-            <w:sz w:val="17"/>
-            <w:szCs w:val="17"/>
-            <w:rFonts w:ascii="Calibri" w:hAnsi="Calibri" w:eastAsia="Hiragino Sans GB"/>
-          </w:rPr>
-          <w:t>META</w:t>
-        </w:r>
-      </w:hyperlink>
-      <w:r>
-        <w:t xml:space="preserve"> · </w:t>
-      </w:r>
-      <w:hyperlink r:id="rId36">
-        <w:r>
-          <w:rPr>
-            <w:color w:val="1D5FD1"/>
-            <w:u w:val="single"/>
-            <w:sz w:val="17"/>
-            <w:szCs w:val="17"/>
-            <w:rFonts w:ascii="Calibri" w:hAnsi="Calibri" w:eastAsia="Hiragino Sans GB"/>
-          </w:rPr>
-          <w:t>MSFT</w:t>
-        </w:r>
-      </w:hyperlink>
-      <w:r>
-        <w:t xml:space="preserve"> · </w:t>
-      </w:r>
-      <w:hyperlink r:id="rId40">
-        <w:r>
-          <w:rPr>
-            <w:color w:val="1D5FD1"/>
-            <w:u w:val="single"/>
-            <w:sz w:val="17"/>
-            <w:szCs w:val="17"/>
-            <w:rFonts w:ascii="Calibri" w:hAnsi="Calibri" w:eastAsia="Hiragino Sans GB"/>
-          </w:rPr>
-          <w:t>NVDA</w:t>
-        </w:r>
-      </w:hyperlink>
-      <w:r>
-        <w:t xml:space="preserve"> · </w:t>
-      </w:r>
-      <w:hyperlink r:id="rId38">
-        <w:r>
-          <w:rPr>
-            <w:color w:val="1D5FD1"/>
-            <w:u w:val="single"/>
-            <w:sz w:val="17"/>
-            <w:szCs w:val="17"/>
-            <w:rFonts w:ascii="Calibri" w:hAnsi="Calibri" w:eastAsia="Hiragino Sans GB"/>
-          </w:rPr>
-          <w:t>AMZN</w:t>
-        </w:r>
-      </w:hyperlink>
-      <w:r>
-        <w:t xml:space="preserve"> · </w:t>
-      </w:r>
-      <w:hyperlink r:id="rId39">
-        <w:r>
-          <w:rPr>
-            <w:color w:val="1D5FD1"/>
-            <w:u w:val="single"/>
-            <w:sz w:val="17"/>
-            <w:szCs w:val="17"/>
-            <w:rFonts w:ascii="Calibri" w:hAnsi="Calibri" w:eastAsia="Hiragino Sans GB"/>
-          </w:rPr>
-          <w:t>GOOGL</w:t>
-        </w:r>
-      </w:hyperlink>
-      <w:r>
-        <w:t xml:space="preserve"> · </w:t>
-      </w:r>
-      <w:hyperlink r:id="rId41">
-        <w:r>
-          <w:rPr>
-            <w:color w:val="1D5FD1"/>
-            <w:u w:val="single"/>
-            <w:sz w:val="17"/>
-            <w:szCs w:val="17"/>
-            <w:rFonts w:ascii="Calibri" w:hAnsi="Calibri" w:eastAsia="Hiragino Sans GB"/>
-          </w:rPr>
-          <w:t>TSM</w:t>
+          <w:t>300308.SZ</w:t>
         </w:r>
       </w:hyperlink>
     </w:p>
@@ -2727,7 +2727,7 @@
           <w:color w:val="111111"/>
           <w:sz w:val="22"/>
         </w:rPr>
-        <w:t>NAND盈利弹性由价格与产品结构主导，而非单纯出货增长 的本周证据更新</w:t>
+        <w:t>中国资产政策支持仍在，但流动性确认不足</w:t>
       </w:r>
     </w:p>
     <w:p>
@@ -2741,7 +2741,7 @@
           <w:color w:val="111111"/>
           <w:sz w:val="22"/>
         </w:rPr>
-        <w:t>SanDisk的盈利修复主要来自NAND单位价格上行和产品结构改善，而非位元出货扩张。若AI及企业存储需求维持、行业供给纪律未被破坏，利润率可保持韧性；若新增供给推动价格回落，盈利弹性将快速反转。 本周新增 8 条主线事件，其中支持 3 条、风险 5 条；当前组合含义是 适合作为风险雷达，不适合作为无条件加仓理由。</w:t>
+        <w:t>W29 standing thesis 强调政策、流动性和风险偏好的共同驱动；W30人民币路径、出口链和内需政策研究继续提供支持，但微观结构证据没有证明融资、ETF承接与跨境风险偏好已形成合力。变化不是政策逻辑失效，而是执行条件由宏观预期进一步收紧为可观察的流动性三联确认。</w:t>
       </w:r>
     </w:p>
     <w:p>
@@ -2751,7 +2751,184 @@
       <w:r>
         <w:t>关联标的：</w:t>
       </w:r>
-      <w:hyperlink r:id="rId40">
+      <w:hyperlink r:id="rId54">
+        <w:r>
+          <w:rPr>
+            <w:color w:val="1D5FD1"/>
+            <w:u w:val="single"/>
+            <w:sz w:val="17"/>
+            <w:szCs w:val="17"/>
+            <w:rFonts w:ascii="Calibri" w:hAnsi="Calibri" w:eastAsia="Hiragino Sans GB"/>
+          </w:rPr>
+          <w:t>510300.SH</w:t>
+        </w:r>
+      </w:hyperlink>
+      <w:r>
+        <w:t xml:space="preserve"> · </w:t>
+      </w:r>
+      <w:hyperlink r:id="rId55">
+        <w:r>
+          <w:rPr>
+            <w:color w:val="1D5FD1"/>
+            <w:u w:val="single"/>
+            <w:sz w:val="17"/>
+            <w:szCs w:val="17"/>
+            <w:rFonts w:ascii="Calibri" w:hAnsi="Calibri" w:eastAsia="Hiragino Sans GB"/>
+          </w:rPr>
+          <w:t>159915.SZ</w:t>
+        </w:r>
+      </w:hyperlink>
+      <w:r>
+        <w:t xml:space="preserve"> · </w:t>
+      </w:r>
+      <w:hyperlink r:id="rId56">
+        <w:r>
+          <w:rPr>
+            <w:color w:val="1D5FD1"/>
+            <w:u w:val="single"/>
+            <w:sz w:val="17"/>
+            <w:szCs w:val="17"/>
+            <w:rFonts w:ascii="Calibri" w:hAnsi="Calibri" w:eastAsia="Hiragino Sans GB"/>
+          </w:rPr>
+          <w:t>2800.HK</w:t>
+        </w:r>
+      </w:hyperlink>
+      <w:r>
+        <w:t xml:space="preserve"> · </w:t>
+      </w:r>
+      <w:hyperlink r:id="rId57">
+        <w:r>
+          <w:rPr>
+            <w:color w:val="1D5FD1"/>
+            <w:u w:val="single"/>
+            <w:sz w:val="17"/>
+            <w:szCs w:val="17"/>
+            <w:rFonts w:ascii="Calibri" w:hAnsi="Calibri" w:eastAsia="Hiragino Sans GB"/>
+          </w:rPr>
+          <w:t>0700.HK</w:t>
+        </w:r>
+      </w:hyperlink>
+      <w:r>
+        <w:t xml:space="preserve"> · </w:t>
+      </w:r>
+      <w:hyperlink r:id="rId58">
+        <w:r>
+          <w:rPr>
+            <w:color w:val="1D5FD1"/>
+            <w:u w:val="single"/>
+            <w:sz w:val="17"/>
+            <w:szCs w:val="17"/>
+            <w:rFonts w:ascii="Calibri" w:hAnsi="Calibri" w:eastAsia="Hiragino Sans GB"/>
+          </w:rPr>
+          <w:t>9988.HK</w:t>
+        </w:r>
+      </w:hyperlink>
+    </w:p>
+    <w:p>
+      <w:pPr>
+        <w:keepNext/>
+      </w:pPr>
+      <w:r>
+        <w:rPr>
+          <w:rFonts w:ascii="Calibri" w:hAnsi="Calibri" w:eastAsia="Hiragino Sans GB"/>
+          <w:b/>
+          <w:color w:val="D85B16"/>
+          <w:sz w:val="18"/>
+        </w:rPr>
+        <w:t xml:space="preserve">05  STRENGTHENED  </w:t>
+      </w:r>
+      <w:r>
+        <w:rPr>
+          <w:rFonts w:ascii="Calibri" w:hAnsi="Calibri" w:eastAsia="Hiragino Sans GB"/>
+          <w:b/>
+          <w:color w:val="111111"/>
+          <w:sz w:val="22"/>
+        </w:rPr>
+        <w:t>AI平台再分层逻辑保留，但验证标准升级</w:t>
+      </w:r>
+    </w:p>
+    <w:p>
+      <w:pPr>
+        <w:keepLines w:val="0"/>
+      </w:pPr>
+      <w:r>
+        <w:rPr>
+          <w:rFonts w:ascii="Calibri" w:hAnsi="Calibri" w:eastAsia="Hiragino Sans GB"/>
+          <w:b w:val="0"/>
+          <w:color w:val="111111"/>
+          <w:sz w:val="22"/>
+        </w:rPr>
+        <w:t>W29 standing thesis 关注Mag7从平台垄断向基础设施再分层；W30模型价格战与商业化分化强化了内部筛选的必要性，同时并网瓶颈要求把云厂商名义capex折算为已锁定兆瓦、可靠并网日和受保护的成本分摊。研究方向未变，但仅有资本开支增长已不足以提升判断。</w:t>
+      </w:r>
+    </w:p>
+    <w:p>
+      <w:pPr>
+        <w:pStyle w:val="TableCitation"/>
+      </w:pPr>
+      <w:r>
+        <w:t>关联标的：</w:t>
+      </w:r>
+      <w:hyperlink r:id="rId59">
+        <w:r>
+          <w:rPr>
+            <w:color w:val="1D5FD1"/>
+            <w:u w:val="single"/>
+            <w:sz w:val="17"/>
+            <w:szCs w:val="17"/>
+            <w:rFonts w:ascii="Calibri" w:hAnsi="Calibri" w:eastAsia="Hiragino Sans GB"/>
+          </w:rPr>
+          <w:t>MSFT</w:t>
+        </w:r>
+      </w:hyperlink>
+      <w:r>
+        <w:t xml:space="preserve"> · </w:t>
+      </w:r>
+      <w:hyperlink r:id="rId60">
+        <w:r>
+          <w:rPr>
+            <w:color w:val="1D5FD1"/>
+            <w:u w:val="single"/>
+            <w:sz w:val="17"/>
+            <w:szCs w:val="17"/>
+            <w:rFonts w:ascii="Calibri" w:hAnsi="Calibri" w:eastAsia="Hiragino Sans GB"/>
+          </w:rPr>
+          <w:t>META</w:t>
+        </w:r>
+      </w:hyperlink>
+      <w:r>
+        <w:t xml:space="preserve"> · </w:t>
+      </w:r>
+      <w:hyperlink r:id="rId61">
+        <w:r>
+          <w:rPr>
+            <w:color w:val="1D5FD1"/>
+            <w:u w:val="single"/>
+            <w:sz w:val="17"/>
+            <w:szCs w:val="17"/>
+            <w:rFonts w:ascii="Calibri" w:hAnsi="Calibri" w:eastAsia="Hiragino Sans GB"/>
+          </w:rPr>
+          <w:t>AMZN</w:t>
+        </w:r>
+      </w:hyperlink>
+      <w:r>
+        <w:t xml:space="preserve"> · </w:t>
+      </w:r>
+      <w:hyperlink r:id="rId62">
+        <w:r>
+          <w:rPr>
+            <w:color w:val="1D5FD1"/>
+            <w:u w:val="single"/>
+            <w:sz w:val="17"/>
+            <w:szCs w:val="17"/>
+            <w:rFonts w:ascii="Calibri" w:hAnsi="Calibri" w:eastAsia="Hiragino Sans GB"/>
+          </w:rPr>
+          <w:t>GOOGL</w:t>
+        </w:r>
+      </w:hyperlink>
+      <w:r>
+        <w:t xml:space="preserve"> · </w:t>
+      </w:r>
+      <w:hyperlink r:id="rId42">
         <w:r>
           <w:rPr>
             <w:color w:val="1D5FD1"/>
@@ -2766,7 +2943,7 @@
       <w:r>
         <w:t xml:space="preserve"> · </w:t>
       </w:r>
-      <w:hyperlink r:id="rId41">
+      <w:hyperlink r:id="rId63">
         <w:r>
           <w:rPr>
             <w:color w:val="1D5FD1"/>
@@ -2775,199 +2952,7 @@
             <w:szCs w:val="17"/>
             <w:rFonts w:ascii="Calibri" w:hAnsi="Calibri" w:eastAsia="Hiragino Sans GB"/>
           </w:rPr>
-          <w:t>TSM</w:t>
-        </w:r>
-      </w:hyperlink>
-      <w:r>
-        <w:t xml:space="preserve"> · </w:t>
-      </w:r>
-      <w:hyperlink r:id="rId42">
-        <w:r>
-          <w:rPr>
-            <w:color w:val="1D5FD1"/>
-            <w:u w:val="single"/>
-            <w:sz w:val="17"/>
-            <w:szCs w:val="17"/>
-            <w:rFonts w:ascii="Calibri" w:hAnsi="Calibri" w:eastAsia="Hiragino Sans GB"/>
-          </w:rPr>
-          <w:t>MU</w:t>
-        </w:r>
-      </w:hyperlink>
-      <w:r>
-        <w:t xml:space="preserve"> · </w:t>
-      </w:r>
-      <w:hyperlink r:id="rId43">
-        <w:r>
-          <w:rPr>
-            <w:color w:val="1D5FD1"/>
-            <w:u w:val="single"/>
-            <w:sz w:val="17"/>
-            <w:szCs w:val="17"/>
-            <w:rFonts w:ascii="Calibri" w:hAnsi="Calibri" w:eastAsia="Hiragino Sans GB"/>
-          </w:rPr>
-          <w:t>000660.KS</w:t>
-        </w:r>
-      </w:hyperlink>
-      <w:r>
-        <w:t xml:space="preserve"> · </w:t>
-      </w:r>
-      <w:hyperlink r:id="rId35">
-        <w:r>
-          <w:rPr>
-            <w:color w:val="1D5FD1"/>
-            <w:u w:val="single"/>
-            <w:sz w:val="17"/>
-            <w:szCs w:val="17"/>
-            <w:rFonts w:ascii="Calibri" w:hAnsi="Calibri" w:eastAsia="Hiragino Sans GB"/>
-          </w:rPr>
-          <w:t>META</w:t>
-        </w:r>
-      </w:hyperlink>
-      <w:r>
-        <w:t xml:space="preserve"> · </w:t>
-      </w:r>
-      <w:hyperlink r:id="rId44">
-        <w:r>
-          <w:rPr>
-            <w:color w:val="1D5FD1"/>
-            <w:u w:val="single"/>
-            <w:sz w:val="17"/>
-            <w:szCs w:val="17"/>
-            <w:rFonts w:ascii="Calibri" w:hAnsi="Calibri" w:eastAsia="Hiragino Sans GB"/>
-          </w:rPr>
-          <w:t>AMD</w:t>
-        </w:r>
-      </w:hyperlink>
-    </w:p>
-    <w:p>
-      <w:pPr>
-        <w:keepNext/>
-      </w:pPr>
-      <w:r>
-        <w:rPr>
-          <w:rFonts w:ascii="Calibri" w:hAnsi="Calibri" w:eastAsia="Hiragino Sans GB"/>
-          <w:b/>
-          <w:color w:val="D85B16"/>
-          <w:sz w:val="18"/>
-        </w:rPr>
-        <w:t xml:space="preserve">05  SPLIT  </w:t>
-      </w:r>
-      <w:r>
-        <w:rPr>
-          <w:rFonts w:ascii="Calibri" w:hAnsi="Calibri" w:eastAsia="Hiragino Sans GB"/>
-          <w:b/>
-          <w:color w:val="111111"/>
-          <w:sz w:val="22"/>
-        </w:rPr>
-        <w:t>酒店餐饮休闲复苏正在从客流修复转向 RevPAR、翻台率与小盘 Alpha 的本周证据更新</w:t>
-      </w:r>
-    </w:p>
-    <w:p>
-      <w:pPr>
-        <w:keepLines w:val="0"/>
-      </w:pPr>
-      <w:r>
-        <w:rPr>
-          <w:rFonts w:ascii="Calibri" w:hAnsi="Calibri" w:eastAsia="Hiragino Sans GB"/>
-          <w:b w:val="0"/>
-          <w:color w:val="111111"/>
-          <w:sz w:val="22"/>
-        </w:rPr>
-        <w:t>赛道：酒店餐饮休闲/服务消费。候选观察标的：1179.HK, 9961.HK, 3690.HK, YUMC, MAR, BKNG, SBUX。当前共有 40 条证据、1 位分析师和 4 条风险信号指向该判断；主导链条为 宏观通胀传导。该主题应作为可跟踪投资假设，而不是孤立结论。 本周新增 8 条主线事件，其中支持 5 条、风险 3 条；当前组合含义是 先放入观察池，只在证据密度和价格确认同时改善时进入组合。</w:t>
-      </w:r>
-    </w:p>
-    <w:p>
-      <w:pPr>
-        <w:pStyle w:val="TableCitation"/>
-      </w:pPr>
-      <w:r>
-        <w:t>关联标的：</w:t>
-      </w:r>
-      <w:hyperlink r:id="rId45">
-        <w:r>
-          <w:rPr>
-            <w:color w:val="1D5FD1"/>
-            <w:u w:val="single"/>
-            <w:sz w:val="17"/>
-            <w:szCs w:val="17"/>
-            <w:rFonts w:ascii="Calibri" w:hAnsi="Calibri" w:eastAsia="Hiragino Sans GB"/>
-          </w:rPr>
-          <w:t>9922.HK</w:t>
-        </w:r>
-      </w:hyperlink>
-      <w:r>
-        <w:t xml:space="preserve"> · </w:t>
-      </w:r>
-      <w:hyperlink r:id="rId46">
-        <w:r>
-          <w:rPr>
-            <w:color w:val="1D5FD1"/>
-            <w:u w:val="single"/>
-            <w:sz w:val="17"/>
-            <w:szCs w:val="17"/>
-            <w:rFonts w:ascii="Calibri" w:hAnsi="Calibri" w:eastAsia="Hiragino Sans GB"/>
-          </w:rPr>
-          <w:t>001215.SZ</w:t>
-        </w:r>
-      </w:hyperlink>
-      <w:r>
-        <w:t xml:space="preserve"> · </w:t>
-      </w:r>
-      <w:hyperlink r:id="rId47">
-        <w:r>
-          <w:rPr>
-            <w:color w:val="1D5FD1"/>
-            <w:u w:val="single"/>
-            <w:sz w:val="17"/>
-            <w:szCs w:val="17"/>
-            <w:rFonts w:ascii="Calibri" w:hAnsi="Calibri" w:eastAsia="Hiragino Sans GB"/>
-          </w:rPr>
-          <w:t>3690.HK</w:t>
-        </w:r>
-      </w:hyperlink>
-      <w:r>
-        <w:t xml:space="preserve"> · </w:t>
-      </w:r>
-      <w:hyperlink r:id="rId48">
-        <w:r>
-          <w:rPr>
-            <w:color w:val="1D5FD1"/>
-            <w:u w:val="single"/>
-            <w:sz w:val="17"/>
-            <w:szCs w:val="17"/>
-            <w:rFonts w:ascii="Calibri" w:hAnsi="Calibri" w:eastAsia="Hiragino Sans GB"/>
-          </w:rPr>
-          <w:t>YUMC</w:t>
-        </w:r>
-      </w:hyperlink>
-      <w:r>
-        <w:t xml:space="preserve"> · </w:t>
-      </w:r>
-      <w:hyperlink r:id="rId49">
-        <w:r>
-          <w:rPr>
-            <w:color w:val="1D5FD1"/>
-            <w:u w:val="single"/>
-            <w:sz w:val="17"/>
-            <w:szCs w:val="17"/>
-            <w:rFonts w:ascii="Calibri" w:hAnsi="Calibri" w:eastAsia="Hiragino Sans GB"/>
-          </w:rPr>
-          <w:t>1179.HK</w:t>
-        </w:r>
-      </w:hyperlink>
-      <w:r>
-        <w:t xml:space="preserve"> · </w:t>
-      </w:r>
-      <w:hyperlink r:id="rId50">
-        <w:r>
-          <w:rPr>
-            <w:color w:val="1D5FD1"/>
-            <w:u w:val="single"/>
-            <w:sz w:val="17"/>
-            <w:szCs w:val="17"/>
-            <w:rFonts w:ascii="Calibri" w:hAnsi="Calibri" w:eastAsia="Hiragino Sans GB"/>
-          </w:rPr>
-          <w:t>0780.HK</w:t>
+          <w:t>AAPL</w:t>
         </w:r>
       </w:hyperlink>
     </w:p>
@@ -3208,7 +3193,7 @@
             </w:tcMar>
           </w:tcPr>
           <w:p>
-            <w:hyperlink r:id="rId51">
+            <w:hyperlink r:id="rId64">
               <w:r>
                 <w:rPr>
                   <w:color w:val="1D5FD1"/>
@@ -3339,7 +3324,7 @@
             </w:tcMar>
           </w:tcPr>
           <w:p>
-            <w:hyperlink r:id="rId52">
+            <w:hyperlink r:id="rId65">
               <w:r>
                 <w:rPr>
                   <w:color w:val="1D5FD1"/>
@@ -3470,7 +3455,7 @@
             </w:tcMar>
           </w:tcPr>
           <w:p>
-            <w:hyperlink r:id="rId53">
+            <w:hyperlink r:id="rId66">
               <w:r>
                 <w:rPr>
                   <w:color w:val="1D5FD1"/>
@@ -3601,7 +3586,7 @@
             </w:tcMar>
           </w:tcPr>
           <w:p>
-            <w:hyperlink r:id="rId54">
+            <w:hyperlink r:id="rId67">
               <w:r>
                 <w:rPr>
                   <w:color w:val="1D5FD1"/>
@@ -3863,7 +3848,7 @@
             </w:tcMar>
           </w:tcPr>
           <w:p>
-            <w:hyperlink r:id="rId55">
+            <w:hyperlink r:id="rId68">
               <w:r>
                 <w:rPr>
                   <w:color w:val="1D5FD1"/>
@@ -3994,7 +3979,7 @@
             </w:tcMar>
           </w:tcPr>
           <w:p>
-            <w:hyperlink r:id="rId56">
+            <w:hyperlink r:id="rId69">
               <w:r>
                 <w:rPr>
                   <w:color w:val="1D5FD1"/>
@@ -4125,7 +4110,7 @@
             </w:tcMar>
           </w:tcPr>
           <w:p>
-            <w:hyperlink r:id="rId57">
+            <w:hyperlink r:id="rId70">
               <w:r>
                 <w:rPr>
                   <w:color w:val="1D5FD1"/>
@@ -4256,7 +4241,7 @@
             </w:tcMar>
           </w:tcPr>
           <w:p>
-            <w:hyperlink r:id="rId58">
+            <w:hyperlink r:id="rId71">
               <w:r>
                 <w:rPr>
                   <w:color w:val="1D5FD1"/>
@@ -4387,7 +4372,7 @@
             </w:tcMar>
           </w:tcPr>
           <w:p>
-            <w:hyperlink r:id="rId59">
+            <w:hyperlink r:id="rId72">
               <w:r>
                 <w:rPr>
                   <w:color w:val="1D5FD1"/>
@@ -4518,7 +4503,7 @@
             </w:tcMar>
           </w:tcPr>
           <w:p>
-            <w:hyperlink r:id="rId60">
+            <w:hyperlink r:id="rId73">
               <w:r>
                 <w:rPr>
                   <w:color w:val="1D5FD1"/>
@@ -4649,7 +4634,7 @@
             </w:tcMar>
           </w:tcPr>
           <w:p>
-            <w:hyperlink r:id="rId61">
+            <w:hyperlink r:id="rId74">
               <w:r>
                 <w:rPr>
                   <w:color w:val="1D5FD1"/>
@@ -4729,7 +4714,7 @@
         <w:pStyle w:val="Heading2"/>
       </w:pPr>
       <w:r>
-        <w:t>01 · Mag7 在 AI 时代从平台垄断转向基础设施再分层</w:t>
+        <w:t>01 · AI电力瓶颈究竟是再通胀，还是短期需求破坏</w:t>
       </w:r>
     </w:p>
     <w:tbl>
@@ -4805,7 +4790,7 @@
                 <w:color w:val="111111"/>
                 <w:sz w:val="18"/>
               </w:rPr>
-              <w:t>2026-07-10｜超大规模厂商资本轮动：从消费内容到 AI 算力</w:t>
+              <w:t>容量费、电网扩容和大负荷接入成本可能经费率机制传导至能源服务价格，同时设备短缺延长资本开支周期，支持AI再通胀与电网设备主线。</w:t>
             </w:r>
           </w:p>
         </w:tc>
@@ -4863,7 +4848,7 @@
                 <w:color w:val="111111"/>
                 <w:sz w:val="18"/>
               </w:rPr>
-              <w:t>2026-07-18 AI 资本开支消化气穴仪表盘:公司与供应链披露</w:t>
+              <w:t>并网和信用约束也可能先推迟数据中心建设，使名义capex无法转化为固定投资与用电需求；若项目滑期主导，短期通胀脉冲和设备兑现都可能弱于预期。</w:t>
             </w:r>
           </w:p>
         </w:tc>
@@ -4921,7 +4906,7 @@
                 <w:color w:val="111111"/>
                 <w:sz w:val="18"/>
               </w:rPr>
-              <w:t>下一周需要由价格、订单、交付、政策或盈利数据中的至少一项同向确认。</w:t>
+              <w:t>同时观察已锁定兆瓦、可靠并网日、大负荷费率保护、设备交期以及CPI/PCE能源服务项；只有物理交付与通胀数据同向，才能确认主导机制。</w:t>
             </w:r>
           </w:p>
         </w:tc>
@@ -4932,7 +4917,7 @@
         <w:pStyle w:val="Heading2"/>
       </w:pPr>
       <w:r>
-        <w:t>02 · 中国资产定价仍受政策、流动性与风险偏好共同驱动</w:t>
+        <w:t>02 · Mag7高资本开支能否转化为平台盈利分层</w:t>
       </w:r>
     </w:p>
     <w:tbl>
@@ -5008,7 +4993,7 @@
                 <w:color w:val="111111"/>
                 <w:sz w:val="18"/>
               </w:rPr>
-              <w:t>港股主导 AI 算力国产替代交易的 FX 覆盖方案</w:t>
+              <w:t>云厂商继续建设AI基础设施，并通过模型降本、Agent化和平台分发扩大使用量，可能强化拥有云、数据和分发入口的平台优势。</w:t>
             </w:r>
           </w:p>
         </w:tc>
@@ -5066,7 +5051,7 @@
                 <w:color w:val="111111"/>
                 <w:sz w:val="18"/>
               </w:rPr>
-              <w:t>压力测试「出口+高股息」组合的流动性边界：顺差收窄触发的汇率压力如何经北向资金与融资融券传导</w:t>
+              <w:t>模型价格战会压缩单位经济性；若并网落后于服务器采购，资本开支可能先形成折旧和现金流压力，而非同步形成可变现收入。</w:t>
             </w:r>
           </w:p>
         </w:tc>
@@ -5124,7 +5109,7 @@
                 <w:color w:val="111111"/>
                 <w:sz w:val="18"/>
               </w:rPr>
-              <w:t>下一周需要由价格、订单、交付、政策或盈利数据中的至少一项同向确认。</w:t>
+              <w:t>核对云厂商capex指引、AI收入与云增长、自由现金流、已通电容量和电力合同覆盖率是否同步改善。</w:t>
             </w:r>
           </w:p>
         </w:tc>
@@ -5135,7 +5120,7 @@
         <w:pStyle w:val="Heading2"/>
       </w:pPr>
       <w:r>
-        <w:t>03 · AI 资本开支通过能源、设备和利率进入通胀定价</w:t>
+        <w:t>03 · A股政策支持能否穿透微观流动性约束</w:t>
       </w:r>
     </w:p>
     <w:tbl>
@@ -5211,7 +5196,7 @@
                 <w:color w:val="111111"/>
                 <w:sz w:val="18"/>
               </w:rPr>
-              <w:t>AI基建净通胀-增长脉冲的量化与沃什美联储反应函数</w:t>
+              <w:t>人民币路径、出口链盈利和内需政策信号若相互配合，可改善中国资产的风险预算与结构性机会。红利资产还具备质量筛选和现金流防线。</w:t>
             </w:r>
           </w:p>
         </w:tc>
@@ -5269,7 +5254,7 @@
                 <w:color w:val="111111"/>
                 <w:sz w:val="18"/>
               </w:rPr>
-              <w:t>硅电锁死与再通胀：AI算力电力通胀向核心PCE的传导路径与降息周期的利率定价博弈</w:t>
+              <w:t>两融、ETF被动化、指数调样与中小盘折价可能令政策利好停留在局部；硬科技拥挤度和基本面验证不足会使杠铃的成长腿继续拖累整体结构。</w:t>
             </w:r>
           </w:p>
         </w:tc>
@@ -5327,7 +5312,210 @@
                 <w:color w:val="111111"/>
                 <w:sz w:val="18"/>
               </w:rPr>
-              <w:t>下一周需要由价格、订单、交付、政策或盈利数据中的至少一项同向确认。</w:t>
+              <w:t>观察融资余额、ETF申赎和北向资金是否连续同向，并要求硬科技订单、良率和盈利证据同步更新。</w:t>
+            </w:r>
+          </w:p>
+        </w:tc>
+      </w:tr>
+    </w:tbl>
+    <w:p>
+      <w:pPr>
+        <w:pStyle w:val="Heading2"/>
+      </w:pPr>
+      <w:r>
+        <w:t>04 · NAND与半导体稀缺盈利能否扩散</w:t>
+      </w:r>
+    </w:p>
+    <w:tbl>
+      <w:tblPr>
+        <w:tblW w:type="dxa" w:w="9360"/>
+        <w:jc w:val="left"/>
+        <w:tblLayout w:type="fixed"/>
+        <w:tblLook w:firstColumn="1" w:firstRow="1" w:lastColumn="0" w:lastRow="0" w:noHBand="0" w:noVBand="1" w:val="04A0"/>
+        <w:tblInd w:w="120" w:type="dxa"/>
+        <w:tblBorders>
+          <w:top w:val="single" w:sz="4" w:color="C8CDD3"/>
+          <w:left w:val="single" w:sz="4" w:color="C8CDD3"/>
+          <w:bottom w:val="single" w:sz="4" w:color="C8CDD3"/>
+          <w:right w:val="single" w:sz="4" w:color="C8CDD3"/>
+          <w:insideH w:val="single" w:sz="4" w:color="C8CDD3"/>
+          <w:insideV w:val="single" w:sz="4" w:color="C8CDD3"/>
+        </w:tblBorders>
+      </w:tblPr>
+      <w:tblGrid>
+        <w:gridCol w:w="1350"/>
+        <w:gridCol w:w="8010"/>
+      </w:tblGrid>
+      <w:tr>
+        <w:trPr>
+          <w:cantSplit/>
+        </w:trPr>
+        <w:tc>
+          <w:tcPr>
+            <w:tcW w:type="dxa" w:w="1350"/>
+            <w:tcMar>
+              <w:top w:w="80" w:type="dxa"/>
+              <w:bottom w:w="80" w:type="dxa"/>
+              <w:start w:w="120" w:type="dxa"/>
+              <w:end w:w="120" w:type="dxa"/>
+            </w:tcMar>
+            <w:vAlign w:val="top"/>
+            <w:shd w:fill="F2F4F7"/>
+          </w:tcPr>
+          <w:p>
+            <w:pPr>
+              <w:spacing w:before="0" w:after="0" w:line="252" w:lineRule="auto"/>
+            </w:pPr>
+            <w:r>
+              <w:rPr>
+                <w:rFonts w:ascii="Calibri" w:hAnsi="Calibri" w:eastAsia="Hiragino Sans GB"/>
+                <w:b/>
+                <w:color w:val="18864B"/>
+                <w:sz w:val="16"/>
+              </w:rPr>
+              <w:t>SUPPORT</w:t>
+            </w:r>
+          </w:p>
+        </w:tc>
+        <w:tc>
+          <w:tcPr>
+            <w:tcW w:type="dxa" w:w="8010"/>
+            <w:tcMar>
+              <w:top w:w="80" w:type="dxa"/>
+              <w:bottom w:w="80" w:type="dxa"/>
+              <w:start w:w="120" w:type="dxa"/>
+              <w:end w:w="120" w:type="dxa"/>
+            </w:tcMar>
+            <w:vAlign w:val="top"/>
+          </w:tcPr>
+          <w:p>
+            <w:pPr>
+              <w:spacing w:before="0" w:after="0" w:line="252" w:lineRule="auto"/>
+            </w:pPr>
+            <w:r>
+              <w:rPr>
+                <w:rFonts w:ascii="Calibri" w:hAnsi="Calibri" w:eastAsia="Hiragino Sans GB"/>
+                <w:b w:val="0"/>
+                <w:color w:val="111111"/>
+                <w:sz w:val="18"/>
+              </w:rPr>
+              <w:t>若AI与企业存储需求维持、供给纪律未被破坏，单位价格和高价值产品占比改善可继续支撑MU、000660.KS等存储链盈利韧性。</w:t>
+            </w:r>
+          </w:p>
+        </w:tc>
+      </w:tr>
+      <w:tr>
+        <w:trPr>
+          <w:cantSplit/>
+        </w:trPr>
+        <w:tc>
+          <w:tcPr>
+            <w:tcW w:type="dxa" w:w="1350"/>
+            <w:tcMar>
+              <w:top w:w="80" w:type="dxa"/>
+              <w:bottom w:w="80" w:type="dxa"/>
+              <w:start w:w="120" w:type="dxa"/>
+              <w:end w:w="120" w:type="dxa"/>
+            </w:tcMar>
+            <w:vAlign w:val="top"/>
+            <w:shd w:fill="F2F4F7"/>
+          </w:tcPr>
+          <w:p>
+            <w:pPr>
+              <w:spacing w:before="0" w:after="0" w:line="252" w:lineRule="auto"/>
+            </w:pPr>
+            <w:r>
+              <w:rPr>
+                <w:rFonts w:ascii="Calibri" w:hAnsi="Calibri" w:eastAsia="Hiragino Sans GB"/>
+                <w:b/>
+                <w:color w:val="C92A2A"/>
+                <w:sz w:val="16"/>
+              </w:rPr>
+              <w:t>CHALLENGE</w:t>
+            </w:r>
+          </w:p>
+        </w:tc>
+        <w:tc>
+          <w:tcPr>
+            <w:tcW w:type="dxa" w:w="8010"/>
+            <w:tcMar>
+              <w:top w:w="80" w:type="dxa"/>
+              <w:bottom w:w="80" w:type="dxa"/>
+              <w:start w:w="120" w:type="dxa"/>
+              <w:end w:w="120" w:type="dxa"/>
+            </w:tcMar>
+            <w:vAlign w:val="top"/>
+          </w:tcPr>
+          <w:p>
+            <w:pPr>
+              <w:spacing w:before="0" w:after="0" w:line="252" w:lineRule="auto"/>
+            </w:pPr>
+            <w:r>
+              <w:rPr>
+                <w:rFonts w:ascii="Calibri" w:hAnsi="Calibri" w:eastAsia="Hiragino Sans GB"/>
+                <w:b w:val="0"/>
+                <w:color w:val="111111"/>
+                <w:sz w:val="18"/>
+              </w:rPr>
+              <w:t>新增供给、产品价格回落或先进封装及光电集成瓶颈扩散，都可能令盈利弹性快速反转；当前证据仅支持稀缺盈利，尚不支持行业全面扩散。</w:t>
+            </w:r>
+          </w:p>
+        </w:tc>
+      </w:tr>
+      <w:tr>
+        <w:trPr>
+          <w:cantSplit/>
+        </w:trPr>
+        <w:tc>
+          <w:tcPr>
+            <w:tcW w:type="dxa" w:w="1350"/>
+            <w:tcMar>
+              <w:top w:w="80" w:type="dxa"/>
+              <w:bottom w:w="80" w:type="dxa"/>
+              <w:start w:w="120" w:type="dxa"/>
+              <w:end w:w="120" w:type="dxa"/>
+            </w:tcMar>
+            <w:vAlign w:val="top"/>
+            <w:shd w:fill="F2F4F7"/>
+          </w:tcPr>
+          <w:p>
+            <w:pPr>
+              <w:spacing w:before="0" w:after="0" w:line="252" w:lineRule="auto"/>
+            </w:pPr>
+            <w:r>
+              <w:rPr>
+                <w:rFonts w:ascii="Calibri" w:hAnsi="Calibri" w:eastAsia="Hiragino Sans GB"/>
+                <w:b/>
+                <w:color w:val="D85B16"/>
+                <w:sz w:val="16"/>
+              </w:rPr>
+              <w:t>RESOLVE</w:t>
+            </w:r>
+          </w:p>
+        </w:tc>
+        <w:tc>
+          <w:tcPr>
+            <w:tcW w:type="dxa" w:w="8010"/>
+            <w:tcMar>
+              <w:top w:w="80" w:type="dxa"/>
+              <w:bottom w:w="80" w:type="dxa"/>
+              <w:start w:w="120" w:type="dxa"/>
+              <w:end w:w="120" w:type="dxa"/>
+            </w:tcMar>
+            <w:vAlign w:val="top"/>
+          </w:tcPr>
+          <w:p>
+            <w:pPr>
+              <w:spacing w:before="0" w:after="0" w:line="252" w:lineRule="auto"/>
+            </w:pPr>
+            <w:r>
+              <w:rPr>
+                <w:rFonts w:ascii="Calibri" w:hAnsi="Calibri" w:eastAsia="Hiragino Sans GB"/>
+                <w:b w:val="0"/>
+                <w:color w:val="111111"/>
+                <w:sz w:val="18"/>
+              </w:rPr>
+              <w:t>跟踪NAND合约价格、库存、位元供给增速、企业级产品占比、毛利率指引以及先进封装良率是否同时改善。</w:t>
             </w:r>
           </w:p>
         </w:tc>
@@ -5346,7 +5534,7 @@
         <w:pStyle w:val="Heading2"/>
       </w:pPr>
       <w:r>
-        <w:t>01 · AI 电力/电网设备：并网排队和变压器交期是否继续拉长</w:t>
+        <w:t>01 · 云厂商capex与可通电容量是否同步</w:t>
       </w:r>
     </w:p>
     <w:p>
@@ -5360,7 +5548,7 @@
           <w:color w:val="5E6268"/>
           <w:sz w:val="22"/>
         </w:rPr>
-        <w:t>该信号决定 OVERWEIGHT 配置能否从研究判断转化为可验证的组合结果。</w:t>
+        <w:t>这是区分真实基础设施扩张与未通电资本开支的核心闸门，也决定Mag7 HOLD能否获得更强确认。</w:t>
       </w:r>
     </w:p>
     <w:tbl>
@@ -5437,7 +5625,7 @@
                 <w:color w:val="111111"/>
                 <w:sz w:val="17"/>
               </w:rPr>
-              <w:t>并网排队和变压器交期是否继续拉长</w:t>
+              <w:t>云厂商上修或维持capex指引，同时披露已签电力服务协议、已锁定兆瓦或可靠并网日改善，且自由现金流未进一步承压。</w:t>
             </w:r>
           </w:p>
         </w:tc>
@@ -5463,7 +5651,7 @@
                 <w:color w:val="111111"/>
                 <w:sz w:val="17"/>
               </w:rPr>
-              <w:t>在既定赛道上限内优先增加证据最强的核心标的。</w:t>
+              <w:t>维持Mag7整体HOLD，但把观察权重向合同质量、已通电容量和现金流更强的平台倾斜；AI算力半导体停止进一步扩张性减仓评估，仍不恢复无条件加仓。</w:t>
             </w:r>
           </w:p>
         </w:tc>
@@ -5521,7 +5709,7 @@
                 <w:color w:val="111111"/>
                 <w:sz w:val="17"/>
               </w:rPr>
-              <w:t>风险事件继续高于支持事件，且最新证据没有修复。</w:t>
+              <w:t>capex保持高位但并网日后移、项目滑期扩大、合同覆盖不足或自由现金流恶化。</w:t>
             </w:r>
           </w:p>
         </w:tc>
@@ -5547,7 +5735,7 @@
                 <w:color w:val="111111"/>
                 <w:sz w:val="17"/>
               </w:rPr>
-              <w:t>降低相关暴露，回到观察状态，并重新比较替代赛道。</w:t>
+              <w:t>继续压低未通电云资本开支和高估值平台暴露，并执行AI算力半导体TRIM，增加组合现金与防御预算。</w:t>
             </w:r>
           </w:p>
         </w:tc>
@@ -5558,7 +5746,7 @@
         <w:pStyle w:val="Heading2"/>
       </w:pPr>
       <w:r>
-        <w:t>02 · A股半导体/两融负 Gamma：融资余额、ETF 申赎和北向资金是否同向</w:t>
+        <w:t>02 · CPI/PCE、油价与实际利率是否形成同向冲击</w:t>
       </w:r>
     </w:p>
     <w:p>
@@ -5572,7 +5760,7 @@
           <w:color w:val="5E6268"/>
           <w:sz w:val="22"/>
         </w:rPr>
-        <w:t>该信号决定 UNDERWEIGHT 配置能否从研究判断转化为可验证的组合结果。</w:t>
+        <w:t>该组合信号将决定AI电力瓶颈是以再通胀还是建设滑期主导，并影响半导体、长久期平台和利率敏感资产。</w:t>
       </w:r>
     </w:p>
     <w:tbl>
@@ -5649,7 +5837,7 @@
                 <w:color w:val="111111"/>
                 <w:sz w:val="17"/>
               </w:rPr>
-              <w:t>融资余额、ETF 申赎和北向资金是否同向</w:t>
+              <w:t>CPI/PCE未重新加速，油价压力受控，实际利率未被重新推高，同时数据中心交付改善。</w:t>
             </w:r>
           </w:p>
         </w:tc>
@@ -5675,7 +5863,7 @@
                 <w:color w:val="111111"/>
                 <w:sz w:val="17"/>
               </w:rPr>
-              <w:t>维持低配并等待第二条确认。</w:t>
+              <w:t>维持AI再通胀/利率敏感资产HOLD，优先保留订单和费率保护明确的电网设备及公用事业观察仓，不押注单一久期方向。</w:t>
             </w:r>
           </w:p>
         </w:tc>
@@ -5733,7 +5921,7 @@
                 <w:color w:val="111111"/>
                 <w:sz w:val="17"/>
               </w:rPr>
-              <w:t>风险事件继续高于支持事件，且最新证据没有修复。</w:t>
+              <w:t>CPI/PCE与油价同步上行并推高实际利率，或项目滑期继续扩大、固定投资走弱。</w:t>
             </w:r>
           </w:p>
         </w:tc>
@@ -5759,7 +5947,7 @@
                 <w:color w:val="111111"/>
                 <w:sz w:val="17"/>
               </w:rPr>
-              <w:t>降低相关暴露，回到观察状态，并重新比较替代赛道。</w:t>
+              <w:t>降低AI算力半导体和长久期平台集中度；若由再通胀主导，收缩久期风险，若由滑期主导，则同步削减未兑现的电力与设备题材。</w:t>
             </w:r>
           </w:p>
         </w:tc>
@@ -5770,7 +5958,7 @@
         <w:pStyle w:val="Heading2"/>
       </w:pPr>
       <w:r>
-        <w:t>03 · A股风险偏好/两融：融资余额、ETF 申赎和北向资金是否同向</w:t>
+        <w:t>03 · A股融资、ETF申赎与北向资金三联确认</w:t>
       </w:r>
     </w:p>
     <w:p>
@@ -5784,7 +5972,7 @@
           <w:color w:val="5E6268"/>
           <w:sz w:val="22"/>
         </w:rPr>
-        <w:t>该信号决定 UNDERWEIGHT 配置能否从研究判断转化为可验证的组合结果。</w:t>
+        <w:t>中国权益流动性TRIM和A股杠铃HOLD能否升级，取决于宏观政策支持是否真正穿透微观结构。</w:t>
       </w:r>
     </w:p>
     <w:tbl>
@@ -5861,7 +6049,7 @@
                 <w:color w:val="111111"/>
                 <w:sz w:val="17"/>
               </w:rPr>
-              <w:t>融资余额、ETF 申赎和北向资金是否同向</w:t>
+              <w:t>融资余额、ETF申赎和北向资金连续同向改善，且硬科技订单、良率或盈利证据同步更新。</w:t>
             </w:r>
           </w:p>
         </w:tc>
@@ -5887,7 +6075,7 @@
                 <w:color w:val="111111"/>
                 <w:sz w:val="17"/>
               </w:rPr>
-              <w:t>维持低配并等待第二条确认。</w:t>
+              <w:t>中国权益仍保持已降低的风险预算；A股杠铃整体维持HOLD，仅将获得基本面和价格双重确认的一腿从观察池转为小额分批验证。</w:t>
             </w:r>
           </w:p>
         </w:tc>
@@ -5945,7 +6133,7 @@
                 <w:color w:val="111111"/>
                 <w:sz w:val="17"/>
               </w:rPr>
-              <w:t>风险事件继续高于支持事件，且最新证据没有修复。</w:t>
+              <w:t>三项指标继续背离，ETF承接集中于少数指数权重，或两融与中小盘流动性压力加剧。</w:t>
             </w:r>
           </w:p>
         </w:tc>
@@ -5971,7 +6159,7 @@
                 <w:color w:val="111111"/>
                 <w:sz w:val="17"/>
               </w:rPr>
-              <w:t>降低相关暴露，回到观察状态，并重新比较替代赛道。</w:t>
+              <w:t>继续执行中国权益流动性TRIM，并进一步收缩硬科技腿，红利腿也只保留银行质量和公用事业现金流可验证的标的。</w:t>
             </w:r>
           </w:p>
         </w:tc>
@@ -5982,7 +6170,7 @@
         <w:pStyle w:val="Heading2"/>
       </w:pPr>
       <w:r>
-        <w:t>04 · 先进封装/HBM4 闸门：云厂商 capex 指引是否继续上修</w:t>
+        <w:t>04 · NAND价格、产品结构与供给纪律</w:t>
       </w:r>
     </w:p>
     <w:p>
@@ -5996,7 +6184,7 @@
           <w:color w:val="5E6268"/>
           <w:sz w:val="22"/>
         </w:rPr>
-        <w:t>该信号决定 NEUTRAL 配置能否从研究判断转化为可验证的组合结果。</w:t>
+        <w:t>这是验证NAND盈利弹性是否仍由单位价格和高价值产品主导，以及AI算力半导体TRIM是否需要继续的直接指标。</w:t>
       </w:r>
     </w:p>
     <w:tbl>
@@ -6073,7 +6261,7 @@
                 <w:color w:val="111111"/>
                 <w:sz w:val="17"/>
               </w:rPr>
-              <w:t>云厂商 capex 指引是否继续上修</w:t>
+              <w:t>企业级存储需求、NAND合约价格、高价值产品占比和毛利率指引同步改善，且位元供给增速保持克制。</w:t>
             </w:r>
           </w:p>
         </w:tc>
@@ -6099,7 +6287,7 @@
                 <w:color w:val="111111"/>
                 <w:sz w:val="17"/>
               </w:rPr>
-              <w:t>在既定赛道上限内优先增加证据最强的核心标的。</w:t>
+              <w:t>停止进一步削减已通过订单、结构和现金流验证的存储核心暴露，但不撤销当前TRIM形成的风险控制。</w:t>
             </w:r>
           </w:p>
         </w:tc>
@@ -6157,7 +6345,7 @@
                 <w:color w:val="111111"/>
                 <w:sz w:val="17"/>
               </w:rPr>
-              <w:t>风险事件继续高于支持事件，且最新证据没有修复。</w:t>
+              <w:t>新增供给加速、合约价格转弱、库存上升或产品结构改善不足以抵消成本与良率压力。</w:t>
             </w:r>
           </w:p>
         </w:tc>
@@ -6183,219 +6371,7 @@
                 <w:color w:val="111111"/>
                 <w:sz w:val="17"/>
               </w:rPr>
-              <w:t>降低相关暴露，回到观察状态，并重新比较替代赛道。</w:t>
-            </w:r>
-          </w:p>
-        </w:tc>
-      </w:tr>
-    </w:tbl>
-    <w:p>
-      <w:pPr>
-        <w:pStyle w:val="Heading2"/>
-      </w:pPr>
-      <w:r>
-        <w:t>05 · AI 算力半导体：CPI/PCE 与油价是否重新推高实际利率</w:t>
-      </w:r>
-    </w:p>
-    <w:p>
-      <w:pPr>
-        <w:keepLines/>
-      </w:pPr>
-      <w:r>
-        <w:rPr>
-          <w:rFonts w:ascii="Calibri" w:hAnsi="Calibri" w:eastAsia="Hiragino Sans GB"/>
-          <w:b w:val="0"/>
-          <w:color w:val="5E6268"/>
-          <w:sz w:val="22"/>
-        </w:rPr>
-        <w:t>该信号决定 NEUTRAL 配置能否从研究判断转化为可验证的组合结果。</w:t>
-      </w:r>
-    </w:p>
-    <w:tbl>
-      <w:tblPr>
-        <w:tblW w:type="dxa" w:w="9360"/>
-        <w:jc w:val="left"/>
-        <w:tblLayout w:type="fixed"/>
-        <w:tblLook w:firstColumn="1" w:firstRow="1" w:lastColumn="0" w:lastRow="0" w:noHBand="0" w:noVBand="1" w:val="04A0"/>
-        <w:tblInd w:w="120" w:type="dxa"/>
-        <w:tblBorders>
-          <w:top w:val="single" w:sz="4" w:color="C8CDD3"/>
-          <w:left w:val="single" w:sz="4" w:color="C8CDD3"/>
-          <w:bottom w:val="single" w:sz="4" w:color="C8CDD3"/>
-          <w:right w:val="single" w:sz="4" w:color="C8CDD3"/>
-          <w:insideH w:val="single" w:sz="4" w:color="C8CDD3"/>
-          <w:insideV w:val="single" w:sz="4" w:color="C8CDD3"/>
-        </w:tblBorders>
-      </w:tblPr>
-      <w:tblGrid>
-        <w:gridCol w:w="900"/>
-        <w:gridCol w:w="3770"/>
-        <w:gridCol w:w="4690"/>
-      </w:tblGrid>
-      <w:tr>
-        <w:trPr>
-          <w:cantSplit/>
-        </w:trPr>
-        <w:tc>
-          <w:tcPr>
-            <w:tcW w:type="dxa" w:w="900"/>
-            <w:tcMar>
-              <w:top w:w="80" w:type="dxa"/>
-              <w:bottom w:w="80" w:type="dxa"/>
-              <w:start w:w="120" w:type="dxa"/>
-              <w:end w:w="120" w:type="dxa"/>
-            </w:tcMar>
-            <w:vAlign w:val="top"/>
-            <w:shd w:fill="F2F4F7"/>
-          </w:tcPr>
-          <w:p>
-            <w:pPr>
-              <w:spacing w:before="0" w:after="0" w:line="252" w:lineRule="auto"/>
-            </w:pPr>
-            <w:r>
-              <w:rPr>
-                <w:rFonts w:ascii="Calibri" w:hAnsi="Calibri" w:eastAsia="Hiragino Sans GB"/>
-                <w:b/>
-                <w:color w:val="18864B"/>
-                <w:sz w:val="15"/>
-              </w:rPr>
-              <w:t>POSITIVE</w:t>
-            </w:r>
-          </w:p>
-        </w:tc>
-        <w:tc>
-          <w:tcPr>
-            <w:tcW w:type="dxa" w:w="3770"/>
-            <w:tcMar>
-              <w:top w:w="80" w:type="dxa"/>
-              <w:bottom w:w="80" w:type="dxa"/>
-              <w:start w:w="120" w:type="dxa"/>
-              <w:end w:w="120" w:type="dxa"/>
-            </w:tcMar>
-            <w:vAlign w:val="top"/>
-          </w:tcPr>
-          <w:p>
-            <w:pPr>
-              <w:spacing w:before="0" w:after="0" w:line="252" w:lineRule="auto"/>
-            </w:pPr>
-            <w:r>
-              <w:rPr>
-                <w:rFonts w:ascii="Calibri" w:hAnsi="Calibri" w:eastAsia="Hiragino Sans GB"/>
-                <w:b w:val="0"/>
-                <w:color w:val="111111"/>
-                <w:sz w:val="17"/>
-              </w:rPr>
-              <w:t>CPI/PCE 与油价是否重新推高实际利率</w:t>
-            </w:r>
-          </w:p>
-        </w:tc>
-        <w:tc>
-          <w:tcPr>
-            <w:tcW w:type="dxa" w:w="4690"/>
-            <w:tcMar>
-              <w:top w:w="80" w:type="dxa"/>
-              <w:bottom w:w="80" w:type="dxa"/>
-              <w:start w:w="120" w:type="dxa"/>
-              <w:end w:w="120" w:type="dxa"/>
-            </w:tcMar>
-            <w:vAlign w:val="top"/>
-          </w:tcPr>
-          <w:p>
-            <w:pPr>
-              <w:spacing w:before="0" w:after="0" w:line="252" w:lineRule="auto"/>
-            </w:pPr>
-            <w:r>
-              <w:rPr>
-                <w:rFonts w:ascii="Calibri" w:hAnsi="Calibri" w:eastAsia="Hiragino Sans GB"/>
-                <w:b w:val="0"/>
-                <w:color w:val="111111"/>
-                <w:sz w:val="17"/>
-              </w:rPr>
-              <w:t>在既定赛道上限内优先增加证据最强的核心标的。</w:t>
-            </w:r>
-          </w:p>
-        </w:tc>
-      </w:tr>
-      <w:tr>
-        <w:trPr>
-          <w:cantSplit/>
-        </w:trPr>
-        <w:tc>
-          <w:tcPr>
-            <w:tcW w:type="dxa" w:w="900"/>
-            <w:tcMar>
-              <w:top w:w="80" w:type="dxa"/>
-              <w:bottom w:w="80" w:type="dxa"/>
-              <w:start w:w="120" w:type="dxa"/>
-              <w:end w:w="120" w:type="dxa"/>
-            </w:tcMar>
-            <w:vAlign w:val="top"/>
-            <w:shd w:fill="F2F4F7"/>
-          </w:tcPr>
-          <w:p>
-            <w:pPr>
-              <w:spacing w:before="0" w:after="0" w:line="252" w:lineRule="auto"/>
-            </w:pPr>
-            <w:r>
-              <w:rPr>
-                <w:rFonts w:ascii="Calibri" w:hAnsi="Calibri" w:eastAsia="Hiragino Sans GB"/>
-                <w:b/>
-                <w:color w:val="C92A2A"/>
-                <w:sz w:val="15"/>
-              </w:rPr>
-              <w:t>NEGATIVE</w:t>
-            </w:r>
-          </w:p>
-        </w:tc>
-        <w:tc>
-          <w:tcPr>
-            <w:tcW w:type="dxa" w:w="3770"/>
-            <w:tcMar>
-              <w:top w:w="80" w:type="dxa"/>
-              <w:bottom w:w="80" w:type="dxa"/>
-              <w:start w:w="120" w:type="dxa"/>
-              <w:end w:w="120" w:type="dxa"/>
-            </w:tcMar>
-            <w:vAlign w:val="top"/>
-          </w:tcPr>
-          <w:p>
-            <w:pPr>
-              <w:spacing w:before="0" w:after="0" w:line="252" w:lineRule="auto"/>
-            </w:pPr>
-            <w:r>
-              <w:rPr>
-                <w:rFonts w:ascii="Calibri" w:hAnsi="Calibri" w:eastAsia="Hiragino Sans GB"/>
-                <w:b w:val="0"/>
-                <w:color w:val="111111"/>
-                <w:sz w:val="17"/>
-              </w:rPr>
-              <w:t>风险事件继续高于支持事件，且最新证据没有修复。</w:t>
-            </w:r>
-          </w:p>
-        </w:tc>
-        <w:tc>
-          <w:tcPr>
-            <w:tcW w:type="dxa" w:w="4690"/>
-            <w:tcMar>
-              <w:top w:w="80" w:type="dxa"/>
-              <w:bottom w:w="80" w:type="dxa"/>
-              <w:start w:w="120" w:type="dxa"/>
-              <w:end w:w="120" w:type="dxa"/>
-            </w:tcMar>
-            <w:vAlign w:val="top"/>
-          </w:tcPr>
-          <w:p>
-            <w:pPr>
-              <w:spacing w:before="0" w:after="0" w:line="252" w:lineRule="auto"/>
-            </w:pPr>
-            <w:r>
-              <w:rPr>
-                <w:rFonts w:ascii="Calibri" w:hAnsi="Calibri" w:eastAsia="Hiragino Sans GB"/>
-                <w:b w:val="0"/>
-                <w:color w:val="111111"/>
-                <w:sz w:val="17"/>
-              </w:rPr>
-              <w:t>降低相关暴露，回到观察状态，并重新比较替代赛道。</w:t>
+              <w:t>继续执行AI算力半导体TRIM，优先削减依赖行业价格上行和高利润率外推的存储与封装暴露。</w:t>
             </w:r>
           </w:p>
         </w:tc>
@@ -6978,10 +6954,10 @@
               <w:rPr>
                 <w:rFonts w:ascii="Calibri" w:hAnsi="Calibri" w:eastAsia="Hiragino Sans GB"/>
                 <w:b/>
-                <w:color w:val="D85B16"/>
+                <w:color w:val="18864B"/>
                 <w:sz w:val="16"/>
               </w:rPr>
-              <w:t>warn · deterministic_grounded</w:t>
+              <w:t>pass · structured_llm</w:t>
             </w:r>
           </w:p>
         </w:tc>
@@ -7285,7 +7261,7 @@
             <w:pPr>
               <w:spacing w:after="20"/>
             </w:pPr>
-            <w:hyperlink r:id="rId62">
+            <w:hyperlink r:id="rId29">
               <w:r>
                 <w:rPr>
                   <w:color w:val="1D5FD1"/>
@@ -7403,7 +7379,7 @@
             <w:pPr>
               <w:spacing w:after="20"/>
             </w:pPr>
-            <w:hyperlink r:id="rId63">
+            <w:hyperlink r:id="rId30">
               <w:r>
                 <w:rPr>
                   <w:color w:val="1D5FD1"/>
@@ -7521,7 +7497,7 @@
             <w:pPr>
               <w:spacing w:after="20"/>
             </w:pPr>
-            <w:hyperlink r:id="rId64">
+            <w:hyperlink r:id="rId75">
               <w:r>
                 <w:rPr>
                   <w:color w:val="1D5FD1"/>
@@ -7639,7 +7615,7 @@
             <w:pPr>
               <w:spacing w:after="20"/>
             </w:pPr>
-            <w:hyperlink r:id="rId65">
+            <w:hyperlink r:id="rId27">
               <w:r>
                 <w:rPr>
                   <w:color w:val="1D5FD1"/>
@@ -7757,7 +7733,7 @@
             <w:pPr>
               <w:spacing w:after="20"/>
             </w:pPr>
-            <w:hyperlink r:id="rId66">
+            <w:hyperlink r:id="rId76">
               <w:r>
                 <w:rPr>
                   <w:color w:val="1D5FD1"/>
@@ -7875,7 +7851,7 @@
             <w:pPr>
               <w:spacing w:after="20"/>
             </w:pPr>
-            <w:hyperlink r:id="rId67">
+            <w:hyperlink r:id="rId77">
               <w:r>
                 <w:rPr>
                   <w:color w:val="1D5FD1"/>
@@ -7993,7 +7969,7 @@
             <w:pPr>
               <w:spacing w:after="20"/>
             </w:pPr>
-            <w:hyperlink r:id="rId68">
+            <w:hyperlink r:id="rId78">
               <w:r>
                 <w:rPr>
                   <w:color w:val="1D5FD1"/>
@@ -8111,7 +8087,7 @@
             <w:pPr>
               <w:spacing w:after="20"/>
             </w:pPr>
-            <w:hyperlink r:id="rId69">
+            <w:hyperlink r:id="rId79">
               <w:r>
                 <w:rPr>
                   <w:color w:val="1D5FD1"/>
@@ -8347,7 +8323,7 @@
             <w:pPr>
               <w:spacing w:after="20"/>
             </w:pPr>
-            <w:hyperlink r:id="rId70">
+            <w:hyperlink r:id="rId31">
               <w:r>
                 <w:rPr>
                   <w:color w:val="1D5FD1"/>
@@ -8465,7 +8441,7 @@
             <w:pPr>
               <w:spacing w:after="20"/>
             </w:pPr>
-            <w:hyperlink r:id="rId71">
+            <w:hyperlink r:id="rId22">
               <w:r>
                 <w:rPr>
                   <w:color w:val="1D5FD1"/>
@@ -8583,7 +8559,7 @@
             <w:pPr>
               <w:spacing w:after="20"/>
             </w:pPr>
-            <w:hyperlink r:id="rId72">
+            <w:hyperlink r:id="rId80">
               <w:r>
                 <w:rPr>
                   <w:color w:val="1D5FD1"/>
@@ -8701,7 +8677,7 @@
             <w:pPr>
               <w:spacing w:after="20"/>
             </w:pPr>
-            <w:hyperlink r:id="rId73">
+            <w:hyperlink r:id="rId81">
               <w:r>
                 <w:rPr>
                   <w:color w:val="1D5FD1"/>
@@ -8819,7 +8795,7 @@
             <w:pPr>
               <w:spacing w:after="20"/>
             </w:pPr>
-            <w:hyperlink r:id="rId19">
+            <w:hyperlink r:id="rId82">
               <w:r>
                 <w:rPr>
                   <w:color w:val="1D5FD1"/>
@@ -8937,7 +8913,7 @@
             <w:pPr>
               <w:spacing w:after="20"/>
             </w:pPr>
-            <w:hyperlink r:id="rId74">
+            <w:hyperlink r:id="rId25">
               <w:r>
                 <w:rPr>
                   <w:color w:val="1D5FD1"/>
@@ -9055,7 +9031,7 @@
             <w:pPr>
               <w:spacing w:after="20"/>
             </w:pPr>
-            <w:hyperlink r:id="rId75">
+            <w:hyperlink r:id="rId83">
               <w:r>
                 <w:rPr>
                   <w:color w:val="1D5FD1"/>
@@ -9173,7 +9149,7 @@
             <w:pPr>
               <w:spacing w:after="20"/>
             </w:pPr>
-            <w:hyperlink r:id="rId76">
+            <w:hyperlink r:id="rId33">
               <w:r>
                 <w:rPr>
                   <w:color w:val="1D5FD1"/>
@@ -9409,7 +9385,7 @@
             <w:pPr>
               <w:spacing w:after="20"/>
             </w:pPr>
-            <w:hyperlink r:id="rId77">
+            <w:hyperlink r:id="rId19">
               <w:r>
                 <w:rPr>
                   <w:color w:val="1D5FD1"/>
@@ -9527,7 +9503,7 @@
             <w:pPr>
               <w:spacing w:after="20"/>
             </w:pPr>
-            <w:hyperlink r:id="rId78">
+            <w:hyperlink r:id="rId84">
               <w:r>
                 <w:rPr>
                   <w:color w:val="1D5FD1"/>
@@ -9645,7 +9621,7 @@
             <w:pPr>
               <w:spacing w:after="20"/>
             </w:pPr>
-            <w:hyperlink r:id="rId79">
+            <w:hyperlink r:id="rId85">
               <w:r>
                 <w:rPr>
                   <w:color w:val="1D5FD1"/>
@@ -9763,7 +9739,7 @@
             <w:pPr>
               <w:spacing w:after="20"/>
             </w:pPr>
-            <w:hyperlink r:id="rId80">
+            <w:hyperlink r:id="rId86">
               <w:r>
                 <w:rPr>
                   <w:color w:val="1D5FD1"/>
@@ -9881,7 +9857,7 @@
             <w:pPr>
               <w:spacing w:after="20"/>
             </w:pPr>
-            <w:hyperlink r:id="rId25">
+            <w:hyperlink r:id="rId87">
               <w:r>
                 <w:rPr>
                   <w:color w:val="1D5FD1"/>
@@ -9999,7 +9975,7 @@
             <w:pPr>
               <w:spacing w:after="20"/>
             </w:pPr>
-            <w:hyperlink r:id="rId81">
+            <w:hyperlink r:id="rId88">
               <w:r>
                 <w:rPr>
                   <w:color w:val="1D5FD1"/>
@@ -10117,7 +10093,7 @@
             <w:pPr>
               <w:spacing w:after="20"/>
             </w:pPr>
-            <w:hyperlink r:id="rId82">
+            <w:hyperlink r:id="rId89">
               <w:r>
                 <w:rPr>
                   <w:color w:val="1D5FD1"/>
@@ -10235,7 +10211,7 @@
             <w:pPr>
               <w:spacing w:after="20"/>
             </w:pPr>
-            <w:hyperlink r:id="rId83">
+            <w:hyperlink r:id="rId34">
               <w:r>
                 <w:rPr>
                   <w:color w:val="1D5FD1"/>
@@ -10353,7 +10329,7 @@
             <w:pPr>
               <w:spacing w:after="20"/>
             </w:pPr>
-            <w:hyperlink r:id="rId84">
+            <w:hyperlink r:id="rId90">
               <w:r>
                 <w:rPr>
                   <w:color w:val="1D5FD1"/>
@@ -10471,7 +10447,7 @@
             <w:pPr>
               <w:spacing w:after="20"/>
             </w:pPr>
-            <w:hyperlink r:id="rId85">
+            <w:hyperlink r:id="rId91">
               <w:r>
                 <w:rPr>
                   <w:color w:val="1D5FD1"/>
@@ -10589,7 +10565,7 @@
             <w:pPr>
               <w:spacing w:after="20"/>
             </w:pPr>
-            <w:hyperlink r:id="rId86">
+            <w:hyperlink r:id="rId92">
               <w:r>
                 <w:rPr>
                   <w:color w:val="1D5FD1"/>
@@ -10707,7 +10683,7 @@
             <w:pPr>
               <w:spacing w:after="20"/>
             </w:pPr>
-            <w:hyperlink r:id="rId87">
+            <w:hyperlink r:id="rId93">
               <w:r>
                 <w:rPr>
                   <w:color w:val="1D5FD1"/>
@@ -10825,7 +10801,7 @@
             <w:pPr>
               <w:spacing w:after="20"/>
             </w:pPr>
-            <w:hyperlink r:id="rId88">
+            <w:hyperlink r:id="rId94">
               <w:r>
                 <w:rPr>
                   <w:color w:val="1D5FD1"/>
@@ -10943,7 +10919,7 @@
             <w:pPr>
               <w:spacing w:after="20"/>
             </w:pPr>
-            <w:hyperlink r:id="rId89">
+            <w:hyperlink r:id="rId95">
               <w:r>
                 <w:rPr>
                   <w:color w:val="1D5FD1"/>
@@ -11061,7 +11037,7 @@
             <w:pPr>
               <w:spacing w:after="20"/>
             </w:pPr>
-            <w:hyperlink r:id="rId90">
+            <w:hyperlink r:id="rId96">
               <w:r>
                 <w:rPr>
                   <w:color w:val="1D5FD1"/>
@@ -11179,7 +11155,7 @@
             <w:pPr>
               <w:spacing w:after="20"/>
             </w:pPr>
-            <w:hyperlink r:id="rId91">
+            <w:hyperlink r:id="rId97">
               <w:r>
                 <w:rPr>
                   <w:color w:val="1D5FD1"/>
@@ -11297,7 +11273,7 @@
             <w:pPr>
               <w:spacing w:after="20"/>
             </w:pPr>
-            <w:hyperlink r:id="rId92">
+            <w:hyperlink r:id="rId98">
               <w:r>
                 <w:rPr>
                   <w:color w:val="1D5FD1"/>
@@ -11415,7 +11391,7 @@
             <w:pPr>
               <w:spacing w:after="20"/>
             </w:pPr>
-            <w:hyperlink r:id="rId93">
+            <w:hyperlink r:id="rId99">
               <w:r>
                 <w:rPr>
                   <w:color w:val="1D5FD1"/>
@@ -11533,7 +11509,7 @@
             <w:pPr>
               <w:spacing w:after="20"/>
             </w:pPr>
-            <w:hyperlink r:id="rId94">
+            <w:hyperlink r:id="rId100">
               <w:r>
                 <w:rPr>
                   <w:color w:val="1D5FD1"/>
@@ -11651,7 +11627,7 @@
             <w:pPr>
               <w:spacing w:after="20"/>
             </w:pPr>
-            <w:hyperlink r:id="rId95">
+            <w:hyperlink r:id="rId101">
               <w:r>
                 <w:rPr>
                   <w:color w:val="1D5FD1"/>
@@ -11769,7 +11745,7 @@
             <w:pPr>
               <w:spacing w:after="20"/>
             </w:pPr>
-            <w:hyperlink r:id="rId96">
+            <w:hyperlink r:id="rId102">
               <w:r>
                 <w:rPr>
                   <w:color w:val="1D5FD1"/>
@@ -11887,7 +11863,7 @@
             <w:pPr>
               <w:spacing w:after="20"/>
             </w:pPr>
-            <w:hyperlink r:id="rId97">
+            <w:hyperlink r:id="rId26">
               <w:r>
                 <w:rPr>
                   <w:color w:val="1D5FD1"/>
@@ -12005,7 +11981,7 @@
             <w:pPr>
               <w:spacing w:after="20"/>
             </w:pPr>
-            <w:hyperlink r:id="rId98">
+            <w:hyperlink r:id="rId103">
               <w:r>
                 <w:rPr>
                   <w:color w:val="1D5FD1"/>
@@ -12123,7 +12099,7 @@
             <w:pPr>
               <w:spacing w:after="20"/>
             </w:pPr>
-            <w:hyperlink r:id="rId99">
+            <w:hyperlink r:id="rId104">
               <w:r>
                 <w:rPr>
                   <w:color w:val="1D5FD1"/>
@@ -12241,7 +12217,7 @@
             <w:pPr>
               <w:spacing w:after="20"/>
             </w:pPr>
-            <w:hyperlink r:id="rId100">
+            <w:hyperlink r:id="rId105">
               <w:r>
                 <w:rPr>
                   <w:color w:val="1D5FD1"/>
@@ -12359,7 +12335,7 @@
             <w:pPr>
               <w:spacing w:after="20"/>
             </w:pPr>
-            <w:hyperlink r:id="rId101">
+            <w:hyperlink r:id="rId106">
               <w:r>
                 <w:rPr>
                   <w:color w:val="1D5FD1"/>
@@ -12477,7 +12453,7 @@
             <w:pPr>
               <w:spacing w:after="20"/>
             </w:pPr>
-            <w:hyperlink r:id="rId102">
+            <w:hyperlink r:id="rId107">
               <w:r>
                 <w:rPr>
                   <w:color w:val="1D5FD1"/>
@@ -12595,7 +12571,7 @@
             <w:pPr>
               <w:spacing w:after="20"/>
             </w:pPr>
-            <w:hyperlink r:id="rId103">
+            <w:hyperlink r:id="rId108">
               <w:r>
                 <w:rPr>
                   <w:color w:val="1D5FD1"/>
@@ -12713,7 +12689,7 @@
             <w:pPr>
               <w:spacing w:after="20"/>
             </w:pPr>
-            <w:hyperlink r:id="rId104">
+            <w:hyperlink r:id="rId109">
               <w:r>
                 <w:rPr>
                   <w:color w:val="1D5FD1"/>
@@ -12831,7 +12807,7 @@
             <w:pPr>
               <w:spacing w:after="20"/>
             </w:pPr>
-            <w:hyperlink r:id="rId105">
+            <w:hyperlink r:id="rId110">
               <w:r>
                 <w:rPr>
                   <w:color w:val="1D5FD1"/>
@@ -12949,7 +12925,7 @@
             <w:pPr>
               <w:spacing w:after="20"/>
             </w:pPr>
-            <w:hyperlink r:id="rId24">
+            <w:hyperlink r:id="rId111">
               <w:r>
                 <w:rPr>
                   <w:color w:val="1D5FD1"/>
@@ -13067,7 +13043,7 @@
             <w:pPr>
               <w:spacing w:after="20"/>
             </w:pPr>
-            <w:hyperlink r:id="rId106">
+            <w:hyperlink r:id="rId112">
               <w:r>
                 <w:rPr>
                   <w:color w:val="1D5FD1"/>
@@ -13185,7 +13161,7 @@
             <w:pPr>
               <w:spacing w:after="20"/>
             </w:pPr>
-            <w:hyperlink r:id="rId107">
+            <w:hyperlink r:id="rId113">
               <w:r>
                 <w:rPr>
                   <w:color w:val="1D5FD1"/>
@@ -13303,7 +13279,7 @@
             <w:pPr>
               <w:spacing w:after="20"/>
             </w:pPr>
-            <w:hyperlink r:id="rId108">
+            <w:hyperlink r:id="rId114">
               <w:r>
                 <w:rPr>
                   <w:color w:val="1D5FD1"/>
@@ -13421,7 +13397,7 @@
             <w:pPr>
               <w:spacing w:after="20"/>
             </w:pPr>
-            <w:hyperlink r:id="rId109">
+            <w:hyperlink r:id="rId115">
               <w:r>
                 <w:rPr>
                   <w:color w:val="1D5FD1"/>
@@ -13539,7 +13515,7 @@
             <w:pPr>
               <w:spacing w:after="20"/>
             </w:pPr>
-            <w:hyperlink r:id="rId110">
+            <w:hyperlink r:id="rId116">
               <w:r>
                 <w:rPr>
                   <w:color w:val="1D5FD1"/>
@@ -13657,7 +13633,7 @@
             <w:pPr>
               <w:spacing w:after="20"/>
             </w:pPr>
-            <w:hyperlink r:id="rId111">
+            <w:hyperlink r:id="rId117">
               <w:r>
                 <w:rPr>
                   <w:color w:val="1D5FD1"/>
@@ -13893,7 +13869,7 @@
             <w:pPr>
               <w:spacing w:after="20"/>
             </w:pPr>
-            <w:hyperlink r:id="rId112">
+            <w:hyperlink r:id="rId118">
               <w:r>
                 <w:rPr>
                   <w:color w:val="1D5FD1"/>
@@ -14011,7 +13987,7 @@
             <w:pPr>
               <w:spacing w:after="20"/>
             </w:pPr>
-            <w:hyperlink r:id="rId113">
+            <w:hyperlink r:id="rId119">
               <w:r>
                 <w:rPr>
                   <w:color w:val="1D5FD1"/>
@@ -14129,7 +14105,7 @@
             <w:pPr>
               <w:spacing w:after="20"/>
             </w:pPr>
-            <w:hyperlink r:id="rId114">
+            <w:hyperlink r:id="rId120">
               <w:r>
                 <w:rPr>
                   <w:color w:val="1D5FD1"/>
@@ -14247,7 +14223,7 @@
             <w:pPr>
               <w:spacing w:after="20"/>
             </w:pPr>
-            <w:hyperlink r:id="rId115">
+            <w:hyperlink r:id="rId121">
               <w:r>
                 <w:rPr>
                   <w:color w:val="1D5FD1"/>
@@ -14365,7 +14341,7 @@
             <w:pPr>
               <w:spacing w:after="20"/>
             </w:pPr>
-            <w:hyperlink r:id="rId116">
+            <w:hyperlink r:id="rId122">
               <w:r>
                 <w:rPr>
                   <w:color w:val="1D5FD1"/>
@@ -14483,7 +14459,7 @@
             <w:pPr>
               <w:spacing w:after="20"/>
             </w:pPr>
-            <w:hyperlink r:id="rId117">
+            <w:hyperlink r:id="rId123">
               <w:r>
                 <w:rPr>
                   <w:color w:val="1D5FD1"/>
@@ -14601,7 +14577,7 @@
             <w:pPr>
               <w:spacing w:after="20"/>
             </w:pPr>
-            <w:hyperlink r:id="rId118">
+            <w:hyperlink r:id="rId124">
               <w:r>
                 <w:rPr>
                   <w:color w:val="1D5FD1"/>
@@ -14719,7 +14695,7 @@
             <w:pPr>
               <w:spacing w:after="20"/>
             </w:pPr>
-            <w:hyperlink r:id="rId119">
+            <w:hyperlink r:id="rId125">
               <w:r>
                 <w:rPr>
                   <w:color w:val="1D5FD1"/>
@@ -14837,7 +14813,7 @@
             <w:pPr>
               <w:spacing w:after="20"/>
             </w:pPr>
-            <w:hyperlink r:id="rId120">
+            <w:hyperlink r:id="rId126">
               <w:r>
                 <w:rPr>
                   <w:color w:val="1D5FD1"/>
@@ -14955,7 +14931,7 @@
             <w:pPr>
               <w:spacing w:after="20"/>
             </w:pPr>
-            <w:hyperlink r:id="rId121">
+            <w:hyperlink r:id="rId127">
               <w:r>
                 <w:rPr>
                   <w:color w:val="1D5FD1"/>
@@ -15073,7 +15049,7 @@
             <w:pPr>
               <w:spacing w:after="20"/>
             </w:pPr>
-            <w:hyperlink r:id="rId122">
+            <w:hyperlink r:id="rId128">
               <w:r>
                 <w:rPr>
                   <w:color w:val="1D5FD1"/>
@@ -15191,7 +15167,7 @@
             <w:pPr>
               <w:spacing w:after="20"/>
             </w:pPr>
-            <w:hyperlink r:id="rId123">
+            <w:hyperlink r:id="rId129">
               <w:r>
                 <w:rPr>
                   <w:color w:val="1D5FD1"/>
@@ -15309,7 +15285,7 @@
             <w:pPr>
               <w:spacing w:after="20"/>
             </w:pPr>
-            <w:hyperlink r:id="rId124">
+            <w:hyperlink r:id="rId130">
               <w:r>
                 <w:rPr>
                   <w:color w:val="1D5FD1"/>
@@ -15427,7 +15403,7 @@
             <w:pPr>
               <w:spacing w:after="20"/>
             </w:pPr>
-            <w:hyperlink r:id="rId125">
+            <w:hyperlink r:id="rId131">
               <w:r>
                 <w:rPr>
                   <w:color w:val="1D5FD1"/>
@@ -15545,7 +15521,7 @@
             <w:pPr>
               <w:spacing w:after="20"/>
             </w:pPr>
-            <w:hyperlink r:id="rId126">
+            <w:hyperlink r:id="rId132">
               <w:r>
                 <w:rPr>
                   <w:color w:val="1D5FD1"/>
@@ -15663,7 +15639,7 @@
             <w:pPr>
               <w:spacing w:after="20"/>
             </w:pPr>
-            <w:hyperlink r:id="rId127">
+            <w:hyperlink r:id="rId133">
               <w:r>
                 <w:rPr>
                   <w:color w:val="1D5FD1"/>
@@ -15781,7 +15757,7 @@
             <w:pPr>
               <w:spacing w:after="20"/>
             </w:pPr>
-            <w:hyperlink r:id="rId128">
+            <w:hyperlink r:id="rId134">
               <w:r>
                 <w:rPr>
                   <w:color w:val="1D5FD1"/>
@@ -15899,7 +15875,7 @@
             <w:pPr>
               <w:spacing w:after="20"/>
             </w:pPr>
-            <w:hyperlink r:id="rId129">
+            <w:hyperlink r:id="rId23">
               <w:r>
                 <w:rPr>
                   <w:color w:val="1D5FD1"/>
@@ -16017,7 +15993,7 @@
             <w:pPr>
               <w:spacing w:after="20"/>
             </w:pPr>
-            <w:hyperlink r:id="rId130">
+            <w:hyperlink r:id="rId135">
               <w:r>
                 <w:rPr>
                   <w:color w:val="1D5FD1"/>
@@ -16135,7 +16111,7 @@
             <w:pPr>
               <w:spacing w:after="20"/>
             </w:pPr>
-            <w:hyperlink r:id="rId131">
+            <w:hyperlink r:id="rId136">
               <w:r>
                 <w:rPr>
                   <w:color w:val="1D5FD1"/>
@@ -16253,7 +16229,7 @@
             <w:pPr>
               <w:spacing w:after="20"/>
             </w:pPr>
-            <w:hyperlink r:id="rId132">
+            <w:hyperlink r:id="rId137">
               <w:r>
                 <w:rPr>
                   <w:color w:val="1D5FD1"/>
@@ -16371,7 +16347,7 @@
             <w:pPr>
               <w:spacing w:after="20"/>
             </w:pPr>
-            <w:hyperlink r:id="rId133">
+            <w:hyperlink r:id="rId138">
               <w:r>
                 <w:rPr>
                   <w:color w:val="1D5FD1"/>
@@ -16489,7 +16465,7 @@
             <w:pPr>
               <w:spacing w:after="20"/>
             </w:pPr>
-            <w:hyperlink r:id="rId134">
+            <w:hyperlink r:id="rId139">
               <w:r>
                 <w:rPr>
                   <w:color w:val="1D5FD1"/>
@@ -16607,7 +16583,7 @@
             <w:pPr>
               <w:spacing w:after="20"/>
             </w:pPr>
-            <w:hyperlink r:id="rId22">
+            <w:hyperlink r:id="rId140">
               <w:r>
                 <w:rPr>
                   <w:color w:val="1D5FD1"/>

</xml_diff>

<commit_message>
Publish structured W30 weekly report for July 22
</commit_message>
<xml_diff>
--- a/public/investor-downloads/weekly/2026-W30/AI-Institute-Weekly-Report-2026-W30-zh.docx
+++ b/public/investor-downloads/weekly/2026-W30/AI-Institute-Weekly-Report-2026-W30-zh.docx
@@ -64,7 +64,7 @@
           <w:color w:val="5E6268"/>
           <w:sz w:val="28"/>
         </w:rPr>
-        <w:t>2026-W30 AI Institute 周度投资研究全景</w:t>
+        <w:t>2026-W30｜AI 需求未逆转，但组合重心转向可交付性</w:t>
       </w:r>
     </w:p>
     <w:tbl>
@@ -218,7 +218,7 @@
                 <w:color w:val="111111"/>
                 <w:sz w:val="19"/>
               </w:rPr>
-              <w:t>rolling · REV 7</w:t>
+              <w:t>rolling · REV 8</w:t>
             </w:r>
           </w:p>
         </w:tc>
@@ -261,7 +261,7 @@
                 <w:color w:val="111111"/>
                 <w:sz w:val="19"/>
               </w:rPr>
-              <w:t>pass_with_warnings · 67</w:t>
+              <w:t>pass_with_warnings · 83</w:t>
             </w:r>
           </w:p>
         </w:tc>
@@ -328,7 +328,7 @@
                 <w:color w:val="111111"/>
                 <w:sz w:val="24"/>
               </w:rPr>
-              <w:t>本周的核心不是追逐研究热度，而是把 AI 电力/电网设备 与 A股半导体/两融负 Gamma 拆成可执行、可证伪的赛道和标的判断。</w:t>
+              <w:t>本周没有可确认的周环比动作翻转；决策组合仍是“AI 算力半导体 TRIM、其余六条主线 HOLD”，核心变化是从需求叙事转向订单、通电与现金流验证。</w:t>
             </w:r>
           </w:p>
         </w:tc>
@@ -390,7 +390,7 @@
           <w:color w:val="111111"/>
           <w:sz w:val="22"/>
         </w:rPr>
-        <w:t>Hyperscaler Behind-the-Meter (BTM) 核电与天然气自备电站替代方案对电网排队瓶颈的破解与 Capex... 与 2026-07-22 A股策略卡：光通信相对GPU链的定价与拥挤度 构成本周最强的证据主轴，而 2026-07-22 云巨头AI Capex分化与电力瓶颈对半导体算力链订单兑现的传导验证报告 提供了必要的反向约束。公开研究合约显示，优先级正在从宽泛主题向可交付、可验证的产业链环节集中；组合层面应先读取 TRIM AI 算力半导体、HOLD A股红利/硬科技杠铃、HOLD AI 再通胀/利率敏感资产，再用后续订单、交付、政策与市场数据确认。与 2026-W29 相比，本周有 3 项操作变化、2 项赛道立场变化。</w:t>
+        <w:t>决策面先行：所有 deterministic calls 的 changedFrom 均为空，不能据此宣称相较 W29 已发生动作翻转；当前明确的组合排序是降低 AI 算力半导体集中度，同时对 Mag7、CPO、A股硬科技、红利/硬科技杠铃、AI 再通胀和中国权益流动性维持观察。证据面真正改变的是验证标准：AI 需求及先进封装订单仍获支持，但云厂商 Capex 分化、电力并网约束和库存倒灌风险使“需求强等于盈利普涨”不再成立。A股方面，产业订单与主题逻辑尚在，融资、ETF、北向资金和成分股宽度却仍需同向确认，因此研究密度不能替代交易确认。本期 marketQuoteRows 为 0，以下不陈述最新价格、涨跌幅或实际资金流。</w:t>
       </w:r>
     </w:p>
     <w:p>
@@ -404,7 +404,7 @@
           <w:color w:val="5E6268"/>
           <w:sz w:val="22"/>
         </w:rPr>
-        <w:t>周报的价值不在于给出更多观点，而在于留下可复查的决策、证据和证伪条件。下一周若触发器没有出现，应降低置信度，而不是用新的叙事延长旧判断。</w:t>
+        <w:t>2026-W30 的关键不是再确认一次“AI 需求很强”，而是承认需求、盈利和可交付性已经分离。组合因此应继续降低单一加速器集中度，对 Mag7、CPO 和A股硬科技保持条件式 HOLD，并只在订单、通电、现金流以及资金与宽度信号共同改善时启用新增风险预算。电网瓶颈仍是最强产业线索，但“瓶颈即收益”必须接受交付、合同和资本效率验证。本报告未使用最新价格、涨跌幅或资金流数据；这是研究综合，不构成投资建议，也不承诺收益。</w:t>
       </w:r>
     </w:p>
     <w:p>
@@ -1428,7 +1428,7 @@
         <w:keepNext/>
       </w:pPr>
       <w:r>
-        <w:t>01 · TRIM AI 算力半导体：NAND盈利弹性由价格与产品结构主导，而非单纯出货增长</w:t>
+        <w:t>01 · TRIM｜AI 算力半导体</w:t>
       </w:r>
     </w:p>
     <w:p>
@@ -1442,7 +1442,7 @@
           <w:color w:val="111111"/>
           <w:sz w:val="22"/>
         </w:rPr>
-        <w:t>AI算力需求仍强，但收益正在从单一加速器向存储、定制芯片和云平台扩散；配置应侧重订单、产品结构和自由现金流，控制估值集中风险。 风险雷达：降权跟踪：适合作为风险雷达，不适合作为无条件加仓理由。 本周证据账本把该判断连接到 5 份公开报告；其有效性仍取决于“CPI/PCE 与油价是否重新推高实际利率”。</w:t>
+        <w:t>决策驱动原文：“AI算力需求仍强，但收益正在从单一加速器向存储、定制芯片和云平台扩散；配置应侧重订单、产品结构和自由现金流，控制估值集中风险。 风险雷达：降权跟踪：适合作为风险雷达，不适合作为无条件加仓理由。”本周支持证据确认先进封装与设备订单仍有韧性，挑战证据则把约束从芯片需求推进到云厂商 Capex 分化、电力接入和有效产能利用率。因而 TRIM 针对的是集中度和兑现风险，而不是把 AI 需求判断改写为衰退。</w:t>
       </w:r>
     </w:p>
     <w:tbl>
@@ -1518,7 +1518,7 @@
                 <w:color w:val="111111"/>
                 <w:sz w:val="18"/>
               </w:rPr>
-              <w:t>在 AI 算力半导体 内优先保留证据与兑现路径清晰的标的，并按证伪条件控制暴露。</w:t>
+              <w:t>压低单一加速器暴露，保留能够用订单、产品结构和自由现金流验证的存储、定制芯片及平台环节；在 NAND 价格与供给纪律没有新增修复证据前，不把更广泛的 AI 研究热度当作原 thesis 的盈利确认。</w:t>
             </w:r>
           </w:p>
         </w:tc>
@@ -1653,7 +1653,7 @@
         <w:keepNext/>
       </w:pPr>
       <w:r>
-        <w:t>02 · HOLD A股红利/硬科技杠铃：A 股红利与硬科技杠铃仍是政策、利率和风险偏好的组合表达</w:t>
+        <w:t>02 · HOLD｜A股红利/硬科技杠铃</w:t>
       </w:r>
     </w:p>
     <w:p>
@@ -1667,7 +1667,7 @@
           <w:color w:val="111111"/>
           <w:sz w:val="22"/>
         </w:rPr>
-        <w:t>观察等待：先放入观察池，只在证据密度和价格确认同时改善时进入组合。 本周证据账本把该判断连接到 5 份公开报告；其有效性仍取决于“融资余额、ETF 申赎和北向资金是否同向”。</w:t>
+        <w:t>决策驱动原文：“观察等待：先放入观察池，只在证据密度和价格确认同时改善时进入组合。”红利腿仍有现金流与行业再平衡依据，但银行 NIM 压力要求从笼统高股息转向非银红利内部筛选；硬科技腿则有产业证据、缺少资金与价格的同步确认。两端都能提供组合功能，却都不支持无条件扩仓。</w:t>
       </w:r>
     </w:p>
     <w:tbl>
@@ -1743,7 +1743,7 @@
                 <w:color w:val="111111"/>
                 <w:sz w:val="18"/>
               </w:rPr>
-              <w:t>在 A股红利/硬科技杠铃 内优先保留证据与兑现路径清晰的标的，并按证伪条件控制暴露。</w:t>
+              <w:t>维持杠铃观察框架：红利腿优先核对水电、电网、运营商和煤炭的现金流安全垫，硬科技腿等待订单与融资余额、ETF 申赎、北向资金共振。由于本期没有市场报价数据，不认定任一腿已完成价格确认。</w:t>
             </w:r>
           </w:p>
         </w:tc>
@@ -1878,7 +1878,7 @@
         <w:keepNext/>
       </w:pPr>
       <w:r>
-        <w:t>03 · HOLD AI 再通胀/利率敏感资产：AI 资本开支通过能源、设备和利率进入通胀定价</w:t>
+        <w:t>03 · HOLD｜AI 再通胀/利率敏感资产</w:t>
       </w:r>
     </w:p>
     <w:p>
@@ -1892,7 +1892,7 @@
           <w:color w:val="111111"/>
           <w:sz w:val="22"/>
         </w:rPr>
-        <w:t>观察等待：先放入观察池，只在证据密度和价格确认同时改善时进入组合。 本周证据账本把该判断连接到 5 份公开报告；其有效性仍取决于“CPI/PCE 与油价是否重新推高实际利率”。</w:t>
+        <w:t>决策驱动原文：“观察等待：先放入观察池，只在证据密度和价格确认同时改善时进入组合。”AI 电力、设备与上游材料约束强化了成本传导假设，但油价和通胀究竟形成能源现金流机会，还是通过实际利率压制长久期资产，仍是双向结果，当前不足以升级为单边配置。</w:t>
       </w:r>
     </w:p>
     <w:tbl>
@@ -1968,7 +1968,7 @@
                 <w:color w:val="111111"/>
                 <w:sz w:val="18"/>
               </w:rPr>
-              <w:t>在 AI 再通胀/利率敏感资产 内优先保留证据与兑现路径清晰的标的，并按证伪条件控制暴露。</w:t>
+              <w:t>维持 XLE、XLU、TLT、GLD、JPM、NEE 等跨资产观察，而非把再通胀研究直接映射成方向仓位；下一步以 CPI/PCE、油价及实际利率的共同方向决定久期和能源风险预算。</w:t>
             </w:r>
           </w:p>
         </w:tc>
@@ -2103,7 +2103,7 @@
         <w:keepNext/>
       </w:pPr>
       <w:r>
-        <w:t>04 · HOLD Mag7 AI 平台再分层：Mag7 在 AI 时代从平台垄断转向基础设施再分层</w:t>
+        <w:t>04 · HOLD｜Mag7 AI 平台再分层</w:t>
       </w:r>
     </w:p>
     <w:p>
@@ -2117,7 +2117,7 @@
           <w:color w:val="111111"/>
           <w:sz w:val="22"/>
         </w:rPr>
-        <w:t>分歧主线：配对验证：这是有投资含义但证据分歧很高的主线，更适合配对验证、分批试错和严格证伪。 本周证据账本把该判断连接到 5 份公开报告；其有效性仍取决于“云厂商 capex 指引是否继续上修”。</w:t>
+        <w:t>决策驱动原文：“分歧主线：配对验证：这是有投资含义但证据分歧很高的主线，更适合配对验证、分批试错和严格证伪。”AI Capex 延续支持基础设施平台的收入机会，但云厂商投入节奏、上游金属成本、电力可得性和软件变现效率出现分化，不能再把 Mag7 作为同质化受益篮子。</w:t>
       </w:r>
     </w:p>
     <w:tbl>
@@ -2193,7 +2193,7 @@
                 <w:color w:val="111111"/>
                 <w:sz w:val="18"/>
               </w:rPr>
-              <w:t>在 Mag7 AI 平台再分层 内优先保留证据与兑现路径清晰的标的，并按证伪条件控制暴露。</w:t>
+              <w:t>继续做平台内部配对验证：比较 Capex 承担者与直接受益者、已锁定电力与受并网约束者、基础设施收入与软件变现。未见 Capex 指引和自由现金流同时改善前，不扩大同方向平台风险。</w:t>
             </w:r>
           </w:p>
         </w:tc>
@@ -2264,7 +2264,7 @@
       <w:r>
         <w:t>证据：</w:t>
       </w:r>
-      <w:hyperlink r:id="rId21">
+      <w:hyperlink r:id="rId19">
         <w:r>
           <w:rPr>
             <w:color w:val="1D5FD1"/>
@@ -2279,7 +2279,7 @@
       <w:r>
         <w:t xml:space="preserve"> · </w:t>
       </w:r>
-      <w:hyperlink r:id="rId19">
+      <w:hyperlink r:id="rId31">
         <w:r>
           <w:rPr>
             <w:color w:val="1D5FD1"/>
@@ -2294,7 +2294,7 @@
       <w:r>
         <w:t xml:space="preserve"> · </w:t>
       </w:r>
-      <w:hyperlink r:id="rId31">
+      <w:hyperlink r:id="rId32">
         <w:r>
           <w:rPr>
             <w:color w:val="1D5FD1"/>
@@ -2309,7 +2309,7 @@
       <w:r>
         <w:t xml:space="preserve"> · </w:t>
       </w:r>
-      <w:hyperlink r:id="rId32">
+      <w:hyperlink r:id="rId33">
         <w:r>
           <w:rPr>
             <w:color w:val="1D5FD1"/>
@@ -2328,7 +2328,7 @@
         <w:keepNext/>
       </w:pPr>
       <w:r>
-        <w:t>05 · HOLD A股硬科技/科创50：A 股硬科技与科创50的复苏需要订单、融资盘和指数结构共振</w:t>
+        <w:t>05 · HOLD｜A股硬科技/科创50</w:t>
       </w:r>
     </w:p>
     <w:p>
@@ -2342,7 +2342,7 @@
           <w:color w:val="111111"/>
           <w:sz w:val="22"/>
         </w:rPr>
-        <w:t>分歧主线：配对验证：这是有投资含义但证据分歧很高的主线，更适合配对验证、分批试错和严格证伪。 本周证据账本把该判断连接到 5 份公开报告；其有效性仍取决于“融资余额、ETF 申赎和北向资金是否同向”。</w:t>
+        <w:t>决策驱动原文：“分歧主线：配对验证：这是有投资含义但证据分歧很高的主线，更适合配对验证、分批试错和严格证伪。”本周先进封装、半导体设备和部分光通信订单逻辑提供支持，但 standing thesis 要求订单、融资盘和指数结构共振；现有材料同时提示被动配置、融资集中和拥挤风险，因此仅凭产业证据尚不能完成复苏确认。</w:t>
       </w:r>
     </w:p>
     <w:tbl>
@@ -2418,7 +2418,7 @@
                 <w:color w:val="111111"/>
                 <w:sz w:val="18"/>
               </w:rPr>
-              <w:t>在 A股硬科技/科创50 内优先保留证据与兑现路径清晰的标的，并按证伪条件控制暴露。</w:t>
+              <w:t>保持精选而非指数化追逐：优先跟踪订单和业绩兑现度较高的设备、封装与互联环节，同时把融资余额、ETF 申赎、北向资金和成分股宽度设为再入场门槛。</w:t>
             </w:r>
           </w:p>
         </w:tc>
@@ -2489,7 +2489,7 @@
       <w:r>
         <w:t>证据：</w:t>
       </w:r>
-      <w:hyperlink r:id="rId33">
+      <w:hyperlink r:id="rId34">
         <w:r>
           <w:rPr>
             <w:color w:val="1D5FD1"/>
@@ -2504,7 +2504,7 @@
       <w:r>
         <w:t xml:space="preserve"> · </w:t>
       </w:r>
-      <w:hyperlink r:id="rId34">
+      <w:hyperlink r:id="rId35">
         <w:r>
           <w:rPr>
             <w:color w:val="1D5FD1"/>
@@ -2519,7 +2519,7 @@
       <w:r>
         <w:t xml:space="preserve"> · </w:t>
       </w:r>
-      <w:hyperlink r:id="rId35">
+      <w:hyperlink r:id="rId36">
         <w:r>
           <w:rPr>
             <w:color w:val="1D5FD1"/>
@@ -2534,7 +2534,7 @@
       <w:r>
         <w:t xml:space="preserve"> · </w:t>
       </w:r>
-      <w:hyperlink r:id="rId36">
+      <w:hyperlink r:id="rId37">
         <w:r>
           <w:rPr>
             <w:color w:val="1D5FD1"/>
@@ -2553,7 +2553,7 @@
         <w:keepNext/>
       </w:pPr>
       <w:r>
-        <w:t>06 · HOLD CPO/光模块/高速互联：CPO、光互联与铜连接决定 AI 集群内部租金迁移</w:t>
+        <w:t>06 · HOLD｜CPO/光模块/高速互联</w:t>
       </w:r>
     </w:p>
     <w:p>
@@ -2567,7 +2567,7 @@
           <w:color w:val="111111"/>
           <w:sz w:val="22"/>
         </w:rPr>
-        <w:t>观察等待：先放入观察池，只在证据密度和价格确认同时改善时进入组合。 本周证据账本把该判断连接到 5 份公开报告；其有效性仍取决于“云厂商 capex 指引是否继续上修”。</w:t>
+        <w:t>决策驱动原文：“观察等待：先放入观察池，只在证据密度和价格确认同时改善时进入组合。”Capex 从单一加速器向网络、交换和光互联迁移，支持集群内部租金再分配；但 A股光通信交易结构的集中度风险上升，而且该 thesis 当前分析师覆盖为零，证据广度不足以消除拥挤和供应链约束。</w:t>
       </w:r>
     </w:p>
     <w:tbl>
@@ -2643,7 +2643,7 @@
                 <w:color w:val="111111"/>
                 <w:sz w:val="18"/>
               </w:rPr>
-              <w:t>在 CPO/光模块/高速互联 内优先保留证据与兑现路径清晰的标的，并按证伪条件控制暴露。</w:t>
+              <w:t>保留 AVGO、MRVL、COHR、LITE、300308.SZ、300394.SZ 等观察篮子，但只在云厂商 Capex、厂商订单与利润兑现、交易宽度共同改善时试错；在此之前不以产业方向正确替代买点确认。</w:t>
             </w:r>
           </w:p>
         </w:tc>
@@ -2714,7 +2714,7 @@
       <w:r>
         <w:t>证据：</w:t>
       </w:r>
-      <w:hyperlink r:id="rId33">
+      <w:hyperlink r:id="rId38">
         <w:r>
           <w:rPr>
             <w:color w:val="1D5FD1"/>
@@ -2729,7 +2729,7 @@
       <w:r>
         <w:t xml:space="preserve"> · </w:t>
       </w:r>
-      <w:hyperlink r:id="rId34">
+      <w:hyperlink r:id="rId39">
         <w:r>
           <w:rPr>
             <w:color w:val="1D5FD1"/>
@@ -2744,7 +2744,7 @@
       <w:r>
         <w:t xml:space="preserve"> · </w:t>
       </w:r>
-      <w:hyperlink r:id="rId35">
+      <w:hyperlink r:id="rId40">
         <w:r>
           <w:rPr>
             <w:color w:val="1D5FD1"/>
@@ -2759,7 +2759,217 @@
       <w:r>
         <w:t xml:space="preserve"> · </w:t>
       </w:r>
-      <w:hyperlink r:id="rId37">
+      <w:hyperlink r:id="rId41">
+        <w:r>
+          <w:rPr>
+            <w:color w:val="1D5FD1"/>
+            <w:u w:val="single"/>
+            <w:sz w:val="17"/>
+            <w:szCs w:val="17"/>
+            <w:rFonts w:ascii="Calibri" w:hAnsi="Calibri" w:eastAsia="Hiragino Sans GB"/>
+          </w:rPr>
+          <w:t>对应 Thesis</w:t>
+        </w:r>
+      </w:hyperlink>
+    </w:p>
+    <w:p>
+      <w:pPr>
+        <w:pStyle w:val="Heading2"/>
+        <w:keepNext/>
+      </w:pPr>
+      <w:r>
+        <w:t>07 · HOLD｜中国权益流动性</w:t>
+      </w:r>
+    </w:p>
+    <w:p>
+      <w:pPr>
+        <w:keepLines/>
+      </w:pPr>
+      <w:r>
+        <w:rPr>
+          <w:rFonts w:ascii="Calibri" w:hAnsi="Calibri" w:eastAsia="Hiragino Sans GB"/>
+          <w:b w:val="0"/>
+          <w:color w:val="111111"/>
+          <w:sz w:val="22"/>
+        </w:rPr>
+        <w:t>决策驱动原文：“观察等待：先放入观察池，只在证据密度和价格确认同时改善时进入组合。”standing thesis 强调政策、流动性与风险偏好共同驱动；本周证据显示地产企稳仍窄，尚不足以证明广谱风险偏好修复，而该 call 只有两条直接证据，结论应保持克制。</w:t>
+      </w:r>
+    </w:p>
+    <w:tbl>
+      <w:tblPr>
+        <w:tblW w:type="dxa" w:w="9360"/>
+        <w:jc w:val="left"/>
+        <w:tblLayout w:type="fixed"/>
+        <w:tblLook w:firstColumn="1" w:firstRow="1" w:lastColumn="0" w:lastRow="0" w:noHBand="0" w:noVBand="1" w:val="04A0"/>
+        <w:tblInd w:w="120" w:type="dxa"/>
+        <w:tblBorders>
+          <w:top w:val="single" w:sz="4" w:color="C8CDD3"/>
+          <w:left w:val="single" w:sz="4" w:color="C8CDD3"/>
+          <w:bottom w:val="single" w:sz="4" w:color="C8CDD3"/>
+          <w:right w:val="single" w:sz="4" w:color="C8CDD3"/>
+          <w:insideH w:val="single" w:sz="4" w:color="C8CDD3"/>
+          <w:insideV w:val="single" w:sz="4" w:color="C8CDD3"/>
+        </w:tblBorders>
+      </w:tblPr>
+      <w:tblGrid>
+        <w:gridCol w:w="1500"/>
+        <w:gridCol w:w="7860"/>
+      </w:tblGrid>
+      <w:tr>
+        <w:trPr>
+          <w:cantSplit/>
+        </w:trPr>
+        <w:tc>
+          <w:tcPr>
+            <w:tcW w:type="dxa" w:w="1500"/>
+            <w:tcMar>
+              <w:top w:w="80" w:type="dxa"/>
+              <w:bottom w:w="80" w:type="dxa"/>
+              <w:start w:w="120" w:type="dxa"/>
+              <w:end w:w="120" w:type="dxa"/>
+            </w:tcMar>
+            <w:vAlign w:val="top"/>
+            <w:shd w:fill="F2F4F7"/>
+          </w:tcPr>
+          <w:p>
+            <w:pPr>
+              <w:spacing w:before="0" w:after="0" w:line="252" w:lineRule="auto"/>
+            </w:pPr>
+            <w:r>
+              <w:rPr>
+                <w:rFonts w:ascii="Calibri" w:hAnsi="Calibri" w:eastAsia="Hiragino Sans GB"/>
+                <w:b/>
+                <w:color w:val="18864B"/>
+                <w:sz w:val="17"/>
+              </w:rPr>
+              <w:t>组合含义</w:t>
+            </w:r>
+          </w:p>
+        </w:tc>
+        <w:tc>
+          <w:tcPr>
+            <w:tcW w:type="dxa" w:w="7860"/>
+            <w:tcMar>
+              <w:top w:w="80" w:type="dxa"/>
+              <w:bottom w:w="80" w:type="dxa"/>
+              <w:start w:w="120" w:type="dxa"/>
+              <w:end w:w="120" w:type="dxa"/>
+            </w:tcMar>
+            <w:vAlign w:val="top"/>
+          </w:tcPr>
+          <w:p>
+            <w:pPr>
+              <w:spacing w:before="0" w:after="0" w:line="252" w:lineRule="auto"/>
+            </w:pPr>
+            <w:r>
+              <w:rPr>
+                <w:rFonts w:ascii="Calibri" w:hAnsi="Calibri" w:eastAsia="Hiragino Sans GB"/>
+                <w:b w:val="0"/>
+                <w:color w:val="111111"/>
+                <w:sz w:val="18"/>
+              </w:rPr>
+              <w:t>继续观察 510300.SH、159915.SZ、2800.HK、0700.HK、9988.HK 等宽基与平台资产的流动性传导，但需等待 ETF 申赎、期权伽马和尾盘流动性形成可重复信号，不把政策研究密度写成资金已经改善。</w:t>
+            </w:r>
+          </w:p>
+        </w:tc>
+      </w:tr>
+      <w:tr>
+        <w:trPr>
+          <w:cantSplit/>
+        </w:trPr>
+        <w:tc>
+          <w:tcPr>
+            <w:tcW w:type="dxa" w:w="1500"/>
+            <w:tcMar>
+              <w:top w:w="80" w:type="dxa"/>
+              <w:bottom w:w="80" w:type="dxa"/>
+              <w:start w:w="120" w:type="dxa"/>
+              <w:end w:w="120" w:type="dxa"/>
+            </w:tcMar>
+            <w:vAlign w:val="top"/>
+            <w:shd w:fill="F2F4F7"/>
+          </w:tcPr>
+          <w:p>
+            <w:pPr>
+              <w:spacing w:before="0" w:after="0" w:line="252" w:lineRule="auto"/>
+            </w:pPr>
+            <w:r>
+              <w:rPr>
+                <w:rFonts w:ascii="Calibri" w:hAnsi="Calibri" w:eastAsia="Hiragino Sans GB"/>
+                <w:b/>
+                <w:color w:val="C92A2A"/>
+                <w:sz w:val="17"/>
+              </w:rPr>
+              <w:t>证伪条件</w:t>
+            </w:r>
+          </w:p>
+        </w:tc>
+        <w:tc>
+          <w:tcPr>
+            <w:tcW w:type="dxa" w:w="7860"/>
+            <w:tcMar>
+              <w:top w:w="80" w:type="dxa"/>
+              <w:bottom w:w="80" w:type="dxa"/>
+              <w:start w:w="120" w:type="dxa"/>
+              <w:end w:w="120" w:type="dxa"/>
+            </w:tcMar>
+            <w:vAlign w:val="top"/>
+          </w:tcPr>
+          <w:p>
+            <w:pPr>
+              <w:spacing w:before="0" w:after="0" w:line="252" w:lineRule="auto"/>
+            </w:pPr>
+            <w:r>
+              <w:rPr>
+                <w:rFonts w:ascii="Calibri" w:hAnsi="Calibri" w:eastAsia="Hiragino Sans GB"/>
+                <w:b w:val="0"/>
+                <w:color w:val="111111"/>
+                <w:sz w:val="18"/>
+              </w:rPr>
+              <w:t>风险事件继续高于支持事件，且最新证据没有修复。</w:t>
+            </w:r>
+          </w:p>
+        </w:tc>
+      </w:tr>
+    </w:tbl>
+    <w:p>
+      <w:pPr>
+        <w:pStyle w:val="TableCitation"/>
+      </w:pPr>
+      <w:r>
+        <w:t>证据：</w:t>
+      </w:r>
+      <w:hyperlink r:id="rId42">
+        <w:r>
+          <w:rPr>
+            <w:color w:val="1D5FD1"/>
+            <w:u w:val="single"/>
+            <w:sz w:val="17"/>
+            <w:szCs w:val="17"/>
+            <w:rFonts w:ascii="Calibri" w:hAnsi="Calibri" w:eastAsia="Hiragino Sans GB"/>
+          </w:rPr>
+          <w:t>R1</w:t>
+        </w:r>
+      </w:hyperlink>
+      <w:r>
+        <w:t xml:space="preserve"> · </w:t>
+      </w:r>
+      <w:hyperlink r:id="rId43">
+        <w:r>
+          <w:rPr>
+            <w:color w:val="1D5FD1"/>
+            <w:u w:val="single"/>
+            <w:sz w:val="17"/>
+            <w:szCs w:val="17"/>
+            <w:rFonts w:ascii="Calibri" w:hAnsi="Calibri" w:eastAsia="Hiragino Sans GB"/>
+          </w:rPr>
+          <w:t>R2</w:t>
+        </w:r>
+      </w:hyperlink>
+      <w:r>
+        <w:t xml:space="preserve"> · </w:t>
+      </w:r>
+      <w:hyperlink r:id="rId44">
         <w:r>
           <w:rPr>
             <w:color w:val="1D5FD1"/>
@@ -2791,7 +3001,7 @@
           <w:color w:val="D85B16"/>
           <w:sz w:val="18"/>
         </w:rPr>
-        <w:t xml:space="preserve">01  SPLIT  </w:t>
+        <w:t xml:space="preserve">01  WEAKENED  </w:t>
       </w:r>
       <w:r>
         <w:rPr>
@@ -2800,7 +3010,7 @@
           <w:color w:val="111111"/>
           <w:sz w:val="22"/>
         </w:rPr>
-        <w:t>主线进一步集中到 A股红利/硬科技杠铃</w:t>
+        <w:t>AI 半导体：验证重心从需求扩张转向盈利与交付质量</w:t>
       </w:r>
     </w:p>
     <w:p>
@@ -2814,7 +3024,7 @@
           <w:color w:val="111111"/>
           <w:sz w:val="22"/>
         </w:rPr>
-        <w:t>赛道：A股红利/硬科技杠铃。候选观察标的：510880.SH, 601398.SH, 600900.SH, 601088.SH, 600941.SH, 588000.SH, 688981.SH。当前共有 40 条证据、2 位分析师和 6 条风险信号指向该判断；主导链条为 宏观通胀传导。该主题应作为可跟踪投资假设，而不是孤立结论。 本周新增 8 条主线事件，其中支持 7 条、风险 1 条；当前组合含义是 先放入观察池，只在证据密度和价格确认同时改善时进入组合。</w:t>
+        <w:t>W29 标记可用，但 packet 未给出其逐项正文，且本周 call 的 changedFrom 为空，因此不能宣称动作发生翻转。相对 standing thesis“盈利弹性由 NAND 价格与产品结构主导”，本周新增证据更多支持广义 AI 订单，同时集中提示云厂商 Capex 分化、电力接入和库存倒灌；这些证据没有修复 NAND 供给纪律和价格反转风险，反而强化 TRIM 的必要性。</w:t>
       </w:r>
     </w:p>
     <w:p>
@@ -2824,7 +3034,271 @@
       <w:r>
         <w:t>关联标的：</w:t>
       </w:r>
-      <w:hyperlink r:id="rId38">
+      <w:hyperlink r:id="rId45">
+        <w:r>
+          <w:rPr>
+            <w:color w:val="1D5FD1"/>
+            <w:u w:val="single"/>
+            <w:sz w:val="17"/>
+            <w:szCs w:val="17"/>
+            <w:rFonts w:ascii="Calibri" w:hAnsi="Calibri" w:eastAsia="Hiragino Sans GB"/>
+          </w:rPr>
+          <w:t>NVDA</w:t>
+        </w:r>
+      </w:hyperlink>
+      <w:r>
+        <w:t xml:space="preserve"> · </w:t>
+      </w:r>
+      <w:hyperlink r:id="rId46">
+        <w:r>
+          <w:rPr>
+            <w:color w:val="1D5FD1"/>
+            <w:u w:val="single"/>
+            <w:sz w:val="17"/>
+            <w:szCs w:val="17"/>
+            <w:rFonts w:ascii="Calibri" w:hAnsi="Calibri" w:eastAsia="Hiragino Sans GB"/>
+          </w:rPr>
+          <w:t>TSM</w:t>
+        </w:r>
+      </w:hyperlink>
+      <w:r>
+        <w:t xml:space="preserve"> · </w:t>
+      </w:r>
+      <w:hyperlink r:id="rId47">
+        <w:r>
+          <w:rPr>
+            <w:color w:val="1D5FD1"/>
+            <w:u w:val="single"/>
+            <w:sz w:val="17"/>
+            <w:szCs w:val="17"/>
+            <w:rFonts w:ascii="Calibri" w:hAnsi="Calibri" w:eastAsia="Hiragino Sans GB"/>
+          </w:rPr>
+          <w:t>MU</w:t>
+        </w:r>
+      </w:hyperlink>
+      <w:r>
+        <w:t xml:space="preserve"> · </w:t>
+      </w:r>
+      <w:hyperlink r:id="rId48">
+        <w:r>
+          <w:rPr>
+            <w:color w:val="1D5FD1"/>
+            <w:u w:val="single"/>
+            <w:sz w:val="17"/>
+            <w:szCs w:val="17"/>
+            <w:rFonts w:ascii="Calibri" w:hAnsi="Calibri" w:eastAsia="Hiragino Sans GB"/>
+          </w:rPr>
+          <w:t>000660.KS</w:t>
+        </w:r>
+      </w:hyperlink>
+      <w:r>
+        <w:t xml:space="preserve"> · </w:t>
+      </w:r>
+      <w:hyperlink r:id="rId49">
+        <w:r>
+          <w:rPr>
+            <w:color w:val="1D5FD1"/>
+            <w:u w:val="single"/>
+            <w:sz w:val="17"/>
+            <w:szCs w:val="17"/>
+            <w:rFonts w:ascii="Calibri" w:hAnsi="Calibri" w:eastAsia="Hiragino Sans GB"/>
+          </w:rPr>
+          <w:t>ASML</w:t>
+        </w:r>
+      </w:hyperlink>
+    </w:p>
+    <w:p>
+      <w:pPr>
+        <w:keepNext/>
+      </w:pPr>
+      <w:r>
+        <w:rPr>
+          <w:rFonts w:ascii="Calibri" w:hAnsi="Calibri" w:eastAsia="Hiragino Sans GB"/>
+          <w:b/>
+          <w:color w:val="D85B16"/>
+          <w:sz w:val="18"/>
+        </w:rPr>
+        <w:t xml:space="preserve">02  SPLIT  </w:t>
+      </w:r>
+      <w:r>
+        <w:rPr>
+          <w:rFonts w:ascii="Calibri" w:hAnsi="Calibri" w:eastAsia="Hiragino Sans GB"/>
+          <w:b/>
+          <w:color w:val="111111"/>
+          <w:sz w:val="22"/>
+        </w:rPr>
+        <w:t>AI 电力：瓶颈论更强，但“瓶颈即收益”受到挑战</w:t>
+      </w:r>
+    </w:p>
+    <w:p>
+      <w:pPr>
+        <w:keepLines w:val="0"/>
+      </w:pPr>
+      <w:r>
+        <w:rPr>
+          <w:rFonts w:ascii="Calibri" w:hAnsi="Calibri" w:eastAsia="Hiragino Sans GB"/>
+          <w:b w:val="0"/>
+          <w:color w:val="111111"/>
+          <w:sz w:val="22"/>
+        </w:rPr>
+        <w:t>相对 standing thesis“AI Capex 经能源、设备和利率进入通胀定价”，本周 GOES、变压器、铜与并网排队证据强化了成本传导链；但这同时意味着云厂商 ROIC 受损、设备交付延期和下游硬件库存倒灌。主导的电力受益观点因此被拆成两部分：有合同保护和可交付产能者受益，只有稀缺叙事、缺少许可或通电兑现者未必受益。</w:t>
+      </w:r>
+    </w:p>
+    <w:p>
+      <w:pPr>
+        <w:pStyle w:val="TableCitation"/>
+      </w:pPr>
+      <w:r>
+        <w:t>关联标的：</w:t>
+      </w:r>
+      <w:hyperlink r:id="rId50">
+        <w:r>
+          <w:rPr>
+            <w:color w:val="1D5FD1"/>
+            <w:u w:val="single"/>
+            <w:sz w:val="17"/>
+            <w:szCs w:val="17"/>
+            <w:rFonts w:ascii="Calibri" w:hAnsi="Calibri" w:eastAsia="Hiragino Sans GB"/>
+          </w:rPr>
+          <w:t>GEV</w:t>
+        </w:r>
+      </w:hyperlink>
+      <w:r>
+        <w:t xml:space="preserve"> · </w:t>
+      </w:r>
+      <w:hyperlink r:id="rId51">
+        <w:r>
+          <w:rPr>
+            <w:color w:val="1D5FD1"/>
+            <w:u w:val="single"/>
+            <w:sz w:val="17"/>
+            <w:szCs w:val="17"/>
+            <w:rFonts w:ascii="Calibri" w:hAnsi="Calibri" w:eastAsia="Hiragino Sans GB"/>
+          </w:rPr>
+          <w:t>ETN</w:t>
+        </w:r>
+      </w:hyperlink>
+      <w:r>
+        <w:t xml:space="preserve"> · </w:t>
+      </w:r>
+      <w:hyperlink r:id="rId52">
+        <w:r>
+          <w:rPr>
+            <w:color w:val="1D5FD1"/>
+            <w:u w:val="single"/>
+            <w:sz w:val="17"/>
+            <w:szCs w:val="17"/>
+            <w:rFonts w:ascii="Calibri" w:hAnsi="Calibri" w:eastAsia="Hiragino Sans GB"/>
+          </w:rPr>
+          <w:t>VST</w:t>
+        </w:r>
+      </w:hyperlink>
+      <w:r>
+        <w:t xml:space="preserve"> · </w:t>
+      </w:r>
+      <w:hyperlink r:id="rId53">
+        <w:r>
+          <w:rPr>
+            <w:color w:val="1D5FD1"/>
+            <w:u w:val="single"/>
+            <w:sz w:val="17"/>
+            <w:szCs w:val="17"/>
+            <w:rFonts w:ascii="Calibri" w:hAnsi="Calibri" w:eastAsia="Hiragino Sans GB"/>
+          </w:rPr>
+          <w:t>CEG</w:t>
+        </w:r>
+      </w:hyperlink>
+      <w:r>
+        <w:t xml:space="preserve"> · </w:t>
+      </w:r>
+      <w:hyperlink r:id="rId54">
+        <w:r>
+          <w:rPr>
+            <w:color w:val="1D5FD1"/>
+            <w:u w:val="single"/>
+            <w:sz w:val="17"/>
+            <w:szCs w:val="17"/>
+            <w:rFonts w:ascii="Calibri" w:hAnsi="Calibri" w:eastAsia="Hiragino Sans GB"/>
+          </w:rPr>
+          <w:t>002028.SZ</w:t>
+        </w:r>
+      </w:hyperlink>
+      <w:r>
+        <w:t xml:space="preserve"> · </w:t>
+      </w:r>
+      <w:hyperlink r:id="rId55">
+        <w:r>
+          <w:rPr>
+            <w:color w:val="1D5FD1"/>
+            <w:u w:val="single"/>
+            <w:sz w:val="17"/>
+            <w:szCs w:val="17"/>
+            <w:rFonts w:ascii="Calibri" w:hAnsi="Calibri" w:eastAsia="Hiragino Sans GB"/>
+          </w:rPr>
+          <w:t>600089.SH</w:t>
+        </w:r>
+      </w:hyperlink>
+      <w:r>
+        <w:t xml:space="preserve"> · </w:t>
+      </w:r>
+      <w:hyperlink r:id="rId45">
+        <w:r>
+          <w:rPr>
+            <w:color w:val="1D5FD1"/>
+            <w:u w:val="single"/>
+            <w:sz w:val="17"/>
+            <w:szCs w:val="17"/>
+            <w:rFonts w:ascii="Calibri" w:hAnsi="Calibri" w:eastAsia="Hiragino Sans GB"/>
+          </w:rPr>
+          <w:t>NVDA</w:t>
+        </w:r>
+      </w:hyperlink>
+    </w:p>
+    <w:p>
+      <w:pPr>
+        <w:keepNext/>
+      </w:pPr>
+      <w:r>
+        <w:rPr>
+          <w:rFonts w:ascii="Calibri" w:hAnsi="Calibri" w:eastAsia="Hiragino Sans GB"/>
+          <w:b/>
+          <w:color w:val="D85B16"/>
+          <w:sz w:val="18"/>
+        </w:rPr>
+        <w:t xml:space="preserve">03  SPLIT  </w:t>
+      </w:r>
+      <w:r>
+        <w:rPr>
+          <w:rFonts w:ascii="Calibri" w:hAnsi="Calibri" w:eastAsia="Hiragino Sans GB"/>
+          <w:b/>
+          <w:color w:val="111111"/>
+          <w:sz w:val="22"/>
+        </w:rPr>
+        <w:t>A股杠铃：框架未变，红利腿和硬科技腿都需二次筛选</w:t>
+      </w:r>
+    </w:p>
+    <w:p>
+      <w:pPr>
+        <w:keepLines w:val="0"/>
+      </w:pPr>
+      <w:r>
+        <w:rPr>
+          <w:rFonts w:ascii="Calibri" w:hAnsi="Calibri" w:eastAsia="Hiragino Sans GB"/>
+          <w:b w:val="0"/>
+          <w:color w:val="111111"/>
+          <w:sz w:val="22"/>
+        </w:rPr>
+        <w:t>相对 standing thesis 的政策、利率与风险偏好杠铃表达，本周没有形成动作升级。新增证据支持红利作为组合稳定器，但银行 NIM 压力要求转向非银现金流；硬科技虽有订单依据，却仍缺少融资、ETF、北向资金与宽度的同步确认。杠铃从行业标签进一步收窄为“现金流质量加订单兑现”的组合。</w:t>
+      </w:r>
+    </w:p>
+    <w:p>
+      <w:pPr>
+        <w:pStyle w:val="TableCitation"/>
+      </w:pPr>
+      <w:r>
+        <w:t>关联标的：</w:t>
+      </w:r>
+      <w:hyperlink r:id="rId56">
         <w:r>
           <w:rPr>
             <w:color w:val="1D5FD1"/>
@@ -2839,7 +3313,7 @@
       <w:r>
         <w:t xml:space="preserve"> · </w:t>
       </w:r>
-      <w:hyperlink r:id="rId39">
+      <w:hyperlink r:id="rId57">
         <w:r>
           <w:rPr>
             <w:color w:val="1D5FD1"/>
@@ -2854,7 +3328,7 @@
       <w:r>
         <w:t xml:space="preserve"> · </w:t>
       </w:r>
-      <w:hyperlink r:id="rId40">
+      <w:hyperlink r:id="rId58">
         <w:r>
           <w:rPr>
             <w:color w:val="1D5FD1"/>
@@ -2869,22 +3343,7 @@
       <w:r>
         <w:t xml:space="preserve"> · </w:t>
       </w:r>
-      <w:hyperlink r:id="rId41">
-        <w:r>
-          <w:rPr>
-            <w:color w:val="1D5FD1"/>
-            <w:u w:val="single"/>
-            <w:sz w:val="17"/>
-            <w:szCs w:val="17"/>
-            <w:rFonts w:ascii="Calibri" w:hAnsi="Calibri" w:eastAsia="Hiragino Sans GB"/>
-          </w:rPr>
-          <w:t>600941.SH</w:t>
-        </w:r>
-      </w:hyperlink>
-      <w:r>
-        <w:t xml:space="preserve"> · </w:t>
-      </w:r>
-      <w:hyperlink r:id="rId42">
+      <w:hyperlink r:id="rId59">
         <w:r>
           <w:rPr>
             <w:color w:val="1D5FD1"/>
@@ -2899,7 +3358,7 @@
       <w:r>
         <w:t xml:space="preserve"> · </w:t>
       </w:r>
-      <w:hyperlink r:id="rId43">
+      <w:hyperlink r:id="rId60">
         <w:r>
           <w:rPr>
             <w:color w:val="1D5FD1"/>
@@ -2909,6 +3368,21 @@
             <w:rFonts w:ascii="Calibri" w:hAnsi="Calibri" w:eastAsia="Hiragino Sans GB"/>
           </w:rPr>
           <w:t>688981.SH</w:t>
+        </w:r>
+      </w:hyperlink>
+      <w:r>
+        <w:t xml:space="preserve"> · </w:t>
+      </w:r>
+      <w:hyperlink r:id="rId61">
+        <w:r>
+          <w:rPr>
+            <w:color w:val="1D5FD1"/>
+            <w:u w:val="single"/>
+            <w:sz w:val="17"/>
+            <w:szCs w:val="17"/>
+            <w:rFonts w:ascii="Calibri" w:hAnsi="Calibri" w:eastAsia="Hiragino Sans GB"/>
+          </w:rPr>
+          <w:t>300308.SZ</w:t>
         </w:r>
       </w:hyperlink>
     </w:p>
@@ -2923,7 +3397,7 @@
           <w:color w:val="D85B16"/>
           <w:sz w:val="18"/>
         </w:rPr>
-        <w:t xml:space="preserve">02  WEAKENED  </w:t>
+        <w:t xml:space="preserve">04  SPLIT  </w:t>
       </w:r>
       <w:r>
         <w:rPr>
@@ -2932,7 +3406,7 @@
           <w:color w:val="111111"/>
           <w:sz w:val="22"/>
         </w:rPr>
-        <w:t>AI 资本开支通过能源、设备和利率进入通胀定价 的本周证据更新</w:t>
+        <w:t>科创50复苏：产业证据增强，组合证据仍未闭环</w:t>
       </w:r>
     </w:p>
     <w:p>
@@ -2946,7 +3420,7 @@
           <w:color w:val="111111"/>
           <w:sz w:val="22"/>
         </w:rPr>
-        <w:t>赛道：AI 再通胀/利率敏感资产。候选观察标的：XLE, XLU, TLT, GLD, JPM, NEE。当前共有 40 条证据、3 位分析师和 8 条风险信号指向该判断；主导链条为 宏观通胀传导。该主题应作为可跟踪投资假设，而不是孤立结论。 本周新增 8 条主线事件，其中支持 2 条、风险 6 条；当前组合含义是 先放入观察池，只在证据密度和价格确认同时改善时进入组合。</w:t>
+        <w:t>standing thesis 要求订单、融资盘和指数结构共振。本周先进封装与设备材料强化了订单端，但融资集中、被动配置与拥挤风险仍构成挑战；由于 marketQuoteRows 为 0，也无法在本报告中确认价格或资金面已经改善。因此复苏判断仍停留在分歧验证，而非趋势确认。</w:t>
       </w:r>
     </w:p>
     <w:p>
@@ -2956,7 +3430,7 @@
       <w:r>
         <w:t>关联标的：</w:t>
       </w:r>
-      <w:hyperlink r:id="rId44">
+      <w:hyperlink r:id="rId59">
         <w:r>
           <w:rPr>
             <w:color w:val="1D5FD1"/>
@@ -2965,13 +3439,13 @@
             <w:szCs w:val="17"/>
             <w:rFonts w:ascii="Calibri" w:hAnsi="Calibri" w:eastAsia="Hiragino Sans GB"/>
           </w:rPr>
-          <w:t>XLU</w:t>
+          <w:t>588000.SH</w:t>
         </w:r>
       </w:hyperlink>
       <w:r>
         <w:t xml:space="preserve"> · </w:t>
       </w:r>
-      <w:hyperlink r:id="rId45">
+      <w:hyperlink r:id="rId62">
         <w:r>
           <w:rPr>
             <w:color w:val="1D5FD1"/>
@@ -2980,13 +3454,13 @@
             <w:szCs w:val="17"/>
             <w:rFonts w:ascii="Calibri" w:hAnsi="Calibri" w:eastAsia="Hiragino Sans GB"/>
           </w:rPr>
-          <w:t>XLE</w:t>
+          <w:t>688256.SH</w:t>
         </w:r>
       </w:hyperlink>
       <w:r>
         <w:t xml:space="preserve"> · </w:t>
       </w:r>
-      <w:hyperlink r:id="rId46">
+      <w:hyperlink r:id="rId60">
         <w:r>
           <w:rPr>
             <w:color w:val="1D5FD1"/>
@@ -2995,13 +3469,13 @@
             <w:szCs w:val="17"/>
             <w:rFonts w:ascii="Calibri" w:hAnsi="Calibri" w:eastAsia="Hiragino Sans GB"/>
           </w:rPr>
-          <w:t>META</w:t>
+          <w:t>688981.SH</w:t>
         </w:r>
       </w:hyperlink>
       <w:r>
         <w:t xml:space="preserve"> · </w:t>
       </w:r>
-      <w:hyperlink r:id="rId47">
+      <w:hyperlink r:id="rId63">
         <w:r>
           <w:rPr>
             <w:color w:val="1D5FD1"/>
@@ -3010,13 +3484,13 @@
             <w:szCs w:val="17"/>
             <w:rFonts w:ascii="Calibri" w:hAnsi="Calibri" w:eastAsia="Hiragino Sans GB"/>
           </w:rPr>
-          <w:t>TLT</w:t>
+          <w:t>688041.SH</w:t>
         </w:r>
       </w:hyperlink>
       <w:r>
         <w:t xml:space="preserve"> · </w:t>
       </w:r>
-      <w:hyperlink r:id="rId48">
+      <w:hyperlink r:id="rId64">
         <w:r>
           <w:rPr>
             <w:color w:val="1D5FD1"/>
@@ -3025,13 +3499,13 @@
             <w:szCs w:val="17"/>
             <w:rFonts w:ascii="Calibri" w:hAnsi="Calibri" w:eastAsia="Hiragino Sans GB"/>
           </w:rPr>
-          <w:t>MSFT</w:t>
+          <w:t>688008.SH</w:t>
         </w:r>
       </w:hyperlink>
       <w:r>
         <w:t xml:space="preserve"> · </w:t>
       </w:r>
-      <w:hyperlink r:id="rId38">
+      <w:hyperlink r:id="rId61">
         <w:r>
           <w:rPr>
             <w:color w:val="1D5FD1"/>
@@ -3040,271 +3514,7 @@
             <w:szCs w:val="17"/>
             <w:rFonts w:ascii="Calibri" w:hAnsi="Calibri" w:eastAsia="Hiragino Sans GB"/>
           </w:rPr>
-          <w:t>600900.SH</w:t>
-        </w:r>
-      </w:hyperlink>
-    </w:p>
-    <w:p>
-      <w:pPr>
-        <w:keepNext/>
-      </w:pPr>
-      <w:r>
-        <w:rPr>
-          <w:rFonts w:ascii="Calibri" w:hAnsi="Calibri" w:eastAsia="Hiragino Sans GB"/>
-          <w:b/>
-          <w:color w:val="D85B16"/>
-          <w:sz w:val="18"/>
-        </w:rPr>
-        <w:t xml:space="preserve">03  WEAKENED  </w:t>
-      </w:r>
-      <w:r>
-        <w:rPr>
-          <w:rFonts w:ascii="Calibri" w:hAnsi="Calibri" w:eastAsia="Hiragino Sans GB"/>
-          <w:b/>
-          <w:color w:val="111111"/>
-          <w:sz w:val="22"/>
-        </w:rPr>
-        <w:t>NAND盈利弹性由价格与产品结构主导，而非单纯出货增长 的本周证据更新</w:t>
-      </w:r>
-    </w:p>
-    <w:p>
-      <w:pPr>
-        <w:keepLines w:val="0"/>
-      </w:pPr>
-      <w:r>
-        <w:rPr>
-          <w:rFonts w:ascii="Calibri" w:hAnsi="Calibri" w:eastAsia="Hiragino Sans GB"/>
-          <w:b w:val="0"/>
-          <w:color w:val="111111"/>
-          <w:sz w:val="22"/>
-        </w:rPr>
-        <w:t>SanDisk的盈利修复主要来自NAND单位价格上行和产品结构改善，而非位元出货扩张。若AI及企业存储需求维持、行业供给纪律未被破坏，利润率可保持韧性；若新增供给推动价格回落，盈利弹性将快速反转。 本周新增 8 条主线事件，其中支持 3 条、风险 5 条；当前组合含义是 适合作为风险雷达，不适合作为无条件加仓理由。</w:t>
-      </w:r>
-    </w:p>
-    <w:p>
-      <w:pPr>
-        <w:pStyle w:val="TableCitation"/>
-      </w:pPr>
-      <w:r>
-        <w:t>关联标的：</w:t>
-      </w:r>
-      <w:hyperlink r:id="rId49">
-        <w:r>
-          <w:rPr>
-            <w:color w:val="1D5FD1"/>
-            <w:u w:val="single"/>
-            <w:sz w:val="17"/>
-            <w:szCs w:val="17"/>
-            <w:rFonts w:ascii="Calibri" w:hAnsi="Calibri" w:eastAsia="Hiragino Sans GB"/>
-          </w:rPr>
-          <w:t>NVDA</w:t>
-        </w:r>
-      </w:hyperlink>
-      <w:r>
-        <w:t xml:space="preserve"> · </w:t>
-      </w:r>
-      <w:hyperlink r:id="rId50">
-        <w:r>
-          <w:rPr>
-            <w:color w:val="1D5FD1"/>
-            <w:u w:val="single"/>
-            <w:sz w:val="17"/>
-            <w:szCs w:val="17"/>
-            <w:rFonts w:ascii="Calibri" w:hAnsi="Calibri" w:eastAsia="Hiragino Sans GB"/>
-          </w:rPr>
-          <w:t>TSM</w:t>
-        </w:r>
-      </w:hyperlink>
-      <w:r>
-        <w:t xml:space="preserve"> · </w:t>
-      </w:r>
-      <w:hyperlink r:id="rId51">
-        <w:r>
-          <w:rPr>
-            <w:color w:val="1D5FD1"/>
-            <w:u w:val="single"/>
-            <w:sz w:val="17"/>
-            <w:szCs w:val="17"/>
-            <w:rFonts w:ascii="Calibri" w:hAnsi="Calibri" w:eastAsia="Hiragino Sans GB"/>
-          </w:rPr>
-          <w:t>MU</w:t>
-        </w:r>
-      </w:hyperlink>
-      <w:r>
-        <w:t xml:space="preserve"> · </w:t>
-      </w:r>
-      <w:hyperlink r:id="rId52">
-        <w:r>
-          <w:rPr>
-            <w:color w:val="1D5FD1"/>
-            <w:u w:val="single"/>
-            <w:sz w:val="17"/>
-            <w:szCs w:val="17"/>
-            <w:rFonts w:ascii="Calibri" w:hAnsi="Calibri" w:eastAsia="Hiragino Sans GB"/>
-          </w:rPr>
-          <w:t>000660.KS</w:t>
-        </w:r>
-      </w:hyperlink>
-      <w:r>
-        <w:t xml:space="preserve"> · </w:t>
-      </w:r>
-      <w:hyperlink r:id="rId46">
-        <w:r>
-          <w:rPr>
-            <w:color w:val="1D5FD1"/>
-            <w:u w:val="single"/>
-            <w:sz w:val="17"/>
-            <w:szCs w:val="17"/>
-            <w:rFonts w:ascii="Calibri" w:hAnsi="Calibri" w:eastAsia="Hiragino Sans GB"/>
-          </w:rPr>
-          <w:t>META</w:t>
-        </w:r>
-      </w:hyperlink>
-      <w:r>
-        <w:t xml:space="preserve"> · </w:t>
-      </w:r>
-      <w:hyperlink r:id="rId53">
-        <w:r>
-          <w:rPr>
-            <w:color w:val="1D5FD1"/>
-            <w:u w:val="single"/>
-            <w:sz w:val="17"/>
-            <w:szCs w:val="17"/>
-            <w:rFonts w:ascii="Calibri" w:hAnsi="Calibri" w:eastAsia="Hiragino Sans GB"/>
-          </w:rPr>
-          <w:t>AMD</w:t>
-        </w:r>
-      </w:hyperlink>
-    </w:p>
-    <w:p>
-      <w:pPr>
-        <w:keepNext/>
-      </w:pPr>
-      <w:r>
-        <w:rPr>
-          <w:rFonts w:ascii="Calibri" w:hAnsi="Calibri" w:eastAsia="Hiragino Sans GB"/>
-          <w:b/>
-          <w:color w:val="D85B16"/>
-          <w:sz w:val="18"/>
-        </w:rPr>
-        <w:t xml:space="preserve">04  WEAKENED  </w:t>
-      </w:r>
-      <w:r>
-        <w:rPr>
-          <w:rFonts w:ascii="Calibri" w:hAnsi="Calibri" w:eastAsia="Hiragino Sans GB"/>
-          <w:b/>
-          <w:color w:val="111111"/>
-          <w:sz w:val="22"/>
-        </w:rPr>
-        <w:t>Mag7 在 AI 时代从平台垄断转向基础设施再分层 的本周证据更新</w:t>
-      </w:r>
-    </w:p>
-    <w:p>
-      <w:pPr>
-        <w:keepLines w:val="0"/>
-      </w:pPr>
-      <w:r>
-        <w:rPr>
-          <w:rFonts w:ascii="Calibri" w:hAnsi="Calibri" w:eastAsia="Hiragino Sans GB"/>
-          <w:b w:val="0"/>
-          <w:color w:val="111111"/>
-          <w:sz w:val="22"/>
-        </w:rPr>
-        <w:t>赛道：Mag7 AI 平台再分层。候选观察标的：MSFT, AAPL, TSLA, META, AMZN, GOOGL, NVDA。当前共有 40 条证据、4 位分析师和 8 条风险信号指向该判断；主导链条为 AI 基础设施。该主题应作为可跟踪投资假设，而不是孤立结论。 本周新增 8 条主线事件，其中支持 1 条、风险 7 条；当前组合含义是 这是有投资含义但证据分歧很高的主线，更适合配对验证、分批试错和严格证伪。</w:t>
-      </w:r>
-    </w:p>
-    <w:p>
-      <w:pPr>
-        <w:pStyle w:val="TableCitation"/>
-      </w:pPr>
-      <w:r>
-        <w:t>关联标的：</w:t>
-      </w:r>
-      <w:hyperlink r:id="rId46">
-        <w:r>
-          <w:rPr>
-            <w:color w:val="1D5FD1"/>
-            <w:u w:val="single"/>
-            <w:sz w:val="17"/>
-            <w:szCs w:val="17"/>
-            <w:rFonts w:ascii="Calibri" w:hAnsi="Calibri" w:eastAsia="Hiragino Sans GB"/>
-          </w:rPr>
-          <w:t>META</w:t>
-        </w:r>
-      </w:hyperlink>
-      <w:r>
-        <w:t xml:space="preserve"> · </w:t>
-      </w:r>
-      <w:hyperlink r:id="rId48">
-        <w:r>
-          <w:rPr>
-            <w:color w:val="1D5FD1"/>
-            <w:u w:val="single"/>
-            <w:sz w:val="17"/>
-            <w:szCs w:val="17"/>
-            <w:rFonts w:ascii="Calibri" w:hAnsi="Calibri" w:eastAsia="Hiragino Sans GB"/>
-          </w:rPr>
-          <w:t>MSFT</w:t>
-        </w:r>
-      </w:hyperlink>
-      <w:r>
-        <w:t xml:space="preserve"> · </w:t>
-      </w:r>
-      <w:hyperlink r:id="rId49">
-        <w:r>
-          <w:rPr>
-            <w:color w:val="1D5FD1"/>
-            <w:u w:val="single"/>
-            <w:sz w:val="17"/>
-            <w:szCs w:val="17"/>
-            <w:rFonts w:ascii="Calibri" w:hAnsi="Calibri" w:eastAsia="Hiragino Sans GB"/>
-          </w:rPr>
-          <w:t>NVDA</w:t>
-        </w:r>
-      </w:hyperlink>
-      <w:r>
-        <w:t xml:space="preserve"> · </w:t>
-      </w:r>
-      <w:hyperlink r:id="rId54">
-        <w:r>
-          <w:rPr>
-            <w:color w:val="1D5FD1"/>
-            <w:u w:val="single"/>
-            <w:sz w:val="17"/>
-            <w:szCs w:val="17"/>
-            <w:rFonts w:ascii="Calibri" w:hAnsi="Calibri" w:eastAsia="Hiragino Sans GB"/>
-          </w:rPr>
-          <w:t>AMZN</w:t>
-        </w:r>
-      </w:hyperlink>
-      <w:r>
-        <w:t xml:space="preserve"> · </w:t>
-      </w:r>
-      <w:hyperlink r:id="rId55">
-        <w:r>
-          <w:rPr>
-            <w:color w:val="1D5FD1"/>
-            <w:u w:val="single"/>
-            <w:sz w:val="17"/>
-            <w:szCs w:val="17"/>
-            <w:rFonts w:ascii="Calibri" w:hAnsi="Calibri" w:eastAsia="Hiragino Sans GB"/>
-          </w:rPr>
-          <w:t>GOOGL</w:t>
-        </w:r>
-      </w:hyperlink>
-      <w:r>
-        <w:t xml:space="preserve"> · </w:t>
-      </w:r>
-      <w:hyperlink r:id="rId50">
-        <w:r>
-          <w:rPr>
-            <w:color w:val="1D5FD1"/>
-            <w:u w:val="single"/>
-            <w:sz w:val="17"/>
-            <w:szCs w:val="17"/>
-            <w:rFonts w:ascii="Calibri" w:hAnsi="Calibri" w:eastAsia="Hiragino Sans GB"/>
-          </w:rPr>
-          <w:t>TSM</w:t>
+          <w:t>300308.SZ</w:t>
         </w:r>
       </w:hyperlink>
     </w:p>
@@ -3328,7 +3538,7 @@
           <w:color w:val="111111"/>
           <w:sz w:val="22"/>
         </w:rPr>
-        <w:t>A 股硬科技与科创50的复苏需要订单、融资盘和指数结构共振 的本周证据更新</w:t>
+        <w:t>CPO：租金迁移逻辑延续，拥挤度成为新增约束</w:t>
       </w:r>
     </w:p>
     <w:p>
@@ -3342,7 +3552,7 @@
           <w:color w:val="111111"/>
           <w:sz w:val="22"/>
         </w:rPr>
-        <w:t>赛道：A股硬科技/科创50。候选观察标的：588000.SH, 688981.SH, 688256.SH, 688041.SH, 688008.SH, 688111.SH, 300308.SZ, 002916.SZ。当前共有 40 条证据、3 位分析师和 8 条风险信号指向该判断；主导链条为 AI 基础设施。该主题应作为可跟踪投资假设，而不是孤立结论。 本周新增 8 条主线事件，其中支持 5 条、风险 3 条；当前组合含义是 这是有投资含义但证据分歧很高的主线，更适合配对验证、分批试错和严格证伪。</w:t>
+        <w:t>相对 standing thesis“光互联与铜连接决定集群内部租金迁移”，本周 Capex 向网络和物理容量扩散的证据继续支持产业方向；新增挑战是交易集中和融资风险可能先于订单逻辑影响可交易性。结论不是否定 CPO，而是把进入组合的条件从主题曝光提升为订单、利润和交易宽度的三重验证。</w:t>
       </w:r>
     </w:p>
     <w:p>
@@ -3352,7 +3562,67 @@
       <w:r>
         <w:t>关联标的：</w:t>
       </w:r>
-      <w:hyperlink r:id="rId56">
+      <w:hyperlink r:id="rId65">
+        <w:r>
+          <w:rPr>
+            <w:color w:val="1D5FD1"/>
+            <w:u w:val="single"/>
+            <w:sz w:val="17"/>
+            <w:szCs w:val="17"/>
+            <w:rFonts w:ascii="Calibri" w:hAnsi="Calibri" w:eastAsia="Hiragino Sans GB"/>
+          </w:rPr>
+          <w:t>AVGO</w:t>
+        </w:r>
+      </w:hyperlink>
+      <w:r>
+        <w:t xml:space="preserve"> · </w:t>
+      </w:r>
+      <w:hyperlink r:id="rId66">
+        <w:r>
+          <w:rPr>
+            <w:color w:val="1D5FD1"/>
+            <w:u w:val="single"/>
+            <w:sz w:val="17"/>
+            <w:szCs w:val="17"/>
+            <w:rFonts w:ascii="Calibri" w:hAnsi="Calibri" w:eastAsia="Hiragino Sans GB"/>
+          </w:rPr>
+          <w:t>MRVL</w:t>
+        </w:r>
+      </w:hyperlink>
+      <w:r>
+        <w:t xml:space="preserve"> · </w:t>
+      </w:r>
+      <w:hyperlink r:id="rId67">
+        <w:r>
+          <w:rPr>
+            <w:color w:val="1D5FD1"/>
+            <w:u w:val="single"/>
+            <w:sz w:val="17"/>
+            <w:szCs w:val="17"/>
+            <w:rFonts w:ascii="Calibri" w:hAnsi="Calibri" w:eastAsia="Hiragino Sans GB"/>
+          </w:rPr>
+          <w:t>COHR</w:t>
+        </w:r>
+      </w:hyperlink>
+      <w:r>
+        <w:t xml:space="preserve"> · </w:t>
+      </w:r>
+      <w:hyperlink r:id="rId68">
+        <w:r>
+          <w:rPr>
+            <w:color w:val="1D5FD1"/>
+            <w:u w:val="single"/>
+            <w:sz w:val="17"/>
+            <w:szCs w:val="17"/>
+            <w:rFonts w:ascii="Calibri" w:hAnsi="Calibri" w:eastAsia="Hiragino Sans GB"/>
+          </w:rPr>
+          <w:t>LITE</w:t>
+        </w:r>
+      </w:hyperlink>
+      <w:r>
+        <w:t xml:space="preserve"> · </w:t>
+      </w:r>
+      <w:hyperlink r:id="rId61">
         <w:r>
           <w:rPr>
             <w:color w:val="1D5FD1"/>
@@ -3367,7 +3637,7 @@
       <w:r>
         <w:t xml:space="preserve"> · </w:t>
       </w:r>
-      <w:hyperlink r:id="rId57">
+      <w:hyperlink r:id="rId69">
         <w:r>
           <w:rPr>
             <w:color w:val="1D5FD1"/>
@@ -3376,13 +3646,55 @@
             <w:szCs w:val="17"/>
             <w:rFonts w:ascii="Calibri" w:hAnsi="Calibri" w:eastAsia="Hiragino Sans GB"/>
           </w:rPr>
-          <w:t>688256.SH</w:t>
+          <w:t>300394.SZ</w:t>
         </w:r>
       </w:hyperlink>
+    </w:p>
+    <w:p>
+      <w:pPr>
+        <w:keepNext/>
+      </w:pPr>
       <w:r>
-        <w:t xml:space="preserve"> · </w:t>
+        <w:rPr>
+          <w:rFonts w:ascii="Calibri" w:hAnsi="Calibri" w:eastAsia="Hiragino Sans GB"/>
+          <w:b/>
+          <w:color w:val="D85B16"/>
+          <w:sz w:val="18"/>
+        </w:rPr>
+        <w:t xml:space="preserve">06  UNCHANGED_BUT_IMPORTANT  </w:t>
       </w:r>
-      <w:hyperlink r:id="rId43">
+      <w:r>
+        <w:rPr>
+          <w:rFonts w:ascii="Calibri" w:hAnsi="Calibri" w:eastAsia="Hiragino Sans GB"/>
+          <w:b/>
+          <w:color w:val="111111"/>
+          <w:sz w:val="22"/>
+        </w:rPr>
+        <w:t>中国权益流动性：仍是重要总阀门，但直接证据偏薄</w:t>
+      </w:r>
+    </w:p>
+    <w:p>
+      <w:pPr>
+        <w:keepLines w:val="0"/>
+      </w:pPr>
+      <w:r>
+        <w:rPr>
+          <w:rFonts w:ascii="Calibri" w:hAnsi="Calibri" w:eastAsia="Hiragino Sans GB"/>
+          <w:b w:val="0"/>
+          <w:color w:val="111111"/>
+          <w:sz w:val="22"/>
+        </w:rPr>
+        <w:t>相对 standing thesis 的政策、流动性与风险偏好共同驱动框架，本周地产企稳范围仍窄，未形成能够推高整体风险偏好的新闭环；直接支撑该 call 的证据数量也有限。因此 HOLD 不变，重点从宽泛政策叙事转向 ETF、期权伽马和尾盘流动性的可观察验证。</w:t>
+      </w:r>
+    </w:p>
+    <w:p>
+      <w:pPr>
+        <w:pStyle w:val="TableCitation"/>
+      </w:pPr>
+      <w:r>
+        <w:t>关联标的：</w:t>
+      </w:r>
+      <w:hyperlink r:id="rId70">
         <w:r>
           <w:rPr>
             <w:color w:val="1D5FD1"/>
@@ -3391,13 +3703,13 @@
             <w:szCs w:val="17"/>
             <w:rFonts w:ascii="Calibri" w:hAnsi="Calibri" w:eastAsia="Hiragino Sans GB"/>
           </w:rPr>
-          <w:t>688981.SH</w:t>
+          <w:t>510300.SH</w:t>
         </w:r>
       </w:hyperlink>
       <w:r>
         <w:t xml:space="preserve"> · </w:t>
       </w:r>
-      <w:hyperlink r:id="rId58">
+      <w:hyperlink r:id="rId71">
         <w:r>
           <w:rPr>
             <w:color w:val="1D5FD1"/>
@@ -3406,13 +3718,13 @@
             <w:szCs w:val="17"/>
             <w:rFonts w:ascii="Calibri" w:hAnsi="Calibri" w:eastAsia="Hiragino Sans GB"/>
           </w:rPr>
-          <w:t>0981.HK</w:t>
+          <w:t>159915.SZ</w:t>
         </w:r>
       </w:hyperlink>
       <w:r>
         <w:t xml:space="preserve"> · </w:t>
       </w:r>
-      <w:hyperlink r:id="rId59">
+      <w:hyperlink r:id="rId72">
         <w:r>
           <w:rPr>
             <w:color w:val="1D5FD1"/>
@@ -3421,13 +3733,13 @@
             <w:szCs w:val="17"/>
             <w:rFonts w:ascii="Calibri" w:hAnsi="Calibri" w:eastAsia="Hiragino Sans GB"/>
           </w:rPr>
-          <w:t>688041.SH</w:t>
+          <w:t>2800.HK</w:t>
         </w:r>
       </w:hyperlink>
       <w:r>
         <w:t xml:space="preserve"> · </w:t>
       </w:r>
-      <w:hyperlink r:id="rId38">
+      <w:hyperlink r:id="rId73">
         <w:r>
           <w:rPr>
             <w:color w:val="1D5FD1"/>
@@ -3436,7 +3748,22 @@
             <w:szCs w:val="17"/>
             <w:rFonts w:ascii="Calibri" w:hAnsi="Calibri" w:eastAsia="Hiragino Sans GB"/>
           </w:rPr>
-          <w:t>600900.SH</w:t>
+          <w:t>0700.HK</w:t>
+        </w:r>
+      </w:hyperlink>
+      <w:r>
+        <w:t xml:space="preserve"> · </w:t>
+      </w:r>
+      <w:hyperlink r:id="rId74">
+        <w:r>
+          <w:rPr>
+            <w:color w:val="1D5FD1"/>
+            <w:u w:val="single"/>
+            <w:sz w:val="17"/>
+            <w:szCs w:val="17"/>
+            <w:rFonts w:ascii="Calibri" w:hAnsi="Calibri" w:eastAsia="Hiragino Sans GB"/>
+          </w:rPr>
+          <w:t>9988.HK</w:t>
         </w:r>
       </w:hyperlink>
     </w:p>
@@ -3677,7 +4004,7 @@
             </w:tcMar>
           </w:tcPr>
           <w:p>
-            <w:hyperlink r:id="rId60">
+            <w:hyperlink r:id="rId75">
               <w:r>
                 <w:rPr>
                   <w:color w:val="1D5FD1"/>
@@ -3808,7 +4135,7 @@
             </w:tcMar>
           </w:tcPr>
           <w:p>
-            <w:hyperlink r:id="rId61">
+            <w:hyperlink r:id="rId76">
               <w:r>
                 <w:rPr>
                   <w:color w:val="1D5FD1"/>
@@ -3939,7 +4266,7 @@
             </w:tcMar>
           </w:tcPr>
           <w:p>
-            <w:hyperlink r:id="rId62">
+            <w:hyperlink r:id="rId77">
               <w:r>
                 <w:rPr>
                   <w:color w:val="1D5FD1"/>
@@ -4070,7 +4397,7 @@
             </w:tcMar>
           </w:tcPr>
           <w:p>
-            <w:hyperlink r:id="rId63">
+            <w:hyperlink r:id="rId78">
               <w:r>
                 <w:rPr>
                   <w:color w:val="1D5FD1"/>
@@ -4332,7 +4659,7 @@
             </w:tcMar>
           </w:tcPr>
           <w:p>
-            <w:hyperlink r:id="rId64">
+            <w:hyperlink r:id="rId79">
               <w:r>
                 <w:rPr>
                   <w:color w:val="1D5FD1"/>
@@ -4463,7 +4790,7 @@
             </w:tcMar>
           </w:tcPr>
           <w:p>
-            <w:hyperlink r:id="rId65">
+            <w:hyperlink r:id="rId80">
               <w:r>
                 <w:rPr>
                   <w:color w:val="1D5FD1"/>
@@ -4725,7 +5052,7 @@
             </w:tcMar>
           </w:tcPr>
           <w:p>
-            <w:hyperlink r:id="rId66">
+            <w:hyperlink r:id="rId81">
               <w:r>
                 <w:rPr>
                   <w:color w:val="1D5FD1"/>
@@ -4856,7 +5183,7 @@
             </w:tcMar>
           </w:tcPr>
           <w:p>
-            <w:hyperlink r:id="rId67">
+            <w:hyperlink r:id="rId82">
               <w:r>
                 <w:rPr>
                   <w:color w:val="1D5FD1"/>
@@ -4987,7 +5314,7 @@
             </w:tcMar>
           </w:tcPr>
           <w:p>
-            <w:hyperlink r:id="rId68">
+            <w:hyperlink r:id="rId83">
               <w:r>
                 <w:rPr>
                   <w:color w:val="1D5FD1"/>
@@ -5118,7 +5445,7 @@
             </w:tcMar>
           </w:tcPr>
           <w:p>
-            <w:hyperlink r:id="rId69">
+            <w:hyperlink r:id="rId84">
               <w:r>
                 <w:rPr>
                   <w:color w:val="1D5FD1"/>
@@ -5198,7 +5525,7 @@
         <w:pStyle w:val="Heading2"/>
       </w:pPr>
       <w:r>
-        <w:t>01 · Mag7 在 AI 时代从平台垄断转向基础设施再分层</w:t>
+        <w:t>01 · AI 需求扩张与物理交付约束</w:t>
       </w:r>
     </w:p>
     <w:tbl>
@@ -5274,7 +5601,7 @@
                 <w:color w:val="111111"/>
                 <w:sz w:val="18"/>
               </w:rPr>
-              <w:t>2026-07-10｜超大规模厂商资本轮动：从消费内容到 AI 算力</w:t>
+              <w:t>先进封装、设备和算力订单证据继续支持 AI 资本开支扩散，受益范围可能从 GPU 延伸至存储、定制芯片、网络与电力。</w:t>
             </w:r>
           </w:p>
         </w:tc>
@@ -5332,7 +5659,7 @@
                 <w:color w:val="111111"/>
                 <w:sz w:val="18"/>
               </w:rPr>
-              <w:t>2026-07-18 AI 资本开支消化气穴仪表盘:公司与供应链披露</w:t>
+              <w:t>云厂商 Capex 分化、电力并网延迟和变压器约束可能造成服务器交付递延、晶圆扣留与有效产能利用率下降，需求强度未必转化为同期利润。</w:t>
             </w:r>
           </w:p>
         </w:tc>
@@ -5390,7 +5717,7 @@
                 <w:color w:val="111111"/>
                 <w:sz w:val="18"/>
               </w:rPr>
-              <w:t>下一周需要由价格、订单、交付、政策或盈利数据中的至少一项同向确认。</w:t>
+              <w:t>观察云厂商 Capex 指引、已锁定电力容量、实际通电进度、服务器与封装交付以及库存变化是否同步改善。</w:t>
             </w:r>
           </w:p>
         </w:tc>
@@ -5401,7 +5728,7 @@
         <w:pStyle w:val="Heading2"/>
       </w:pPr>
       <w:r>
-        <w:t>02 · A 股硬科技与科创50的复苏需要订单、融资盘和指数结构共振</w:t>
+        <w:t>02 · 电网稀缺租金与扩产执行风险</w:t>
       </w:r>
     </w:p>
     <w:tbl>
@@ -5477,7 +5804,7 @@
                 <w:color w:val="111111"/>
                 <w:sz w:val="18"/>
               </w:rPr>
-              <w:t>前序研究研究报告 — 2026-07-10</w:t>
+              <w:t>GOES、变压器和并网容量约束延长交期，可能提高具备可交付产能、合同保护和服务能力的电网设备商议价权。</w:t>
             </w:r>
           </w:p>
         </w:tc>
@@ -5535,7 +5862,7 @@
                 <w:color w:val="111111"/>
                 <w:sz w:val="18"/>
               </w:rPr>
-              <w:t>算力“千元股集群”拥挤度压力测试报告</w:t>
+              <w:t>稀缺也可能推高项目总成本、延后收入确认，并促使 BTM 自备电源等替代方案分流传统电网需求；许可、燃料和融资又会引入新的风险。</w:t>
             </w:r>
           </w:p>
         </w:tc>
@@ -5593,7 +5920,7 @@
                 <w:color w:val="111111"/>
                 <w:sz w:val="18"/>
               </w:rPr>
-              <w:t>下一周需要由价格、订单、交付、政策或盈利数据中的至少一项同向确认。</w:t>
+              <w:t>观察变压器交期、在手订单转收入、项目延期比例、并网排队变化，以及 BTM 项目的许可、融资与商业运行进展。</w:t>
             </w:r>
           </w:p>
         </w:tc>
@@ -5604,7 +5931,7 @@
         <w:pStyle w:val="Heading2"/>
       </w:pPr>
       <w:r>
-        <w:t>03 · DeepSeek 式低价模型正在重塑 AI 定价权与软件利润池</w:t>
+        <w:t>03 · A股硬科技订单与交易结构</w:t>
       </w:r>
     </w:p>
     <w:tbl>
@@ -5680,7 +6007,7 @@
                 <w:color w:val="111111"/>
                 <w:sz w:val="18"/>
               </w:rPr>
-              <w:t>硬件稀缺与 Token 通缩：AI 算力层级的“大分流”</w:t>
+              <w:t>先进封装、半导体设备和光通信仍有订单与利润兑现研究支持，产业方向没有被推翻。价差或研究关注本身并非这里的依据。</w:t>
             </w:r>
           </w:p>
         </w:tc>
@@ -5738,7 +6065,7 @@
                 <w:color w:val="111111"/>
                 <w:sz w:val="18"/>
               </w:rPr>
-              <w:t>DeepSeek V4 极低成本对国内云价格战与 A 股软件板块利润率的影响</w:t>
+              <w:t>融资集中、ETF 被动配置、成分股宽度不足和解禁压力可能使交易结构先于基本面转弱；本期没有市场报价数据，无法确认这些风险已经解除。</w:t>
             </w:r>
           </w:p>
         </w:tc>
@@ -5796,7 +6123,210 @@
                 <w:color w:val="111111"/>
                 <w:sz w:val="18"/>
               </w:rPr>
-              <w:t>下一周需要由价格、订单、交付、政策或盈利数据中的至少一项同向确认。</w:t>
+              <w:t>融资余额、ETF 申赎、北向资金、成分股宽度与公司订单是否至少连续两个观察窗口同向改善。</w:t>
+            </w:r>
+          </w:p>
+        </w:tc>
+      </w:tr>
+    </w:tbl>
+    <w:p>
+      <w:pPr>
+        <w:pStyle w:val="Heading2"/>
+      </w:pPr>
+      <w:r>
+        <w:t>04 · 油气现金流防御与宏观增长税</w:t>
+      </w:r>
+    </w:p>
+    <w:tbl>
+      <w:tblPr>
+        <w:tblW w:type="dxa" w:w="9360"/>
+        <w:jc w:val="left"/>
+        <w:tblLayout w:type="fixed"/>
+        <w:tblLook w:firstColumn="1" w:firstRow="1" w:lastColumn="0" w:lastRow="0" w:noHBand="0" w:noVBand="1" w:val="04A0"/>
+        <w:tblInd w:w="120" w:type="dxa"/>
+        <w:tblBorders>
+          <w:top w:val="single" w:sz="4" w:color="C8CDD3"/>
+          <w:left w:val="single" w:sz="4" w:color="C8CDD3"/>
+          <w:bottom w:val="single" w:sz="4" w:color="C8CDD3"/>
+          <w:right w:val="single" w:sz="4" w:color="C8CDD3"/>
+          <w:insideH w:val="single" w:sz="4" w:color="C8CDD3"/>
+          <w:insideV w:val="single" w:sz="4" w:color="C8CDD3"/>
+        </w:tblBorders>
+      </w:tblPr>
+      <w:tblGrid>
+        <w:gridCol w:w="1350"/>
+        <w:gridCol w:w="8010"/>
+      </w:tblGrid>
+      <w:tr>
+        <w:trPr>
+          <w:cantSplit/>
+        </w:trPr>
+        <w:tc>
+          <w:tcPr>
+            <w:tcW w:type="dxa" w:w="1350"/>
+            <w:tcMar>
+              <w:top w:w="80" w:type="dxa"/>
+              <w:bottom w:w="80" w:type="dxa"/>
+              <w:start w:w="120" w:type="dxa"/>
+              <w:end w:w="120" w:type="dxa"/>
+            </w:tcMar>
+            <w:vAlign w:val="top"/>
+            <w:shd w:fill="F2F4F7"/>
+          </w:tcPr>
+          <w:p>
+            <w:pPr>
+              <w:spacing w:before="0" w:after="0" w:line="252" w:lineRule="auto"/>
+            </w:pPr>
+            <w:r>
+              <w:rPr>
+                <w:rFonts w:ascii="Calibri" w:hAnsi="Calibri" w:eastAsia="Hiragino Sans GB"/>
+                <w:b/>
+                <w:color w:val="18864B"/>
+                <w:sz w:val="16"/>
+              </w:rPr>
+              <w:t>SUPPORT</w:t>
+            </w:r>
+          </w:p>
+        </w:tc>
+        <w:tc>
+          <w:tcPr>
+            <w:tcW w:type="dxa" w:w="8010"/>
+            <w:tcMar>
+              <w:top w:w="80" w:type="dxa"/>
+              <w:bottom w:w="80" w:type="dxa"/>
+              <w:start w:w="120" w:type="dxa"/>
+              <w:end w:w="120" w:type="dxa"/>
+            </w:tcMar>
+            <w:vAlign w:val="top"/>
+          </w:tcPr>
+          <w:p>
+            <w:pPr>
+              <w:spacing w:before="0" w:after="0" w:line="252" w:lineRule="auto"/>
+            </w:pPr>
+            <w:r>
+              <w:rPr>
+                <w:rFonts w:ascii="Calibri" w:hAnsi="Calibri" w:eastAsia="Hiragino Sans GB"/>
+                <w:b w:val="0"/>
+                <w:color w:val="111111"/>
+                <w:sz w:val="18"/>
+              </w:rPr>
+              <w:t>能源价格韧性能够支撑部分油气公司的分红与自由现金流，并为组合提供再通胀对冲。硬科技之外的现金流来源因此仍有配置研究价值。</w:t>
+            </w:r>
+          </w:p>
+        </w:tc>
+      </w:tr>
+      <w:tr>
+        <w:trPr>
+          <w:cantSplit/>
+        </w:trPr>
+        <w:tc>
+          <w:tcPr>
+            <w:tcW w:type="dxa" w:w="1350"/>
+            <w:tcMar>
+              <w:top w:w="80" w:type="dxa"/>
+              <w:bottom w:w="80" w:type="dxa"/>
+              <w:start w:w="120" w:type="dxa"/>
+              <w:end w:w="120" w:type="dxa"/>
+            </w:tcMar>
+            <w:vAlign w:val="top"/>
+            <w:shd w:fill="F2F4F7"/>
+          </w:tcPr>
+          <w:p>
+            <w:pPr>
+              <w:spacing w:before="0" w:after="0" w:line="252" w:lineRule="auto"/>
+            </w:pPr>
+            <w:r>
+              <w:rPr>
+                <w:rFonts w:ascii="Calibri" w:hAnsi="Calibri" w:eastAsia="Hiragino Sans GB"/>
+                <w:b/>
+                <w:color w:val="C92A2A"/>
+                <w:sz w:val="16"/>
+              </w:rPr>
+              <w:t>CHALLENGE</w:t>
+            </w:r>
+          </w:p>
+        </w:tc>
+        <w:tc>
+          <w:tcPr>
+            <w:tcW w:type="dxa" w:w="8010"/>
+            <w:tcMar>
+              <w:top w:w="80" w:type="dxa"/>
+              <w:bottom w:w="80" w:type="dxa"/>
+              <w:start w:w="120" w:type="dxa"/>
+              <w:end w:w="120" w:type="dxa"/>
+            </w:tcMar>
+            <w:vAlign w:val="top"/>
+          </w:tcPr>
+          <w:p>
+            <w:pPr>
+              <w:spacing w:before="0" w:after="0" w:line="252" w:lineRule="auto"/>
+            </w:pPr>
+            <w:r>
+              <w:rPr>
+                <w:rFonts w:ascii="Calibri" w:hAnsi="Calibri" w:eastAsia="Hiragino Sans GB"/>
+                <w:b w:val="0"/>
+                <w:color w:val="111111"/>
+                <w:sz w:val="18"/>
+              </w:rPr>
+              <w:t>同一油价冲击会挤压中国中下游制造业利润、推高通胀预期和实际利率，并削弱低现金仓位下的回撤承接能力。能源腿的收益可能对应更广泛风险资产的估值压力。</w:t>
+            </w:r>
+          </w:p>
+        </w:tc>
+      </w:tr>
+      <w:tr>
+        <w:trPr>
+          <w:cantSplit/>
+        </w:trPr>
+        <w:tc>
+          <w:tcPr>
+            <w:tcW w:type="dxa" w:w="1350"/>
+            <w:tcMar>
+              <w:top w:w="80" w:type="dxa"/>
+              <w:bottom w:w="80" w:type="dxa"/>
+              <w:start w:w="120" w:type="dxa"/>
+              <w:end w:w="120" w:type="dxa"/>
+            </w:tcMar>
+            <w:vAlign w:val="top"/>
+            <w:shd w:fill="F2F4F7"/>
+          </w:tcPr>
+          <w:p>
+            <w:pPr>
+              <w:spacing w:before="0" w:after="0" w:line="252" w:lineRule="auto"/>
+            </w:pPr>
+            <w:r>
+              <w:rPr>
+                <w:rFonts w:ascii="Calibri" w:hAnsi="Calibri" w:eastAsia="Hiragino Sans GB"/>
+                <w:b/>
+                <w:color w:val="D85B16"/>
+                <w:sz w:val="16"/>
+              </w:rPr>
+              <w:t>RESOLVE</w:t>
+            </w:r>
+          </w:p>
+        </w:tc>
+        <w:tc>
+          <w:tcPr>
+            <w:tcW w:type="dxa" w:w="8010"/>
+            <w:tcMar>
+              <w:top w:w="80" w:type="dxa"/>
+              <w:bottom w:w="80" w:type="dxa"/>
+              <w:start w:w="120" w:type="dxa"/>
+              <w:end w:w="120" w:type="dxa"/>
+            </w:tcMar>
+            <w:vAlign w:val="top"/>
+          </w:tcPr>
+          <w:p>
+            <w:pPr>
+              <w:spacing w:before="0" w:after="0" w:line="252" w:lineRule="auto"/>
+            </w:pPr>
+            <w:r>
+              <w:rPr>
+                <w:rFonts w:ascii="Calibri" w:hAnsi="Calibri" w:eastAsia="Hiragino Sans GB"/>
+                <w:b w:val="0"/>
+                <w:color w:val="111111"/>
+                <w:sz w:val="18"/>
+              </w:rPr>
+              <w:t>观察 CPI/PCE、油价传导、制造业利润率、实际利率和能源企业自由现金流是否显示“现金流受益”大于“需求破坏”。</w:t>
             </w:r>
           </w:p>
         </w:tc>
@@ -5815,7 +6345,7 @@
         <w:pStyle w:val="Heading2"/>
       </w:pPr>
       <w:r>
-        <w:t>01 · AI 电力/电网设备：并网排队和变压器交期是否继续拉长</w:t>
+        <w:t>01 · 云厂商 Capex 指引与订单兑现</w:t>
       </w:r>
     </w:p>
     <w:p>
@@ -5829,7 +6359,7 @@
           <w:color w:val="5E6268"/>
           <w:sz w:val="22"/>
         </w:rPr>
-        <w:t>该信号决定 OVERWEIGHT 配置能否从研究判断转化为可验证的组合结果。</w:t>
+        <w:t>这是 Mag7、AI 半导体、先进封装和 CPO 的共同收入源，能区分真实需求扩张与预算内部迁移。</w:t>
       </w:r>
     </w:p>
     <w:tbl>
@@ -5906,7 +6436,7 @@
                 <w:color w:val="111111"/>
                 <w:sz w:val="17"/>
               </w:rPr>
-              <w:t>并网排队和变压器交期是否继续拉长</w:t>
+              <w:t>主要云厂商维持或上修 Capex 指引，同时供应商披露订单、交付和自由现金流改善，且没有新增大规模递延。</w:t>
             </w:r>
           </w:p>
         </w:tc>
@@ -5932,7 +6462,7 @@
                 <w:color w:val="111111"/>
                 <w:sz w:val="17"/>
               </w:rPr>
-              <w:t>在既定赛道上限内优先增加证据最强的核心标的。</w:t>
+              <w:t>维持 AI 半导体 TRIM 的集中度纪律，但把新增风险预算优先分配给订单清晰、产品结构改善和现金流可验证的封装、存储、定制芯片及互联环节。</w:t>
             </w:r>
           </w:p>
         </w:tc>
@@ -5990,7 +6520,7 @@
                 <w:color w:val="111111"/>
                 <w:sz w:val="17"/>
               </w:rPr>
-              <w:t>风险事件继续高于支持事件，且最新证据没有修复。</w:t>
+              <w:t>云厂商下修或延后 Capex，供应商披露交付递延、客户验收放缓或库存上升。</w:t>
             </w:r>
           </w:p>
         </w:tc>
@@ -6016,7 +6546,7 @@
                 <w:color w:val="111111"/>
                 <w:sz w:val="17"/>
               </w:rPr>
-              <w:t>降低相关暴露，回到观察状态，并重新比较替代赛道。</w:t>
+              <w:t>继续降低单一加速器及高固定成本供应链暴露，暂停 Mag7、CPO 与先进封装试仓，保留现金流和防御资产。</w:t>
             </w:r>
           </w:p>
         </w:tc>
@@ -6027,7 +6557,7 @@
         <w:pStyle w:val="Heading2"/>
       </w:pPr>
       <w:r>
-        <w:t>02 · A股半导体/两融负 Gamma：融资余额、ETF 申赎和北向资金是否同向</w:t>
+        <w:t>02 · 通电时间与电网设备交付</w:t>
       </w:r>
     </w:p>
     <w:p>
@@ -6041,7 +6571,7 @@
           <w:color w:val="5E6268"/>
           <w:sz w:val="22"/>
         </w:rPr>
-        <w:t>该信号决定 UNDERWEIGHT 配置能否从研究判断转化为可验证的组合结果。</w:t>
+        <w:t>电力已从 AI 需求的背景条件变成订单能否转化为收入的串行闸门。拥挤的研究关注不能替代真实通电。</w:t>
       </w:r>
     </w:p>
     <w:tbl>
@@ -6118,7 +6648,7 @@
                 <w:color w:val="111111"/>
                 <w:sz w:val="17"/>
               </w:rPr>
-              <w:t>融资余额、ETF 申赎和北向资金是否同向</w:t>
+              <w:t>并网排队缩短、变压器交期稳定或改善、已锁定电力容量增加，且设备在手订单按期转化为交付。</w:t>
             </w:r>
           </w:p>
         </w:tc>
@@ -6144,7 +6674,7 @@
                 <w:color w:val="111111"/>
                 <w:sz w:val="17"/>
               </w:rPr>
-              <w:t>维持低配并等待第二条确认。</w:t>
+              <w:t>保持 AI 电力/电网设备的相对高权重，但进一步集中于已锁单、可交付、有合同保护的 GEV、ETN、002028.SZ、600089.SH、601179.SH 等观察对象。</w:t>
             </w:r>
           </w:p>
         </w:tc>
@@ -6202,7 +6732,7 @@
                 <w:color w:val="111111"/>
                 <w:sz w:val="17"/>
               </w:rPr>
-              <w:t>风险事件继续高于支持事件，且最新证据没有修复。</w:t>
+              <w:t>并网延期继续扩大、变压器或 GOES 交付恶化、项目收入确认推迟，或 BTM 项目因许可和融资无法落地。</w:t>
             </w:r>
           </w:p>
         </w:tc>
@@ -6228,7 +6758,7 @@
                 <w:color w:val="111111"/>
                 <w:sz w:val="17"/>
               </w:rPr>
-              <w:t>降低相关暴露，回到观察状态，并重新比较替代赛道。</w:t>
+              <w:t>削减只有稀缺叙事、缺少交付和合同保护的电力主题暴露，同时下调受通电延期影响更大的服务器与封装链风险预算。</w:t>
             </w:r>
           </w:p>
         </w:tc>
@@ -6239,7 +6769,7 @@
         <w:pStyle w:val="Heading2"/>
       </w:pPr>
       <w:r>
-        <w:t>03 · 先进封装/HBM4 闸门：云厂商 capex 指引是否继续上修</w:t>
+        <w:t>03 · A股融资、ETF、北向资金与市场宽度共振</w:t>
       </w:r>
     </w:p>
     <w:p>
@@ -6253,7 +6783,7 @@
           <w:color w:val="5E6268"/>
           <w:sz w:val="22"/>
         </w:rPr>
-        <w:t>该信号决定 NEUTRAL 配置能否从研究判断转化为可验证的组合结果。</w:t>
+        <w:t>该组合信号决定红利/硬科技杠铃、科创50和中国权益流动性是否能从观察状态进入受控试仓。</w:t>
       </w:r>
     </w:p>
     <w:tbl>
@@ -6330,7 +6860,7 @@
                 <w:color w:val="111111"/>
                 <w:sz w:val="17"/>
               </w:rPr>
-              <w:t>云厂商 capex 指引是否继续上修</w:t>
+              <w:t>融资余额停止收缩并呈稳定改善，相关 ETF 出现持续净申购，北向资金方向一致，且上涨或盈利改善不再集中于少数权重股。</w:t>
             </w:r>
           </w:p>
         </w:tc>
@@ -6356,7 +6886,7 @@
                 <w:color w:val="111111"/>
                 <w:sz w:val="17"/>
               </w:rPr>
-              <w:t>在既定赛道上限内优先增加证据最强的核心标的。</w:t>
+              <w:t>小幅启用杠铃风险预算：红利腿选择现金流稳健的非银红利，硬科技腿选择订单兑现度高的设备、封装与互联标的，避免一次性指数化加仓。</w:t>
             </w:r>
           </w:p>
         </w:tc>
@@ -6414,7 +6944,7 @@
                 <w:color w:val="111111"/>
                 <w:sz w:val="17"/>
               </w:rPr>
-              <w:t>风险事件继续高于支持事件，且最新证据没有修复。</w:t>
+              <w:t>杠杆继续收缩、ETF 转为持续净赎回、北向资金方向相反，或成分股宽度进一步恶化并伴随尾盘流动性放大。</w:t>
             </w:r>
           </w:p>
         </w:tc>
@@ -6440,7 +6970,7 @@
                 <w:color w:val="111111"/>
                 <w:sz w:val="17"/>
               </w:rPr>
-              <w:t>降低相关暴露，回到观察状态，并重新比较替代赛道。</w:t>
+              <w:t>维持 HOLD，压低科创50及高融资集中标的，保留非银红利和流动性缓冲，不把政策支持研究直接转化为仓位。</w:t>
             </w:r>
           </w:p>
         </w:tc>
@@ -6451,7 +6981,7 @@
         <w:pStyle w:val="Heading2"/>
       </w:pPr>
       <w:r>
-        <w:t>04 · A股风险偏好/两融：融资余额、ETF 申赎和北向资金是否同向</w:t>
+        <w:t>04 · CPI/PCE、油价与实际利率联动</w:t>
       </w:r>
     </w:p>
     <w:p>
@@ -6465,7 +6995,7 @@
           <w:color w:val="5E6268"/>
           <w:sz w:val="22"/>
         </w:rPr>
-        <w:t>该信号决定 UNDERWEIGHT 配置能否从研究判断转化为可验证的组合结果。</w:t>
+        <w:t>该信号同时约束 AI 久期、红利类债属性、油气现金流和黄金/美债对冲效率。单独观察任何一个变量都可能误判。</w:t>
       </w:r>
     </w:p>
     <w:tbl>
@@ -6542,7 +7072,7 @@
                 <w:color w:val="111111"/>
                 <w:sz w:val="17"/>
               </w:rPr>
-              <w:t>融资余额、ETF 申赎和北向资金是否同向</w:t>
+              <w:t>CPI/PCE 压力缓和，油价未继续形成成本传导，实际利率稳定或回落。</w:t>
             </w:r>
           </w:p>
         </w:tc>
@@ -6568,7 +7098,7 @@
                 <w:color w:val="111111"/>
                 <w:sz w:val="17"/>
               </w:rPr>
-              <w:t>维持低配并等待第二条确认。</w:t>
+              <w:t>在不改变当前 HOLD 的前提下，逐步恢复长久期成长和 TLT 等久期观察资产的试仓条件，同时降低纯再通胀对冲的边际权重。</w:t>
             </w:r>
           </w:p>
         </w:tc>
@@ -6626,7 +7156,7 @@
                 <w:color w:val="111111"/>
                 <w:sz w:val="17"/>
               </w:rPr>
-              <w:t>风险事件继续高于支持事件，且最新证据没有修复。</w:t>
+              <w:t>CPI/PCE 再加速，油价持续向核心通胀传导，实际利率同步上行。</w:t>
             </w:r>
           </w:p>
         </w:tc>
@@ -6652,7 +7182,7 @@
                 <w:color w:val="111111"/>
                 <w:sz w:val="17"/>
               </w:rPr>
-              <w:t>降低相关暴露，回到观察状态，并重新比较替代赛道。</w:t>
+              <w:t>继续压缩高久期与高估值集中暴露，维持油气现金流、GLD 和短久期防御研究篮子，并重新压力测试红利类债属性。</w:t>
             </w:r>
           </w:p>
         </w:tc>
@@ -6663,7 +7193,7 @@
         <w:pStyle w:val="Heading2"/>
       </w:pPr>
       <w:r>
-        <w:t>05 · AI 算力半导体：CPI/PCE 与油价是否重新推高实际利率</w:t>
+        <w:t>05 · CPO 订单、利润与交易宽度</w:t>
       </w:r>
     </w:p>
     <w:p>
@@ -6677,7 +7207,7 @@
           <w:color w:val="5E6268"/>
           <w:sz w:val="22"/>
         </w:rPr>
-        <w:t>该信号决定 NEUTRAL 配置能否从研究判断转化为可验证的组合结果。</w:t>
+        <w:t>CPO 的产业逻辑与交易拥挤可以同时成立；只有基本面兑现并向更多成分扩散，才足以解除 HOLD。</w:t>
       </w:r>
     </w:p>
     <w:tbl>
@@ -6754,7 +7284,7 @@
                 <w:color w:val="111111"/>
                 <w:sz w:val="17"/>
               </w:rPr>
-              <w:t>CPI/PCE 与油价是否重新推高实际利率</w:t>
+              <w:t>云厂商继续上修网络 Capex，光模块及高速互联厂商披露订单和利润改善，同时融资集中度下降、成分股宽度扩大。</w:t>
             </w:r>
           </w:p>
         </w:tc>
@@ -6780,7 +7310,7 @@
                 <w:color w:val="111111"/>
                 <w:sz w:val="17"/>
               </w:rPr>
-              <w:t>在既定赛道上限内优先增加证据最强的核心标的。</w:t>
+              <w:t>以分批试错方式提高 AVGO、MRVL、COHR、LITE、300308.SZ、300394.SZ 等互联篮子的风险预算，并保持供应链分散。</w:t>
             </w:r>
           </w:p>
         </w:tc>
@@ -6838,7 +7368,7 @@
                 <w:color w:val="111111"/>
                 <w:sz w:val="17"/>
               </w:rPr>
-              <w:t>风险事件继续高于支持事件，且最新证据没有修复。</w:t>
+              <w:t>网络 Capex 延后、订单或利润指引转弱，或基本面尚未恶化但融资和交易继续向少数标的集中。</w:t>
             </w:r>
           </w:p>
         </w:tc>
@@ -6864,7 +7394,7 @@
                 <w:color w:val="111111"/>
                 <w:sz w:val="17"/>
               </w:rPr>
-              <w:t>降低相关暴露，回到观察状态，并重新比较替代赛道。</w:t>
+              <w:t>维持 HOLD 或进一步降权拥挤标的，把 AI 基建预算转向订单与交付确定性更高的电力设备、存储或定制芯片环节。</w:t>
             </w:r>
           </w:p>
         </w:tc>
@@ -7447,10 +7977,10 @@
               <w:rPr>
                 <w:rFonts w:ascii="Calibri" w:hAnsi="Calibri" w:eastAsia="Hiragino Sans GB"/>
                 <w:b/>
-                <w:color w:val="D85B16"/>
+                <w:color w:val="18864B"/>
                 <w:sz w:val="16"/>
               </w:rPr>
-              <w:t>warn · deterministic_grounded</w:t>
+              <w:t>pass · structured_llm</w:t>
             </w:r>
           </w:p>
         </w:tc>
@@ -7754,7 +8284,7 @@
             <w:pPr>
               <w:spacing w:after="20"/>
             </w:pPr>
-            <w:hyperlink r:id="rId70">
+            <w:hyperlink r:id="rId85">
               <w:r>
                 <w:rPr>
                   <w:color w:val="1D5FD1"/>
@@ -7872,7 +8402,7 @@
             <w:pPr>
               <w:spacing w:after="20"/>
             </w:pPr>
-            <w:hyperlink r:id="rId33">
+            <w:hyperlink r:id="rId39">
               <w:r>
                 <w:rPr>
                   <w:color w:val="1D5FD1"/>
@@ -7990,7 +8520,7 @@
             <w:pPr>
               <w:spacing w:after="20"/>
             </w:pPr>
-            <w:hyperlink r:id="rId71">
+            <w:hyperlink r:id="rId34">
               <w:r>
                 <w:rPr>
                   <w:color w:val="1D5FD1"/>
@@ -8226,7 +8756,7 @@
             <w:pPr>
               <w:spacing w:after="20"/>
             </w:pPr>
-            <w:hyperlink r:id="rId29">
+            <w:hyperlink r:id="rId86">
               <w:r>
                 <w:rPr>
                   <w:color w:val="1D5FD1"/>
@@ -8344,7 +8874,7 @@
             <w:pPr>
               <w:spacing w:after="20"/>
             </w:pPr>
-            <w:hyperlink r:id="rId72">
+            <w:hyperlink r:id="rId87">
               <w:r>
                 <w:rPr>
                   <w:color w:val="1D5FD1"/>
@@ -8462,7 +8992,7 @@
             <w:pPr>
               <w:spacing w:after="20"/>
             </w:pPr>
-            <w:hyperlink r:id="rId35">
+            <w:hyperlink r:id="rId88">
               <w:r>
                 <w:rPr>
                   <w:color w:val="1D5FD1"/>
@@ -8580,7 +9110,7 @@
             <w:pPr>
               <w:spacing w:after="20"/>
             </w:pPr>
-            <w:hyperlink r:id="rId34">
+            <w:hyperlink r:id="rId35">
               <w:r>
                 <w:rPr>
                   <w:color w:val="1D5FD1"/>
@@ -8934,7 +9464,7 @@
             <w:pPr>
               <w:spacing w:after="20"/>
             </w:pPr>
-            <w:hyperlink r:id="rId31">
+            <w:hyperlink r:id="rId32">
               <w:r>
                 <w:rPr>
                   <w:color w:val="1D5FD1"/>
@@ -9052,7 +9582,7 @@
             <w:pPr>
               <w:spacing w:after="20"/>
             </w:pPr>
-            <w:hyperlink r:id="rId73">
+            <w:hyperlink r:id="rId89">
               <w:r>
                 <w:rPr>
                   <w:color w:val="1D5FD1"/>
@@ -9170,7 +9700,7 @@
             <w:pPr>
               <w:spacing w:after="20"/>
             </w:pPr>
-            <w:hyperlink r:id="rId74">
+            <w:hyperlink r:id="rId90">
               <w:r>
                 <w:rPr>
                   <w:color w:val="1D5FD1"/>
@@ -9288,7 +9818,7 @@
             <w:pPr>
               <w:spacing w:after="20"/>
             </w:pPr>
-            <w:hyperlink r:id="rId75">
+            <w:hyperlink r:id="rId36">
               <w:r>
                 <w:rPr>
                   <w:color w:val="1D5FD1"/>
@@ -9524,7 +10054,7 @@
             <w:pPr>
               <w:spacing w:after="20"/>
             </w:pPr>
-            <w:hyperlink r:id="rId76">
+            <w:hyperlink r:id="rId91">
               <w:r>
                 <w:rPr>
                   <w:color w:val="1D5FD1"/>
@@ -9642,7 +10172,7 @@
             <w:pPr>
               <w:spacing w:after="20"/>
             </w:pPr>
-            <w:hyperlink r:id="rId77">
+            <w:hyperlink r:id="rId31">
               <w:r>
                 <w:rPr>
                   <w:color w:val="1D5FD1"/>
@@ -9760,7 +10290,7 @@
             <w:pPr>
               <w:spacing w:after="20"/>
             </w:pPr>
-            <w:hyperlink r:id="rId78">
+            <w:hyperlink r:id="rId92">
               <w:r>
                 <w:rPr>
                   <w:color w:val="1D5FD1"/>
@@ -9878,7 +10408,7 @@
             <w:pPr>
               <w:spacing w:after="20"/>
             </w:pPr>
-            <w:hyperlink r:id="rId79">
+            <w:hyperlink r:id="rId93">
               <w:r>
                 <w:rPr>
                   <w:color w:val="1D5FD1"/>
@@ -9996,7 +10526,7 @@
             <w:pPr>
               <w:spacing w:after="20"/>
             </w:pPr>
-            <w:hyperlink r:id="rId80">
+            <w:hyperlink r:id="rId94">
               <w:r>
                 <w:rPr>
                   <w:color w:val="1D5FD1"/>
@@ -10114,7 +10644,7 @@
             <w:pPr>
               <w:spacing w:after="20"/>
             </w:pPr>
-            <w:hyperlink r:id="rId25">
+            <w:hyperlink r:id="rId23">
               <w:r>
                 <w:rPr>
                   <w:color w:val="1D5FD1"/>
@@ -10232,7 +10762,7 @@
             <w:pPr>
               <w:spacing w:after="20"/>
             </w:pPr>
-            <w:hyperlink r:id="rId81">
+            <w:hyperlink r:id="rId24">
               <w:r>
                 <w:rPr>
                   <w:color w:val="1D5FD1"/>
@@ -10350,7 +10880,7 @@
             <w:pPr>
               <w:spacing w:after="20"/>
             </w:pPr>
-            <w:hyperlink r:id="rId82">
+            <w:hyperlink r:id="rId95">
               <w:r>
                 <w:rPr>
                   <w:color w:val="1D5FD1"/>
@@ -10468,7 +10998,7 @@
             <w:pPr>
               <w:spacing w:after="20"/>
             </w:pPr>
-            <w:hyperlink r:id="rId83">
+            <w:hyperlink r:id="rId25">
               <w:r>
                 <w:rPr>
                   <w:color w:val="1D5FD1"/>
@@ -10586,7 +11116,7 @@
             <w:pPr>
               <w:spacing w:after="20"/>
             </w:pPr>
-            <w:hyperlink r:id="rId84">
+            <w:hyperlink r:id="rId38">
               <w:r>
                 <w:rPr>
                   <w:color w:val="1D5FD1"/>
@@ -10704,7 +11234,7 @@
             <w:pPr>
               <w:spacing w:after="20"/>
             </w:pPr>
-            <w:hyperlink r:id="rId85">
+            <w:hyperlink r:id="rId40">
               <w:r>
                 <w:rPr>
                   <w:color w:val="1D5FD1"/>
@@ -10822,7 +11352,7 @@
             <w:pPr>
               <w:spacing w:after="20"/>
             </w:pPr>
-            <w:hyperlink r:id="rId86">
+            <w:hyperlink r:id="rId96">
               <w:r>
                 <w:rPr>
                   <w:color w:val="1D5FD1"/>
@@ -10940,7 +11470,7 @@
             <w:pPr>
               <w:spacing w:after="20"/>
             </w:pPr>
-            <w:hyperlink r:id="rId87">
+            <w:hyperlink r:id="rId97">
               <w:r>
                 <w:rPr>
                   <w:color w:val="1D5FD1"/>
@@ -11058,7 +11588,7 @@
             <w:pPr>
               <w:spacing w:after="20"/>
             </w:pPr>
-            <w:hyperlink r:id="rId88">
+            <w:hyperlink r:id="rId98">
               <w:r>
                 <w:rPr>
                   <w:color w:val="1D5FD1"/>
@@ -11176,7 +11706,7 @@
             <w:pPr>
               <w:spacing w:after="20"/>
             </w:pPr>
-            <w:hyperlink r:id="rId89">
+            <w:hyperlink r:id="rId99">
               <w:r>
                 <w:rPr>
                   <w:color w:val="1D5FD1"/>
@@ -11294,7 +11824,7 @@
             <w:pPr>
               <w:spacing w:after="20"/>
             </w:pPr>
-            <w:hyperlink r:id="rId90">
+            <w:hyperlink r:id="rId100">
               <w:r>
                 <w:rPr>
                   <w:color w:val="1D5FD1"/>
@@ -11412,7 +11942,7 @@
             <w:pPr>
               <w:spacing w:after="20"/>
             </w:pPr>
-            <w:hyperlink r:id="rId91">
+            <w:hyperlink r:id="rId101">
               <w:r>
                 <w:rPr>
                   <w:color w:val="1D5FD1"/>
@@ -11530,7 +12060,7 @@
             <w:pPr>
               <w:spacing w:after="20"/>
             </w:pPr>
-            <w:hyperlink r:id="rId92">
+            <w:hyperlink r:id="rId102">
               <w:r>
                 <w:rPr>
                   <w:color w:val="1D5FD1"/>
@@ -11648,7 +12178,7 @@
             <w:pPr>
               <w:spacing w:after="20"/>
             </w:pPr>
-            <w:hyperlink r:id="rId93">
+            <w:hyperlink r:id="rId103">
               <w:r>
                 <w:rPr>
                   <w:color w:val="1D5FD1"/>
@@ -11766,7 +12296,7 @@
             <w:pPr>
               <w:spacing w:after="20"/>
             </w:pPr>
-            <w:hyperlink r:id="rId94">
+            <w:hyperlink r:id="rId104">
               <w:r>
                 <w:rPr>
                   <w:color w:val="1D5FD1"/>
@@ -11884,7 +12414,7 @@
             <w:pPr>
               <w:spacing w:after="20"/>
             </w:pPr>
-            <w:hyperlink r:id="rId95">
+            <w:hyperlink r:id="rId29">
               <w:r>
                 <w:rPr>
                   <w:color w:val="1D5FD1"/>
@@ -12002,7 +12532,7 @@
             <w:pPr>
               <w:spacing w:after="20"/>
             </w:pPr>
-            <w:hyperlink r:id="rId23">
+            <w:hyperlink r:id="rId28">
               <w:r>
                 <w:rPr>
                   <w:color w:val="1D5FD1"/>
@@ -12120,7 +12650,7 @@
             <w:pPr>
               <w:spacing w:after="20"/>
             </w:pPr>
-            <w:hyperlink r:id="rId24">
+            <w:hyperlink r:id="rId105">
               <w:r>
                 <w:rPr>
                   <w:color w:val="1D5FD1"/>
@@ -12238,7 +12768,7 @@
             <w:pPr>
               <w:spacing w:after="20"/>
             </w:pPr>
-            <w:hyperlink r:id="rId96">
+            <w:hyperlink r:id="rId106">
               <w:r>
                 <w:rPr>
                   <w:color w:val="1D5FD1"/>
@@ -12356,7 +12886,7 @@
             <w:pPr>
               <w:spacing w:after="20"/>
             </w:pPr>
-            <w:hyperlink r:id="rId28">
+            <w:hyperlink r:id="rId107">
               <w:r>
                 <w:rPr>
                   <w:color w:val="1D5FD1"/>
@@ -12474,7 +13004,7 @@
             <w:pPr>
               <w:spacing w:after="20"/>
             </w:pPr>
-            <w:hyperlink r:id="rId97">
+            <w:hyperlink r:id="rId108">
               <w:r>
                 <w:rPr>
                   <w:color w:val="1D5FD1"/>
@@ -12592,7 +13122,7 @@
             <w:pPr>
               <w:spacing w:after="20"/>
             </w:pPr>
-            <w:hyperlink r:id="rId98">
+            <w:hyperlink r:id="rId109">
               <w:r>
                 <w:rPr>
                   <w:color w:val="1D5FD1"/>
@@ -12710,7 +13240,7 @@
             <w:pPr>
               <w:spacing w:after="20"/>
             </w:pPr>
-            <w:hyperlink r:id="rId99">
+            <w:hyperlink r:id="rId110">
               <w:r>
                 <w:rPr>
                   <w:color w:val="1D5FD1"/>
@@ -12828,7 +13358,7 @@
             <w:pPr>
               <w:spacing w:after="20"/>
             </w:pPr>
-            <w:hyperlink r:id="rId100">
+            <w:hyperlink r:id="rId111">
               <w:r>
                 <w:rPr>
                   <w:color w:val="1D5FD1"/>
@@ -12946,7 +13476,7 @@
             <w:pPr>
               <w:spacing w:after="20"/>
             </w:pPr>
-            <w:hyperlink r:id="rId101">
+            <w:hyperlink r:id="rId112">
               <w:r>
                 <w:rPr>
                   <w:color w:val="1D5FD1"/>
@@ -13064,7 +13594,7 @@
             <w:pPr>
               <w:spacing w:after="20"/>
             </w:pPr>
-            <w:hyperlink r:id="rId102">
+            <w:hyperlink r:id="rId113">
               <w:r>
                 <w:rPr>
                   <w:color w:val="1D5FD1"/>
@@ -13182,7 +13712,7 @@
             <w:pPr>
               <w:spacing w:after="20"/>
             </w:pPr>
-            <w:hyperlink r:id="rId103">
+            <w:hyperlink r:id="rId114">
               <w:r>
                 <w:rPr>
                   <w:color w:val="1D5FD1"/>
@@ -13300,7 +13830,7 @@
             <w:pPr>
               <w:spacing w:after="20"/>
             </w:pPr>
-            <w:hyperlink r:id="rId104">
+            <w:hyperlink r:id="rId115">
               <w:r>
                 <w:rPr>
                   <w:color w:val="1D5FD1"/>
@@ -13418,7 +13948,7 @@
             <w:pPr>
               <w:spacing w:after="20"/>
             </w:pPr>
-            <w:hyperlink r:id="rId105">
+            <w:hyperlink r:id="rId42">
               <w:r>
                 <w:rPr>
                   <w:color w:val="1D5FD1"/>
@@ -13536,7 +14066,7 @@
             <w:pPr>
               <w:spacing w:after="20"/>
             </w:pPr>
-            <w:hyperlink r:id="rId106">
+            <w:hyperlink r:id="rId116">
               <w:r>
                 <w:rPr>
                   <w:color w:val="1D5FD1"/>
@@ -13654,7 +14184,7 @@
             <w:pPr>
               <w:spacing w:after="20"/>
             </w:pPr>
-            <w:hyperlink r:id="rId107">
+            <w:hyperlink r:id="rId117">
               <w:r>
                 <w:rPr>
                   <w:color w:val="1D5FD1"/>
@@ -13772,7 +14302,7 @@
             <w:pPr>
               <w:spacing w:after="20"/>
             </w:pPr>
-            <w:hyperlink r:id="rId108">
+            <w:hyperlink r:id="rId118">
               <w:r>
                 <w:rPr>
                   <w:color w:val="1D5FD1"/>
@@ -13890,7 +14420,7 @@
             <w:pPr>
               <w:spacing w:after="20"/>
             </w:pPr>
-            <w:hyperlink r:id="rId109">
+            <w:hyperlink r:id="rId119">
               <w:r>
                 <w:rPr>
                   <w:color w:val="1D5FD1"/>
@@ -14008,7 +14538,7 @@
             <w:pPr>
               <w:spacing w:after="20"/>
             </w:pPr>
-            <w:hyperlink r:id="rId110">
+            <w:hyperlink r:id="rId120">
               <w:r>
                 <w:rPr>
                   <w:color w:val="1D5FD1"/>
@@ -14126,7 +14656,7 @@
             <w:pPr>
               <w:spacing w:after="20"/>
             </w:pPr>
-            <w:hyperlink r:id="rId111">
+            <w:hyperlink r:id="rId121">
               <w:r>
                 <w:rPr>
                   <w:color w:val="1D5FD1"/>
@@ -14244,7 +14774,7 @@
             <w:pPr>
               <w:spacing w:after="20"/>
             </w:pPr>
-            <w:hyperlink r:id="rId112">
+            <w:hyperlink r:id="rId122">
               <w:r>
                 <w:rPr>
                   <w:color w:val="1D5FD1"/>
@@ -14362,7 +14892,7 @@
             <w:pPr>
               <w:spacing w:after="20"/>
             </w:pPr>
-            <w:hyperlink r:id="rId113">
+            <w:hyperlink r:id="rId123">
               <w:r>
                 <w:rPr>
                   <w:color w:val="1D5FD1"/>
@@ -14480,7 +15010,7 @@
             <w:pPr>
               <w:spacing w:after="20"/>
             </w:pPr>
-            <w:hyperlink r:id="rId114">
+            <w:hyperlink r:id="rId124">
               <w:r>
                 <w:rPr>
                   <w:color w:val="1D5FD1"/>
@@ -14598,7 +15128,7 @@
             <w:pPr>
               <w:spacing w:after="20"/>
             </w:pPr>
-            <w:hyperlink r:id="rId115">
+            <w:hyperlink r:id="rId125">
               <w:r>
                 <w:rPr>
                   <w:color w:val="1D5FD1"/>
@@ -14716,7 +15246,7 @@
             <w:pPr>
               <w:spacing w:after="20"/>
             </w:pPr>
-            <w:hyperlink r:id="rId116">
+            <w:hyperlink r:id="rId126">
               <w:r>
                 <w:rPr>
                   <w:color w:val="1D5FD1"/>
@@ -14834,7 +15364,7 @@
             <w:pPr>
               <w:spacing w:after="20"/>
             </w:pPr>
-            <w:hyperlink r:id="rId117">
+            <w:hyperlink r:id="rId127">
               <w:r>
                 <w:rPr>
                   <w:color w:val="1D5FD1"/>
@@ -14952,7 +15482,7 @@
             <w:pPr>
               <w:spacing w:after="20"/>
             </w:pPr>
-            <w:hyperlink r:id="rId118">
+            <w:hyperlink r:id="rId128">
               <w:r>
                 <w:rPr>
                   <w:color w:val="1D5FD1"/>
@@ -15070,7 +15600,7 @@
             <w:pPr>
               <w:spacing w:after="20"/>
             </w:pPr>
-            <w:hyperlink r:id="rId119">
+            <w:hyperlink r:id="rId129">
               <w:r>
                 <w:rPr>
                   <w:color w:val="1D5FD1"/>
@@ -15188,7 +15718,7 @@
             <w:pPr>
               <w:spacing w:after="20"/>
             </w:pPr>
-            <w:hyperlink r:id="rId120">
+            <w:hyperlink r:id="rId130">
               <w:r>
                 <w:rPr>
                   <w:color w:val="1D5FD1"/>
@@ -15306,7 +15836,7 @@
             <w:pPr>
               <w:spacing w:after="20"/>
             </w:pPr>
-            <w:hyperlink r:id="rId121">
+            <w:hyperlink r:id="rId131">
               <w:r>
                 <w:rPr>
                   <w:color w:val="1D5FD1"/>
@@ -15424,7 +15954,7 @@
             <w:pPr>
               <w:spacing w:after="20"/>
             </w:pPr>
-            <w:hyperlink r:id="rId122">
+            <w:hyperlink r:id="rId132">
               <w:r>
                 <w:rPr>
                   <w:color w:val="1D5FD1"/>
@@ -15542,7 +16072,7 @@
             <w:pPr>
               <w:spacing w:after="20"/>
             </w:pPr>
-            <w:hyperlink r:id="rId123">
+            <w:hyperlink r:id="rId133">
               <w:r>
                 <w:rPr>
                   <w:color w:val="1D5FD1"/>
@@ -15660,7 +16190,7 @@
             <w:pPr>
               <w:spacing w:after="20"/>
             </w:pPr>
-            <w:hyperlink r:id="rId124">
+            <w:hyperlink r:id="rId134">
               <w:r>
                 <w:rPr>
                   <w:color w:val="1D5FD1"/>
@@ -15778,7 +16308,7 @@
             <w:pPr>
               <w:spacing w:after="20"/>
             </w:pPr>
-            <w:hyperlink r:id="rId125">
+            <w:hyperlink r:id="rId135">
               <w:r>
                 <w:rPr>
                   <w:color w:val="1D5FD1"/>
@@ -15896,7 +16426,7 @@
             <w:pPr>
               <w:spacing w:after="20"/>
             </w:pPr>
-            <w:hyperlink r:id="rId126">
+            <w:hyperlink r:id="rId136">
               <w:r>
                 <w:rPr>
                   <w:color w:val="1D5FD1"/>
@@ -16014,7 +16544,7 @@
             <w:pPr>
               <w:spacing w:after="20"/>
             </w:pPr>
-            <w:hyperlink r:id="rId127">
+            <w:hyperlink r:id="rId137">
               <w:r>
                 <w:rPr>
                   <w:color w:val="1D5FD1"/>
@@ -16132,7 +16662,7 @@
             <w:pPr>
               <w:spacing w:after="20"/>
             </w:pPr>
-            <w:hyperlink r:id="rId128">
+            <w:hyperlink r:id="rId138">
               <w:r>
                 <w:rPr>
                   <w:color w:val="1D5FD1"/>
@@ -16250,7 +16780,7 @@
             <w:pPr>
               <w:spacing w:after="20"/>
             </w:pPr>
-            <w:hyperlink r:id="rId129">
+            <w:hyperlink r:id="rId43">
               <w:r>
                 <w:rPr>
                   <w:color w:val="1D5FD1"/>
@@ -16368,7 +16898,7 @@
             <w:pPr>
               <w:spacing w:after="20"/>
             </w:pPr>
-            <w:hyperlink r:id="rId130">
+            <w:hyperlink r:id="rId139">
               <w:r>
                 <w:rPr>
                   <w:color w:val="1D5FD1"/>
@@ -16486,7 +17016,7 @@
             <w:pPr>
               <w:spacing w:after="20"/>
             </w:pPr>
-            <w:hyperlink r:id="rId131">
+            <w:hyperlink r:id="rId140">
               <w:r>
                 <w:rPr>
                   <w:color w:val="1D5FD1"/>
@@ -16604,7 +17134,7 @@
             <w:pPr>
               <w:spacing w:after="20"/>
             </w:pPr>
-            <w:hyperlink r:id="rId132">
+            <w:hyperlink r:id="rId141">
               <w:r>
                 <w:rPr>
                   <w:color w:val="1D5FD1"/>
@@ -16722,7 +17252,7 @@
             <w:pPr>
               <w:spacing w:after="20"/>
             </w:pPr>
-            <w:hyperlink r:id="rId133">
+            <w:hyperlink r:id="rId142">
               <w:r>
                 <w:rPr>
                   <w:color w:val="1D5FD1"/>
@@ -16840,7 +17370,7 @@
             <w:pPr>
               <w:spacing w:after="20"/>
             </w:pPr>
-            <w:hyperlink r:id="rId134">
+            <w:hyperlink r:id="rId143">
               <w:r>
                 <w:rPr>
                   <w:color w:val="1D5FD1"/>
@@ -16958,7 +17488,7 @@
             <w:pPr>
               <w:spacing w:after="20"/>
             </w:pPr>
-            <w:hyperlink r:id="rId135">
+            <w:hyperlink r:id="rId144">
               <w:r>
                 <w:rPr>
                   <w:color w:val="1D5FD1"/>
@@ -17076,7 +17606,7 @@
             <w:pPr>
               <w:spacing w:after="20"/>
             </w:pPr>
-            <w:hyperlink r:id="rId136">
+            <w:hyperlink r:id="rId145">
               <w:r>
                 <w:rPr>
                   <w:color w:val="1D5FD1"/>

</xml_diff>